<commit_message>
docs(D5): add TC-A-05, TC-A-08, TC-B-02 results and B2 v1.4 rules
</commit_message>
<xml_diff>
--- a/10_final/D5_design_document.docx
+++ b/10_final/D5_design_document.docx
@@ -208,7 +208,7 @@
           <w:szCs w:val="26"/>
           <w:lang w:val="en-US" w:bidi="th-TH"/>
         </w:rPr>
-        <w:t xml:space="preserve">ฉบับร่างสำหรับตรวจ (อัปเดต 14 ต.ค. 2569)</w:t>
+        <w:t xml:space="preserve">ฉบับร่างสำหรับตรวจ (อัปเดต 15 ต.ค. 2569)</w:t>
       </w:r>
     </w:p>
     <w:p>
@@ -1084,7 +1084,7 @@
           <w:szCs w:val="32"/>
           <w:lang w:val="en-US" w:bidi="th-TH"/>
         </w:rPr>
-        <w:t xml:space="preserve">โครงงาน​นี้​ออกแบบ​ระบบ​ควบคุม​สภาพแวดล้อม​โต๊ะทำงาน เพื่อ​ลด​ความ​ล้า​ของ​คน​ที่ทำงาน​หน้า​คอมพิวเตอร์​เป็นเวลา​นาน ระบบ​แบ่ง​เป็น​โหนด​โต๊ะ​และ​โหนด​ห้อง ทั้งสอง​โหนด​ใช้ ESP32 ทำงาน​บน FreeRTOS และ​สื่อสาร​กัน​ผ่าน Wi-Fi ด้วย​โปรโตคอล MQTT โหนด​โต๊ะ​ตรวจการ​นั่ง​ด้วย​เรดาร์ mmWave เตือน​ให้​พักสายตา​ทุก 20 นาที​และ​ลุก​เดิน​ทุก 30 นาที รักษา​ความสว่าง​บน​โต๊ะ​ไว้​ที่ 500 lux ด้วย​วง​ควบคุม​แบบ​ป้อน​กลับ และ​ปรับ​สี​แสง​จาก​ขาว​เย็น​ใน​เวลากลางวัน​เป็น​ขาว​อุ่น​ใน​ช่วง​ค่ำ โหนด​ห้อง​วัด CO₂ อุณหภูมิ และ​ความชื้น แล้ว​คุม​พัดลมดูดอากาศ​ด้วย​ช่วง hysteresis 800 ถึง 1,000 ppm ค่า​เกณฑ์​ทุก​ตัว​อ้างอิง​จาก​งานวิจัย​หรือ​มาตรฐาน และ​ทุก​โมดูล​มี​โหมด​ปลอดภัย​เมื่อ​เซนเซอร์​เสีย รวมถึง​ทำงานต่อ​ได้​เมื่อ​เครือข่าย​ขัดข้อง ผล​การ​ทดสอบ​บน​โปรแกรม​จำลอง Wokwi ผ่าน​ครบ 21 จาก 21 รายการ​ที่​รัน​อัตโนมัติ งาน​ย่อย​ของ​โหนด​โต๊ะ​ใช้เวลา​ประมวล​ผลรวม 27.4% ต่ำกว่า​ขอบเขต​ของ Rate Monotonic Scheduling (73.5%) และ​ไม่​มี​งาน​ใด​พลาด​เส้นตาย</w:t>
+        <w:t xml:space="preserve">โครงงาน​นี้​ออกแบบ​ระบบ​ควบคุม​สภาพแวดล้อม​โต๊ะทำงาน เพื่อ​ลด​ความ​ล้า​ของ​คน​ที่ทำงาน​หน้า​คอมพิวเตอร์​เป็นเวลา​นาน ระบบ​แบ่ง​เป็น​โหนด​โต๊ะ​และ​โหนด​ห้อง ทั้งสอง​โหนด​ใช้ ESP32 ทำงาน​บน FreeRTOS และ​สื่อสาร​กัน​ผ่าน Wi-Fi ด้วย​โปรโตคอล MQTT โหนด​โต๊ะ​ตรวจการ​นั่ง​ด้วย​เรดาร์ mmWave เตือน​ให้​พักสายตา​ทุก 20 นาที​และ​ลุก​เดิน​ทุก 30 นาที รักษา​ความสว่าง​บน​โต๊ะ​ไว้​ที่ 500 lux ด้วย​วง​ควบคุม​แบบ​ป้อน​กลับ และ​ปรับ​สี​แสง​จาก​ขาว​เย็น​ใน​เวลากลางวัน​เป็น​ขาว​อุ่น​ใน​ช่วง​ค่ำ โหนด​ห้อง​วัด CO₂ อุณหภูมิ และ​ความชื้น แล้ว​คุม​พัดลมดูดอากาศ​ด้วย​ช่วง hysteresis 800 ถึง 1,000 ppm ค่า​เกณฑ์​ทุก​ตัว​อ้างอิง​จาก​งานวิจัย​หรือ​มาตรฐาน และ​ทุก​โมดูล​มี​โหมด​ปลอดภัย​เมื่อ​เซนเซอร์​เสีย รวมถึง​ทำงานต่อ​ได้​เมื่อ​เครือข่าย​ขัดข้อง ผล​การ​ทดสอบ​บน​โปรแกรม​จำลอง Wokwi ผ่าน​ครบ 21 จาก 21 รายการ​ที่​รัน​อัตโนมัติ และ 5 จาก 5 รายการ​ที่​ทดสอบ​ต่อเนื่อง งาน​ควบคุม​บน​แกน​ประมวลผล​ที่ 1 ของ​โหนด​โต๊ะ​ใช้เวลา​รวม 29.0% ต่ำกว่า​ขอบเขต​ของ Rate Monotonic Scheduling (74.3%) การ​รัน​ต่อเนื่อง 22.8 นาที​ไม่​มี​งาน​ใด​พลาด​เส้นตาย และ​การ​นั่ง​จริง​โดย​ไม่​เร่ง​เวลา​ได้การ​เตือน​พักสายตา​ที่ 20 นาที​ตรง​ตามที่​ออกแบบ</w:t>
       </w:r>
     </w:p>
     <w:p>
@@ -23088,6 +23088,21 @@
     </w:p>
     <w:p>
       <w:pPr>
+        <w:spacing w:after="0" w:before="0"/>
+        <w:ind w:firstLine="709"/>
+      </w:pPr>
+      <w:r>
+        <w:rPr>
+          <w:rFonts w:ascii="TH Sarabun New" w:cs="TH Sarabun New" w:eastAsia="TH Sarabun New" w:hAnsi="TH Sarabun New"/>
+          <w:sz w:val="32"/>
+          <w:szCs w:val="32"/>
+          <w:lang w:val="en-US" w:bidi="th-TH"/>
+        </w:rPr>
+        <w:t xml:space="preserve">มี​กติกา​เพิ่มเติม 3 ข้อ​ที่​ได้​จาก​การ​ทดสอบ ข้อ​แรก ถ้า​การ​เตือน​ลุก​ถูก​เลื่อน​ไว้​และ​ยัง​ไม่​ถึง​เวลา​เตือน​ซ้ำ แต่​ถึงกำหนด​เตือน​พักสายตา​พอดี ระบบ​จะ​เลื่อน​การ​เตือน​พักสายตา​ไป​รอบ​ถัดไป​แทน เพื่อ​ไม่​ให้การ​เตือน​ลุก​ที่​รอ​อยู่​หาย​ไป ข้อ​ที่สอง เมื่อ​เรดาร์​กลับ​มาจาก​สถานะ​เสีย ระบบ​เริ่ม​นับ​เวลา​นั่ง​ใหม่ เพราะ​เวลา​ใน​ช่วง​ที่​ไม่​มี​ข้อมูล​เชื่อถือ​ไม่​ได้ ข้อ​ที่สาม การ​เตือน​พัก การ​เตือน​ลุก และ​การ​เตือน​ระดับ 2 แสดง​เต็ม​จอ​จนกว่า​จะ​ถูก​ยกเลิก ส่วน​การ​เตือน​อากาศ ลิงก์​ขาด และ​เซนเซอร์​แสง​แสดง​เต็ม​จอ 10 วินาที​แล้ว​ย่อ​เป็น​แถบ​ด้านล่าง เพื่อให้​ผู้ใช้​ยัง​เห็น​เวลา​นั่ง ปุ่มกด​ใช้​การกรอง​สัญญาณ​เด้ง​แบบ​รอ​ให้สัญญาณ​นิ่ง 30 ms ก่อน​อ่าน​ระดับ</w:t>
+      </w:r>
+    </w:p>
+    <w:p>
+      <w:pPr>
         <w:pStyle w:val="Heading3"/>
       </w:pPr>
       <w:r>
@@ -25535,7 +25550,7 @@
                 <w:sz w:val="18"/>
                 <w:szCs w:val="26"/>
               </w:rPr>
-              <w:t xml:space="preserve">  END IF</w:t>
+              <w:t xml:space="preserve">      IF just recovered from SENSOR_FAULT THEN reset_session()</w:t>
             </w:r>
           </w:p>
           <w:p>
@@ -25548,7 +25563,7 @@
                 <w:sz w:val="18"/>
                 <w:szCs w:val="26"/>
               </w:rPr>
-              <w:t xml:space="preserve"> </w:t>
+              <w:t xml:space="preserve">  END IF</w:t>
             </w:r>
           </w:p>
           <w:p>
@@ -25561,7 +25576,7 @@
                 <w:sz w:val="18"/>
                 <w:szCs w:val="26"/>
               </w:rPr>
-              <w:t xml:space="preserve">TASK break_timer_task (period = 1000 ms)</w:t>
+              <w:t xml:space="preserve"> </w:t>
             </w:r>
           </w:p>
           <w:p>
@@ -25574,7 +25589,7 @@
                 <w:sz w:val="18"/>
                 <w:szCs w:val="26"/>
               </w:rPr>
-              <w:t xml:space="preserve">  SWITCH state</w:t>
+              <w:t xml:space="preserve">TASK break_timer_task (period = 1000 ms)</w:t>
             </w:r>
           </w:p>
           <w:p>
@@ -25587,7 +25602,7 @@
                 <w:sz w:val="18"/>
                 <w:szCs w:val="26"/>
               </w:rPr>
-              <w:t xml:space="preserve">    CASE UNOCCUPIED:</w:t>
+              <w:t xml:space="preserve">  SWITCH state</w:t>
             </w:r>
           </w:p>
           <w:p>
@@ -25600,7 +25615,7 @@
                 <w:sz w:val="18"/>
                 <w:szCs w:val="26"/>
               </w:rPr>
-              <w:t xml:space="preserve">      IF stable_presence THEN start_session(); state = WORKING</w:t>
+              <w:t xml:space="preserve">    CASE UNOCCUPIED:</w:t>
             </w:r>
           </w:p>
           <w:p>
@@ -25613,7 +25628,7 @@
                 <w:sz w:val="18"/>
                 <w:szCs w:val="26"/>
               </w:rPr>
-              <w:t xml:space="preserve">    CASE WORKING:</w:t>
+              <w:t xml:space="preserve">      IF stable_presence THEN start_session(); state = WORKING</w:t>
             </w:r>
           </w:p>
           <w:p>
@@ -25626,7 +25641,7 @@
                 <w:sz w:val="18"/>
                 <w:szCs w:val="26"/>
               </w:rPr>
-              <w:t xml:space="preserve">      sit_time = sit_time + 1 s</w:t>
+              <w:t xml:space="preserve">    CASE WORKING:</w:t>
             </w:r>
           </w:p>
           <w:p>
@@ -25639,7 +25654,7 @@
                 <w:sz w:val="18"/>
                 <w:szCs w:val="26"/>
               </w:rPr>
-              <w:t xml:space="preserve">      IF NOT stable_presence THEN state = AWAY_PENDING</w:t>
+              <w:t xml:space="preserve">      sit_time = sit_time + 1 s</w:t>
             </w:r>
           </w:p>
           <w:p>
@@ -25652,7 +25667,7 @@
                 <w:sz w:val="18"/>
                 <w:szCs w:val="26"/>
               </w:rPr>
-              <w:t xml:space="preserve">      ELSE IF sit_time &gt;= next_stand THEN</w:t>
+              <w:t xml:space="preserve">      IF NOT stable_presence THEN state = AWAY_PENDING</w:t>
             </w:r>
           </w:p>
           <w:p>
@@ -25665,7 +25680,46 @@
                 <w:sz w:val="18"/>
                 <w:szCs w:val="26"/>
               </w:rPr>
+              <w:t xml:space="preserve">      ELSE IF sit_time &gt;= next_stand THEN</w:t>
+            </w:r>
+          </w:p>
+          <w:p>
+            <w:pPr>
+              <w:spacing w:after="0" w:before="0"/>
+            </w:pPr>
+            <w:r>
+              <w:rPr>
+                <w:rFonts w:ascii="Consolas" w:cs="TH Sarabun New" w:eastAsia="TH Sarabun New" w:hAnsi="Consolas"/>
+                <w:sz w:val="18"/>
+                <w:szCs w:val="26"/>
+              </w:rPr>
               <w:t xml:space="preserve">          send_alert(STAND_BREAK, priority 1); state = STAND_ALERT</w:t>
+            </w:r>
+          </w:p>
+          <w:p>
+            <w:pPr>
+              <w:spacing w:after="0" w:before="0"/>
+            </w:pPr>
+            <w:r>
+              <w:rPr>
+                <w:rFonts w:ascii="Consolas" w:cs="TH Sarabun New" w:eastAsia="TH Sarabun New" w:hAnsi="Consolas"/>
+                <w:sz w:val="18"/>
+                <w:szCs w:val="26"/>
+              </w:rPr>
+              <w:t xml:space="preserve">      ELSE IF sit_time &gt;= next_eye AND snoozed STAND pending THEN</w:t>
+            </w:r>
+          </w:p>
+          <w:p>
+            <w:pPr>
+              <w:spacing w:after="0" w:before="0"/>
+            </w:pPr>
+            <w:r>
+              <w:rPr>
+                <w:rFonts w:ascii="Consolas" w:cs="TH Sarabun New" w:eastAsia="TH Sarabun New" w:hAnsi="Consolas"/>
+                <w:sz w:val="18"/>
+                <w:szCs w:val="26"/>
+              </w:rPr>
+              <w:t xml:space="preserve">          next_eye = next_eye + 20 min              // STAND covers EYE</w:t>
             </w:r>
           </w:p>
           <w:p>
@@ -26889,7 +26943,7 @@
           <w:szCs w:val="32"/>
           <w:lang w:val="en-US" w:bidi="th-TH"/>
         </w:rPr>
-        <w:t xml:space="preserve">ระบบ​มี​งาน​หลาย​คาบ​เวลา ตั้งแต่​ตรวจ​คน​ทุก 100 ms ไป​จนถึง​ซิงก์​เวลา​ทุก 1 ชั่วโมง และ​มี​งาน​ที่​ต้อง​รอ​เครือข่าย ถ้า​เขียน​เป็น​ลูป​เดียว งาน​ที่​รอ Wi-Fi จะ​หน่วง​งาน​ตรวจ​คน​และ​คุม​แสง​ไป​ด้วย จึง​ใช้ FreeRTOS แยก​แต่ละ​งาน​เป็น task ตาม​คาบ​และ​ความสำคัญ งาน​เครือข่าย​รอ​ได้​โดย​ไม่​หยุดงาน​อื่น การ​เตือน​ส่งผ่าน queue และ​สาย I²C ป้องกัน​ด้วย mutex ที่​มี priority inheritance งาน Wi-Fi และ TCP/IP ของ ESP32 ทำงาน​บน​แกน 0 ส่วน​งาน​ควบคุม​ของ​ทุก​โมดูล​อยู่​บน​แกน 1 [34]</w:t>
+        <w:t xml:space="preserve">ระบบ​มี​งาน​หลาย​คาบ​เวลา ตั้งแต่​ตรวจ​คน​ทุก 100 ms ไป​จนถึง​ซิงก์​เวลา​ทุก 1 ชั่วโมง และ​มี​งาน​ที่​ต้อง​รอ​เครือข่าย ถ้า​เขียน​เป็น​ลูป​เดียว งาน​ที่​รอ Wi-Fi จะ​หน่วง​งาน​ตรวจ​คน​และ​คุม​แสง​ไป​ด้วย จึง​ใช้ FreeRTOS แยก​แต่ละ​งาน​เป็น task ตาม​คาบ​และ​ความสำคัญ งาน​เครือข่าย​รอ​ได้​โดย​ไม่​หยุดงาน​อื่น การ​เตือน​ส่งผ่าน queue และ​สาย I²C ป้องกัน​ด้วย mutex ที่​มี priority inheritance งาน Wi-Fi และ TCP/IP ของ ESP32 ทำงาน​บน​แกน 0 ร่วมกับ​งาน​สื่อสาร​ของ​ระบบ ส่วน​งาน​ควบคุม​ของ​ทุก​โมดูล​อยู่​บน​แกน 1 [34]</w:t>
       </w:r>
     </w:p>
     <w:p>
@@ -26904,7 +26958,7 @@
           <w:szCs w:val="32"/>
           <w:lang w:val="en-US" w:bidi="th-TH"/>
         </w:rPr>
-        <w:t xml:space="preserve">ลำดับความสำคัญ​ของ​งาน​กำหนด​ตาม Rate Monotonic Scheduling คือ​งาน​ที่​มี​คาบ​สั้น​กว่า​ได้​ความสำคัญ​สูง​กว่า และ​ตรวจ​ว่า​ทำ​ทัน​ด้วย​เงื่อนไข​ว่า​ผลรวม​ของ​เวลา​ทำงานต่อ​คาบ (U) ต้อง​ไม่​เกิน n(2^(1/n) - 1) [35] ตาราง​ที่ 5.5 แสดง​เวลาทำงาน​ที่วัด​จริง​จาก​โค้ด​บน​โปรแกรม​จำลอง</w:t>
+        <w:t xml:space="preserve">ลำดับความสำคัญ​ของ​งาน​กำหนด​ตาม Rate Monotonic Scheduling คือ​งาน​ที่​มี​คาบ​สั้น​กว่า​ได้​ความสำคัญ​สูง​กว่า และ​ตรวจ​ว่า​ทำ​ทัน​ด้วย​เงื่อนไข​ว่า​ผลรวม​ของ​เวลา​ทำงานต่อ​คาบ (U) ต้อง​ไม่​เกิน n(2^(1/n) - 1) [35] แต่ละ​แกน​จัด​เวลา​แยกกัน จึง​ตรวจ​เงื่อนไข​นี้​ทีละ​แกน ตาราง​ที่ 5.5 แสดง​เวลาทำงาน​ที่วัด​จริง​จาก​โค้ด​บน​โปรแกรม​จำลอง</w:t>
       </w:r>
     </w:p>
     <w:p>
@@ -26940,11 +26994,12 @@
       </w:tblPr>
       <w:tblGrid>
         <w:gridCol w:w="900"/>
-        <w:gridCol w:w="3300"/>
-        <w:gridCol w:w="1100"/>
-        <w:gridCol w:w="1300"/>
-        <w:gridCol w:w="1300"/>
-        <w:gridCol w:w="1126"/>
+        <w:gridCol w:w="750"/>
+        <w:gridCol w:w="2950"/>
+        <w:gridCol w:w="1050"/>
+        <w:gridCol w:w="1200"/>
+        <w:gridCol w:w="1150"/>
+        <w:gridCol w:w="1026"/>
       </w:tblGrid>
       <w:tr>
         <w:trPr>
@@ -26985,7 +27040,7 @@
         </w:tc>
         <w:tc>
           <w:tcPr>
-            <w:tcW w:type="dxa" w:w="3300"/>
+            <w:tcW w:type="dxa" w:w="750"/>
             <w:tcBorders>
               <w:top w:val="single" w:color="000000" w:sz="4"/>
               <w:left w:val="single" w:color="000000" w:sz="4"/>
@@ -27012,13 +27067,13 @@
                 <w:szCs w:val="28"/>
                 <w:lang w:val="en-US" w:bidi="th-TH"/>
               </w:rPr>
-              <w:t xml:space="preserve">งาน​ย่อย (โมดูล)</w:t>
-            </w:r>
-          </w:p>
-        </w:tc>
-        <w:tc>
-          <w:tcPr>
-            <w:tcW w:type="dxa" w:w="1100"/>
+              <w:t xml:space="preserve">แกน</w:t>
+            </w:r>
+          </w:p>
+        </w:tc>
+        <w:tc>
+          <w:tcPr>
+            <w:tcW w:type="dxa" w:w="2950"/>
             <w:tcBorders>
               <w:top w:val="single" w:color="000000" w:sz="4"/>
               <w:left w:val="single" w:color="000000" w:sz="4"/>
@@ -27045,13 +27100,13 @@
                 <w:szCs w:val="28"/>
                 <w:lang w:val="en-US" w:bidi="th-TH"/>
               </w:rPr>
-              <w:t xml:space="preserve">คาบ (ms)</w:t>
-            </w:r>
-          </w:p>
-        </w:tc>
-        <w:tc>
-          <w:tcPr>
-            <w:tcW w:type="dxa" w:w="1300"/>
+              <w:t xml:space="preserve">งาน​ย่อย (โมดูล)</w:t>
+            </w:r>
+          </w:p>
+        </w:tc>
+        <w:tc>
+          <w:tcPr>
+            <w:tcW w:type="dxa" w:w="1050"/>
             <w:tcBorders>
               <w:top w:val="single" w:color="000000" w:sz="4"/>
               <w:left w:val="single" w:color="000000" w:sz="4"/>
@@ -27078,13 +27133,13 @@
                 <w:szCs w:val="28"/>
                 <w:lang w:val="en-US" w:bidi="th-TH"/>
               </w:rPr>
-              <w:t xml:space="preserve">เวลา​สูงสุด (µs)</w:t>
-            </w:r>
-          </w:p>
-        </w:tc>
-        <w:tc>
-          <w:tcPr>
-            <w:tcW w:type="dxa" w:w="1300"/>
+              <w:t xml:space="preserve">คาบ (ms)</w:t>
+            </w:r>
+          </w:p>
+        </w:tc>
+        <w:tc>
+          <w:tcPr>
+            <w:tcW w:type="dxa" w:w="1200"/>
             <w:tcBorders>
               <w:top w:val="single" w:color="000000" w:sz="4"/>
               <w:left w:val="single" w:color="000000" w:sz="4"/>
@@ -27111,13 +27166,46 @@
                 <w:szCs w:val="28"/>
                 <w:lang w:val="en-US" w:bidi="th-TH"/>
               </w:rPr>
+              <w:t xml:space="preserve">เวลา​สูงสุด (µs)</w:t>
+            </w:r>
+          </w:p>
+        </w:tc>
+        <w:tc>
+          <w:tcPr>
+            <w:tcW w:type="dxa" w:w="1150"/>
+            <w:tcBorders>
+              <w:top w:val="single" w:color="000000" w:sz="4"/>
+              <w:left w:val="single" w:color="000000" w:sz="4"/>
+              <w:bottom w:val="single" w:color="000000" w:sz="4"/>
+              <w:right w:val="single" w:color="000000" w:sz="4"/>
+            </w:tcBorders>
+            <w:tcMar>
+              <w:top w:type="dxa" w:w="40"/>
+              <w:left w:type="dxa" w:w="90"/>
+              <w:bottom w:type="dxa" w:w="40"/>
+              <w:right w:type="dxa" w:w="90"/>
+            </w:tcMar>
+          </w:tcPr>
+          <w:p>
+            <w:pPr>
+              <w:spacing w:after="0" w:before="0"/>
+            </w:pPr>
+            <w:r>
+              <w:rPr>
+                <w:rFonts w:ascii="TH Sarabun New" w:cs="TH Sarabun New" w:eastAsia="TH Sarabun New" w:hAnsi="TH Sarabun New"/>
+                <w:b/>
+                <w:bCs/>
+                <w:sz w:val="28"/>
+                <w:szCs w:val="28"/>
+                <w:lang w:val="en-US" w:bidi="th-TH"/>
+              </w:rPr>
               <w:t xml:space="preserve">เวลา​เฉลี่ย (µs)</w:t>
             </w:r>
           </w:p>
         </w:tc>
         <w:tc>
           <w:tcPr>
-            <w:tcW w:type="dxa" w:w="1126"/>
+            <w:tcW w:type="dxa" w:w="1026"/>
             <w:tcBorders>
               <w:top w:val="single" w:color="000000" w:sz="4"/>
               <w:left w:val="single" w:color="000000" w:sz="4"/>
@@ -27187,7 +27275,39 @@
         </w:tc>
         <w:tc>
           <w:tcPr>
-            <w:tcW w:type="dxa" w:w="3300"/>
+            <w:tcW w:type="dxa" w:w="750"/>
+            <w:tcBorders>
+              <w:top w:val="single" w:color="000000" w:sz="4"/>
+              <w:left w:val="single" w:color="000000" w:sz="4"/>
+              <w:bottom w:val="single" w:color="000000" w:sz="4"/>
+              <w:right w:val="single" w:color="000000" w:sz="4"/>
+            </w:tcBorders>
+            <w:tcMar>
+              <w:top w:type="dxa" w:w="40"/>
+              <w:left w:type="dxa" w:w="90"/>
+              <w:bottom w:type="dxa" w:w="40"/>
+              <w:right w:type="dxa" w:w="90"/>
+            </w:tcMar>
+          </w:tcPr>
+          <w:p>
+            <w:pPr>
+              <w:spacing w:after="0" w:before="0"/>
+            </w:pPr>
+            <w:r>
+              <w:rPr>
+                <w:rFonts w:ascii="TH Sarabun New" w:cs="TH Sarabun New" w:eastAsia="TH Sarabun New" w:hAnsi="TH Sarabun New"/>
+                <w:b w:val="false"/>
+                <w:sz w:val="28"/>
+                <w:szCs w:val="28"/>
+                <w:lang w:val="en-US" w:bidi="th-TH"/>
+              </w:rPr>
+              <w:t xml:space="preserve">1</w:t>
+            </w:r>
+          </w:p>
+        </w:tc>
+        <w:tc>
+          <w:tcPr>
+            <w:tcW w:type="dxa" w:w="2950"/>
             <w:tcBorders>
               <w:top w:val="single" w:color="000000" w:sz="4"/>
               <w:left w:val="single" w:color="000000" w:sz="4"/>
@@ -27219,7 +27339,7 @@
         </w:tc>
         <w:tc>
           <w:tcPr>
-            <w:tcW w:type="dxa" w:w="1100"/>
+            <w:tcW w:type="dxa" w:w="1050"/>
             <w:tcBorders>
               <w:top w:val="single" w:color="000000" w:sz="4"/>
               <w:left w:val="single" w:color="000000" w:sz="4"/>
@@ -27251,71 +27371,71 @@
         </w:tc>
         <w:tc>
           <w:tcPr>
-            <w:tcW w:type="dxa" w:w="1300"/>
-            <w:tcBorders>
-              <w:top w:val="single" w:color="000000" w:sz="4"/>
-              <w:left w:val="single" w:color="000000" w:sz="4"/>
-              <w:bottom w:val="single" w:color="000000" w:sz="4"/>
-              <w:right w:val="single" w:color="000000" w:sz="4"/>
-            </w:tcBorders>
-            <w:tcMar>
-              <w:top w:type="dxa" w:w="40"/>
-              <w:left w:type="dxa" w:w="90"/>
-              <w:bottom w:type="dxa" w:w="40"/>
-              <w:right w:type="dxa" w:w="90"/>
-            </w:tcMar>
-          </w:tcPr>
-          <w:p>
-            <w:pPr>
-              <w:spacing w:after="0" w:before="0"/>
-            </w:pPr>
-            <w:r>
-              <w:rPr>
-                <w:rFonts w:ascii="TH Sarabun New" w:cs="TH Sarabun New" w:eastAsia="TH Sarabun New" w:hAnsi="TH Sarabun New"/>
-                <w:b w:val="false"/>
-                <w:sz w:val="28"/>
-                <w:szCs w:val="28"/>
-                <w:lang w:val="en-US" w:bidi="th-TH"/>
-              </w:rPr>
-              <w:t xml:space="preserve">889</w:t>
-            </w:r>
-          </w:p>
-        </w:tc>
-        <w:tc>
-          <w:tcPr>
-            <w:tcW w:type="dxa" w:w="1300"/>
-            <w:tcBorders>
-              <w:top w:val="single" w:color="000000" w:sz="4"/>
-              <w:left w:val="single" w:color="000000" w:sz="4"/>
-              <w:bottom w:val="single" w:color="000000" w:sz="4"/>
-              <w:right w:val="single" w:color="000000" w:sz="4"/>
-            </w:tcBorders>
-            <w:tcMar>
-              <w:top w:type="dxa" w:w="40"/>
-              <w:left w:type="dxa" w:w="90"/>
-              <w:bottom w:type="dxa" w:w="40"/>
-              <w:right w:type="dxa" w:w="90"/>
-            </w:tcMar>
-          </w:tcPr>
-          <w:p>
-            <w:pPr>
-              <w:spacing w:after="0" w:before="0"/>
-            </w:pPr>
-            <w:r>
-              <w:rPr>
-                <w:rFonts w:ascii="TH Sarabun New" w:cs="TH Sarabun New" w:eastAsia="TH Sarabun New" w:hAnsi="TH Sarabun New"/>
-                <w:b w:val="false"/>
-                <w:sz w:val="28"/>
-                <w:szCs w:val="28"/>
-                <w:lang w:val="en-US" w:bidi="th-TH"/>
-              </w:rPr>
-              <w:t xml:space="preserve">41</w:t>
-            </w:r>
-          </w:p>
-        </w:tc>
-        <w:tc>
-          <w:tcPr>
-            <w:tcW w:type="dxa" w:w="1126"/>
+            <w:tcW w:type="dxa" w:w="1200"/>
+            <w:tcBorders>
+              <w:top w:val="single" w:color="000000" w:sz="4"/>
+              <w:left w:val="single" w:color="000000" w:sz="4"/>
+              <w:bottom w:val="single" w:color="000000" w:sz="4"/>
+              <w:right w:val="single" w:color="000000" w:sz="4"/>
+            </w:tcBorders>
+            <w:tcMar>
+              <w:top w:type="dxa" w:w="40"/>
+              <w:left w:type="dxa" w:w="90"/>
+              <w:bottom w:type="dxa" w:w="40"/>
+              <w:right w:type="dxa" w:w="90"/>
+            </w:tcMar>
+          </w:tcPr>
+          <w:p>
+            <w:pPr>
+              <w:spacing w:after="0" w:before="0"/>
+            </w:pPr>
+            <w:r>
+              <w:rPr>
+                <w:rFonts w:ascii="TH Sarabun New" w:cs="TH Sarabun New" w:eastAsia="TH Sarabun New" w:hAnsi="TH Sarabun New"/>
+                <w:b w:val="false"/>
+                <w:sz w:val="28"/>
+                <w:szCs w:val="28"/>
+                <w:lang w:val="en-US" w:bidi="th-TH"/>
+              </w:rPr>
+              <w:t xml:space="preserve">948</w:t>
+            </w:r>
+          </w:p>
+        </w:tc>
+        <w:tc>
+          <w:tcPr>
+            <w:tcW w:type="dxa" w:w="1150"/>
+            <w:tcBorders>
+              <w:top w:val="single" w:color="000000" w:sz="4"/>
+              <w:left w:val="single" w:color="000000" w:sz="4"/>
+              <w:bottom w:val="single" w:color="000000" w:sz="4"/>
+              <w:right w:val="single" w:color="000000" w:sz="4"/>
+            </w:tcBorders>
+            <w:tcMar>
+              <w:top w:type="dxa" w:w="40"/>
+              <w:left w:type="dxa" w:w="90"/>
+              <w:bottom w:type="dxa" w:w="40"/>
+              <w:right w:type="dxa" w:w="90"/>
+            </w:tcMar>
+          </w:tcPr>
+          <w:p>
+            <w:pPr>
+              <w:spacing w:after="0" w:before="0"/>
+            </w:pPr>
+            <w:r>
+              <w:rPr>
+                <w:rFonts w:ascii="TH Sarabun New" w:cs="TH Sarabun New" w:eastAsia="TH Sarabun New" w:hAnsi="TH Sarabun New"/>
+                <w:b w:val="false"/>
+                <w:sz w:val="28"/>
+                <w:szCs w:val="28"/>
+                <w:lang w:val="en-US" w:bidi="th-TH"/>
+              </w:rPr>
+              <w:t xml:space="preserve">37</w:t>
+            </w:r>
+          </w:p>
+        </w:tc>
+        <w:tc>
+          <w:tcPr>
+            <w:tcW w:type="dxa" w:w="1026"/>
             <w:tcBorders>
               <w:top w:val="single" w:color="000000" w:sz="4"/>
               <w:left w:val="single" w:color="000000" w:sz="4"/>
@@ -27384,7 +27504,39 @@
         </w:tc>
         <w:tc>
           <w:tcPr>
-            <w:tcW w:type="dxa" w:w="3300"/>
+            <w:tcW w:type="dxa" w:w="750"/>
+            <w:tcBorders>
+              <w:top w:val="single" w:color="000000" w:sz="4"/>
+              <w:left w:val="single" w:color="000000" w:sz="4"/>
+              <w:bottom w:val="single" w:color="000000" w:sz="4"/>
+              <w:right w:val="single" w:color="000000" w:sz="4"/>
+            </w:tcBorders>
+            <w:tcMar>
+              <w:top w:type="dxa" w:w="40"/>
+              <w:left w:type="dxa" w:w="90"/>
+              <w:bottom w:type="dxa" w:w="40"/>
+              <w:right w:type="dxa" w:w="90"/>
+            </w:tcMar>
+          </w:tcPr>
+          <w:p>
+            <w:pPr>
+              <w:spacing w:after="0" w:before="0"/>
+            </w:pPr>
+            <w:r>
+              <w:rPr>
+                <w:rFonts w:ascii="TH Sarabun New" w:cs="TH Sarabun New" w:eastAsia="TH Sarabun New" w:hAnsi="TH Sarabun New"/>
+                <w:b w:val="false"/>
+                <w:sz w:val="28"/>
+                <w:szCs w:val="28"/>
+                <w:lang w:val="en-US" w:bidi="th-TH"/>
+              </w:rPr>
+              <w:t xml:space="preserve">1</w:t>
+            </w:r>
+          </w:p>
+        </w:tc>
+        <w:tc>
+          <w:tcPr>
+            <w:tcW w:type="dxa" w:w="2950"/>
             <w:tcBorders>
               <w:top w:val="single" w:color="000000" w:sz="4"/>
               <w:left w:val="single" w:color="000000" w:sz="4"/>
@@ -27416,7 +27568,7 @@
         </w:tc>
         <w:tc>
           <w:tcPr>
-            <w:tcW w:type="dxa" w:w="1100"/>
+            <w:tcW w:type="dxa" w:w="1050"/>
             <w:tcBorders>
               <w:top w:val="single" w:color="000000" w:sz="4"/>
               <w:left w:val="single" w:color="000000" w:sz="4"/>
@@ -27448,97 +27600,97 @@
         </w:tc>
         <w:tc>
           <w:tcPr>
-            <w:tcW w:type="dxa" w:w="1300"/>
-            <w:tcBorders>
-              <w:top w:val="single" w:color="000000" w:sz="4"/>
-              <w:left w:val="single" w:color="000000" w:sz="4"/>
-              <w:bottom w:val="single" w:color="000000" w:sz="4"/>
-              <w:right w:val="single" w:color="000000" w:sz="4"/>
-            </w:tcBorders>
-            <w:tcMar>
-              <w:top w:type="dxa" w:w="40"/>
-              <w:left w:type="dxa" w:w="90"/>
-              <w:bottom w:type="dxa" w:w="40"/>
-              <w:right w:type="dxa" w:w="90"/>
-            </w:tcMar>
-          </w:tcPr>
-          <w:p>
-            <w:pPr>
-              <w:spacing w:after="0" w:before="0"/>
-            </w:pPr>
-            <w:r>
-              <w:rPr>
-                <w:rFonts w:ascii="TH Sarabun New" w:cs="TH Sarabun New" w:eastAsia="TH Sarabun New" w:hAnsi="TH Sarabun New"/>
-                <w:b w:val="false"/>
-                <w:sz w:val="28"/>
-                <w:szCs w:val="28"/>
-                <w:lang w:val="en-US" w:bidi="th-TH"/>
-              </w:rPr>
-              <w:t xml:space="preserve">1,447</w:t>
-            </w:r>
-          </w:p>
-        </w:tc>
-        <w:tc>
-          <w:tcPr>
-            <w:tcW w:type="dxa" w:w="1300"/>
-            <w:tcBorders>
-              <w:top w:val="single" w:color="000000" w:sz="4"/>
-              <w:left w:val="single" w:color="000000" w:sz="4"/>
-              <w:bottom w:val="single" w:color="000000" w:sz="4"/>
-              <w:right w:val="single" w:color="000000" w:sz="4"/>
-            </w:tcBorders>
-            <w:tcMar>
-              <w:top w:type="dxa" w:w="40"/>
-              <w:left w:type="dxa" w:w="90"/>
-              <w:bottom w:type="dxa" w:w="40"/>
-              <w:right w:type="dxa" w:w="90"/>
-            </w:tcMar>
-          </w:tcPr>
-          <w:p>
-            <w:pPr>
-              <w:spacing w:after="0" w:before="0"/>
-            </w:pPr>
-            <w:r>
-              <w:rPr>
-                <w:rFonts w:ascii="TH Sarabun New" w:cs="TH Sarabun New" w:eastAsia="TH Sarabun New" w:hAnsi="TH Sarabun New"/>
-                <w:b w:val="false"/>
-                <w:sz w:val="28"/>
-                <w:szCs w:val="28"/>
-                <w:lang w:val="en-US" w:bidi="th-TH"/>
-              </w:rPr>
-              <w:t xml:space="preserve">58</w:t>
-            </w:r>
-          </w:p>
-        </w:tc>
-        <w:tc>
-          <w:tcPr>
-            <w:tcW w:type="dxa" w:w="1126"/>
-            <w:tcBorders>
-              <w:top w:val="single" w:color="000000" w:sz="4"/>
-              <w:left w:val="single" w:color="000000" w:sz="4"/>
-              <w:bottom w:val="single" w:color="000000" w:sz="4"/>
-              <w:right w:val="single" w:color="000000" w:sz="4"/>
-            </w:tcBorders>
-            <w:tcMar>
-              <w:top w:type="dxa" w:w="40"/>
-              <w:left w:type="dxa" w:w="90"/>
-              <w:bottom w:type="dxa" w:w="40"/>
-              <w:right w:type="dxa" w:w="90"/>
-            </w:tcMar>
-          </w:tcPr>
-          <w:p>
-            <w:pPr>
-              <w:spacing w:after="0" w:before="0"/>
-            </w:pPr>
-            <w:r>
-              <w:rPr>
-                <w:rFonts w:ascii="TH Sarabun New" w:cs="TH Sarabun New" w:eastAsia="TH Sarabun New" w:hAnsi="TH Sarabun New"/>
-                <w:b w:val="false"/>
-                <w:sz w:val="28"/>
-                <w:szCs w:val="28"/>
-                <w:lang w:val="en-US" w:bidi="th-TH"/>
-              </w:rPr>
-              <w:t xml:space="preserve">0.014</w:t>
+            <w:tcW w:type="dxa" w:w="1200"/>
+            <w:tcBorders>
+              <w:top w:val="single" w:color="000000" w:sz="4"/>
+              <w:left w:val="single" w:color="000000" w:sz="4"/>
+              <w:bottom w:val="single" w:color="000000" w:sz="4"/>
+              <w:right w:val="single" w:color="000000" w:sz="4"/>
+            </w:tcBorders>
+            <w:tcMar>
+              <w:top w:type="dxa" w:w="40"/>
+              <w:left w:type="dxa" w:w="90"/>
+              <w:bottom w:type="dxa" w:w="40"/>
+              <w:right w:type="dxa" w:w="90"/>
+            </w:tcMar>
+          </w:tcPr>
+          <w:p>
+            <w:pPr>
+              <w:spacing w:after="0" w:before="0"/>
+            </w:pPr>
+            <w:r>
+              <w:rPr>
+                <w:rFonts w:ascii="TH Sarabun New" w:cs="TH Sarabun New" w:eastAsia="TH Sarabun New" w:hAnsi="TH Sarabun New"/>
+                <w:b w:val="false"/>
+                <w:sz w:val="28"/>
+                <w:szCs w:val="28"/>
+                <w:lang w:val="en-US" w:bidi="th-TH"/>
+              </w:rPr>
+              <w:t xml:space="preserve">68</w:t>
+            </w:r>
+          </w:p>
+        </w:tc>
+        <w:tc>
+          <w:tcPr>
+            <w:tcW w:type="dxa" w:w="1150"/>
+            <w:tcBorders>
+              <w:top w:val="single" w:color="000000" w:sz="4"/>
+              <w:left w:val="single" w:color="000000" w:sz="4"/>
+              <w:bottom w:val="single" w:color="000000" w:sz="4"/>
+              <w:right w:val="single" w:color="000000" w:sz="4"/>
+            </w:tcBorders>
+            <w:tcMar>
+              <w:top w:type="dxa" w:w="40"/>
+              <w:left w:type="dxa" w:w="90"/>
+              <w:bottom w:type="dxa" w:w="40"/>
+              <w:right w:type="dxa" w:w="90"/>
+            </w:tcMar>
+          </w:tcPr>
+          <w:p>
+            <w:pPr>
+              <w:spacing w:after="0" w:before="0"/>
+            </w:pPr>
+            <w:r>
+              <w:rPr>
+                <w:rFonts w:ascii="TH Sarabun New" w:cs="TH Sarabun New" w:eastAsia="TH Sarabun New" w:hAnsi="TH Sarabun New"/>
+                <w:b w:val="false"/>
+                <w:sz w:val="28"/>
+                <w:szCs w:val="28"/>
+                <w:lang w:val="en-US" w:bidi="th-TH"/>
+              </w:rPr>
+              <w:t xml:space="preserve">22</w:t>
+            </w:r>
+          </w:p>
+        </w:tc>
+        <w:tc>
+          <w:tcPr>
+            <w:tcW w:type="dxa" w:w="1026"/>
+            <w:tcBorders>
+              <w:top w:val="single" w:color="000000" w:sz="4"/>
+              <w:left w:val="single" w:color="000000" w:sz="4"/>
+              <w:bottom w:val="single" w:color="000000" w:sz="4"/>
+              <w:right w:val="single" w:color="000000" w:sz="4"/>
+            </w:tcBorders>
+            <w:tcMar>
+              <w:top w:type="dxa" w:w="40"/>
+              <w:left w:type="dxa" w:w="90"/>
+              <w:bottom w:type="dxa" w:w="40"/>
+              <w:right w:type="dxa" w:w="90"/>
+            </w:tcMar>
+          </w:tcPr>
+          <w:p>
+            <w:pPr>
+              <w:spacing w:after="0" w:before="0"/>
+            </w:pPr>
+            <w:r>
+              <w:rPr>
+                <w:rFonts w:ascii="TH Sarabun New" w:cs="TH Sarabun New" w:eastAsia="TH Sarabun New" w:hAnsi="TH Sarabun New"/>
+                <w:b w:val="false"/>
+                <w:sz w:val="28"/>
+                <w:szCs w:val="28"/>
+                <w:lang w:val="en-US" w:bidi="th-TH"/>
+              </w:rPr>
+              <w:t xml:space="preserve">0.001</w:t>
             </w:r>
           </w:p>
         </w:tc>
@@ -27581,7 +27733,39 @@
         </w:tc>
         <w:tc>
           <w:tcPr>
-            <w:tcW w:type="dxa" w:w="3300"/>
+            <w:tcW w:type="dxa" w:w="750"/>
+            <w:tcBorders>
+              <w:top w:val="single" w:color="000000" w:sz="4"/>
+              <w:left w:val="single" w:color="000000" w:sz="4"/>
+              <w:bottom w:val="single" w:color="000000" w:sz="4"/>
+              <w:right w:val="single" w:color="000000" w:sz="4"/>
+            </w:tcBorders>
+            <w:tcMar>
+              <w:top w:type="dxa" w:w="40"/>
+              <w:left w:type="dxa" w:w="90"/>
+              <w:bottom w:type="dxa" w:w="40"/>
+              <w:right w:type="dxa" w:w="90"/>
+            </w:tcMar>
+          </w:tcPr>
+          <w:p>
+            <w:pPr>
+              <w:spacing w:after="0" w:before="0"/>
+            </w:pPr>
+            <w:r>
+              <w:rPr>
+                <w:rFonts w:ascii="TH Sarabun New" w:cs="TH Sarabun New" w:eastAsia="TH Sarabun New" w:hAnsi="TH Sarabun New"/>
+                <w:b w:val="false"/>
+                <w:sz w:val="28"/>
+                <w:szCs w:val="28"/>
+                <w:lang w:val="en-US" w:bidi="th-TH"/>
+              </w:rPr>
+              <w:t xml:space="preserve">1</w:t>
+            </w:r>
+          </w:p>
+        </w:tc>
+        <w:tc>
+          <w:tcPr>
+            <w:tcW w:type="dxa" w:w="2950"/>
             <w:tcBorders>
               <w:top w:val="single" w:color="000000" w:sz="4"/>
               <w:left w:val="single" w:color="000000" w:sz="4"/>
@@ -27613,7 +27797,7 @@
         </w:tc>
         <w:tc>
           <w:tcPr>
-            <w:tcW w:type="dxa" w:w="1100"/>
+            <w:tcW w:type="dxa" w:w="1050"/>
             <w:tcBorders>
               <w:top w:val="single" w:color="000000" w:sz="4"/>
               <w:left w:val="single" w:color="000000" w:sz="4"/>
@@ -27645,97 +27829,97 @@
         </w:tc>
         <w:tc>
           <w:tcPr>
-            <w:tcW w:type="dxa" w:w="1300"/>
-            <w:tcBorders>
-              <w:top w:val="single" w:color="000000" w:sz="4"/>
-              <w:left w:val="single" w:color="000000" w:sz="4"/>
-              <w:bottom w:val="single" w:color="000000" w:sz="4"/>
-              <w:right w:val="single" w:color="000000" w:sz="4"/>
-            </w:tcBorders>
-            <w:tcMar>
-              <w:top w:type="dxa" w:w="40"/>
-              <w:left w:type="dxa" w:w="90"/>
-              <w:bottom w:type="dxa" w:w="40"/>
-              <w:right w:type="dxa" w:w="90"/>
-            </w:tcMar>
-          </w:tcPr>
-          <w:p>
-            <w:pPr>
-              <w:spacing w:after="0" w:before="0"/>
-            </w:pPr>
-            <w:r>
-              <w:rPr>
-                <w:rFonts w:ascii="TH Sarabun New" w:cs="TH Sarabun New" w:eastAsia="TH Sarabun New" w:hAnsi="TH Sarabun New"/>
-                <w:b w:val="false"/>
-                <w:sz w:val="28"/>
-                <w:szCs w:val="28"/>
-                <w:lang w:val="en-US" w:bidi="th-TH"/>
-              </w:rPr>
-              <w:t xml:space="preserve">28,534</w:t>
-            </w:r>
-          </w:p>
-        </w:tc>
-        <w:tc>
-          <w:tcPr>
-            <w:tcW w:type="dxa" w:w="1300"/>
-            <w:tcBorders>
-              <w:top w:val="single" w:color="000000" w:sz="4"/>
-              <w:left w:val="single" w:color="000000" w:sz="4"/>
-              <w:bottom w:val="single" w:color="000000" w:sz="4"/>
-              <w:right w:val="single" w:color="000000" w:sz="4"/>
-            </w:tcBorders>
-            <w:tcMar>
-              <w:top w:type="dxa" w:w="40"/>
-              <w:left w:type="dxa" w:w="90"/>
-              <w:bottom w:type="dxa" w:w="40"/>
-              <w:right w:type="dxa" w:w="90"/>
-            </w:tcMar>
-          </w:tcPr>
-          <w:p>
-            <w:pPr>
-              <w:spacing w:after="0" w:before="0"/>
-            </w:pPr>
-            <w:r>
-              <w:rPr>
-                <w:rFonts w:ascii="TH Sarabun New" w:cs="TH Sarabun New" w:eastAsia="TH Sarabun New" w:hAnsi="TH Sarabun New"/>
-                <w:b w:val="false"/>
-                <w:sz w:val="28"/>
-                <w:szCs w:val="28"/>
-                <w:lang w:val="en-US" w:bidi="th-TH"/>
-              </w:rPr>
-              <w:t xml:space="preserve">1,209</w:t>
-            </w:r>
-          </w:p>
-        </w:tc>
-        <w:tc>
-          <w:tcPr>
-            <w:tcW w:type="dxa" w:w="1126"/>
-            <w:tcBorders>
-              <w:top w:val="single" w:color="000000" w:sz="4"/>
-              <w:left w:val="single" w:color="000000" w:sz="4"/>
-              <w:bottom w:val="single" w:color="000000" w:sz="4"/>
-              <w:right w:val="single" w:color="000000" w:sz="4"/>
-            </w:tcBorders>
-            <w:tcMar>
-              <w:top w:type="dxa" w:w="40"/>
-              <w:left w:type="dxa" w:w="90"/>
-              <w:bottom w:type="dxa" w:w="40"/>
-              <w:right w:type="dxa" w:w="90"/>
-            </w:tcMar>
-          </w:tcPr>
-          <w:p>
-            <w:pPr>
-              <w:spacing w:after="0" w:before="0"/>
-            </w:pPr>
-            <w:r>
-              <w:rPr>
-                <w:rFonts w:ascii="TH Sarabun New" w:cs="TH Sarabun New" w:eastAsia="TH Sarabun New" w:hAnsi="TH Sarabun New"/>
-                <w:b w:val="false"/>
-                <w:sz w:val="28"/>
-                <w:szCs w:val="28"/>
-                <w:lang w:val="en-US" w:bidi="th-TH"/>
-              </w:rPr>
-              <w:t xml:space="preserve">0.143</w:t>
+            <w:tcW w:type="dxa" w:w="1200"/>
+            <w:tcBorders>
+              <w:top w:val="single" w:color="000000" w:sz="4"/>
+              <w:left w:val="single" w:color="000000" w:sz="4"/>
+              <w:bottom w:val="single" w:color="000000" w:sz="4"/>
+              <w:right w:val="single" w:color="000000" w:sz="4"/>
+            </w:tcBorders>
+            <w:tcMar>
+              <w:top w:type="dxa" w:w="40"/>
+              <w:left w:type="dxa" w:w="90"/>
+              <w:bottom w:type="dxa" w:w="40"/>
+              <w:right w:type="dxa" w:w="90"/>
+            </w:tcMar>
+          </w:tcPr>
+          <w:p>
+            <w:pPr>
+              <w:spacing w:after="0" w:before="0"/>
+            </w:pPr>
+            <w:r>
+              <w:rPr>
+                <w:rFonts w:ascii="TH Sarabun New" w:cs="TH Sarabun New" w:eastAsia="TH Sarabun New" w:hAnsi="TH Sarabun New"/>
+                <w:b w:val="false"/>
+                <w:sz w:val="28"/>
+                <w:szCs w:val="28"/>
+                <w:lang w:val="en-US" w:bidi="th-TH"/>
+              </w:rPr>
+              <w:t xml:space="preserve">31,797</w:t>
+            </w:r>
+          </w:p>
+        </w:tc>
+        <w:tc>
+          <w:tcPr>
+            <w:tcW w:type="dxa" w:w="1150"/>
+            <w:tcBorders>
+              <w:top w:val="single" w:color="000000" w:sz="4"/>
+              <w:left w:val="single" w:color="000000" w:sz="4"/>
+              <w:bottom w:val="single" w:color="000000" w:sz="4"/>
+              <w:right w:val="single" w:color="000000" w:sz="4"/>
+            </w:tcBorders>
+            <w:tcMar>
+              <w:top w:type="dxa" w:w="40"/>
+              <w:left w:type="dxa" w:w="90"/>
+              <w:bottom w:type="dxa" w:w="40"/>
+              <w:right w:type="dxa" w:w="90"/>
+            </w:tcMar>
+          </w:tcPr>
+          <w:p>
+            <w:pPr>
+              <w:spacing w:after="0" w:before="0"/>
+            </w:pPr>
+            <w:r>
+              <w:rPr>
+                <w:rFonts w:ascii="TH Sarabun New" w:cs="TH Sarabun New" w:eastAsia="TH Sarabun New" w:hAnsi="TH Sarabun New"/>
+                <w:b w:val="false"/>
+                <w:sz w:val="28"/>
+                <w:szCs w:val="28"/>
+                <w:lang w:val="en-US" w:bidi="th-TH"/>
+              </w:rPr>
+              <w:t xml:space="preserve">1,138</w:t>
+            </w:r>
+          </w:p>
+        </w:tc>
+        <w:tc>
+          <w:tcPr>
+            <w:tcW w:type="dxa" w:w="1026"/>
+            <w:tcBorders>
+              <w:top w:val="single" w:color="000000" w:sz="4"/>
+              <w:left w:val="single" w:color="000000" w:sz="4"/>
+              <w:bottom w:val="single" w:color="000000" w:sz="4"/>
+              <w:right w:val="single" w:color="000000" w:sz="4"/>
+            </w:tcBorders>
+            <w:tcMar>
+              <w:top w:type="dxa" w:w="40"/>
+              <w:left w:type="dxa" w:w="90"/>
+              <w:bottom w:type="dxa" w:w="40"/>
+              <w:right w:type="dxa" w:w="90"/>
+            </w:tcMar>
+          </w:tcPr>
+          <w:p>
+            <w:pPr>
+              <w:spacing w:after="0" w:before="0"/>
+            </w:pPr>
+            <w:r>
+              <w:rPr>
+                <w:rFonts w:ascii="TH Sarabun New" w:cs="TH Sarabun New" w:eastAsia="TH Sarabun New" w:hAnsi="TH Sarabun New"/>
+                <w:b w:val="false"/>
+                <w:sz w:val="28"/>
+                <w:szCs w:val="28"/>
+                <w:lang w:val="en-US" w:bidi="th-TH"/>
+              </w:rPr>
+              <w:t xml:space="preserve">0.159</w:t>
             </w:r>
           </w:p>
         </w:tc>
@@ -27778,7 +27962,39 @@
         </w:tc>
         <w:tc>
           <w:tcPr>
-            <w:tcW w:type="dxa" w:w="3300"/>
+            <w:tcW w:type="dxa" w:w="750"/>
+            <w:tcBorders>
+              <w:top w:val="single" w:color="000000" w:sz="4"/>
+              <w:left w:val="single" w:color="000000" w:sz="4"/>
+              <w:bottom w:val="single" w:color="000000" w:sz="4"/>
+              <w:right w:val="single" w:color="000000" w:sz="4"/>
+            </w:tcBorders>
+            <w:tcMar>
+              <w:top w:type="dxa" w:w="40"/>
+              <w:left w:type="dxa" w:w="90"/>
+              <w:bottom w:type="dxa" w:w="40"/>
+              <w:right w:type="dxa" w:w="90"/>
+            </w:tcMar>
+          </w:tcPr>
+          <w:p>
+            <w:pPr>
+              <w:spacing w:after="0" w:before="0"/>
+            </w:pPr>
+            <w:r>
+              <w:rPr>
+                <w:rFonts w:ascii="TH Sarabun New" w:cs="TH Sarabun New" w:eastAsia="TH Sarabun New" w:hAnsi="TH Sarabun New"/>
+                <w:b w:val="false"/>
+                <w:sz w:val="28"/>
+                <w:szCs w:val="28"/>
+                <w:lang w:val="en-US" w:bidi="th-TH"/>
+              </w:rPr>
+              <w:t xml:space="preserve">1</w:t>
+            </w:r>
+          </w:p>
+        </w:tc>
+        <w:tc>
+          <w:tcPr>
+            <w:tcW w:type="dxa" w:w="2950"/>
             <w:tcBorders>
               <w:top w:val="single" w:color="000000" w:sz="4"/>
               <w:left w:val="single" w:color="000000" w:sz="4"/>
@@ -27810,7 +28026,7 @@
         </w:tc>
         <w:tc>
           <w:tcPr>
-            <w:tcW w:type="dxa" w:w="1100"/>
+            <w:tcW w:type="dxa" w:w="1050"/>
             <w:tcBorders>
               <w:top w:val="single" w:color="000000" w:sz="4"/>
               <w:left w:val="single" w:color="000000" w:sz="4"/>
@@ -27842,97 +28058,97 @@
         </w:tc>
         <w:tc>
           <w:tcPr>
-            <w:tcW w:type="dxa" w:w="1300"/>
-            <w:tcBorders>
-              <w:top w:val="single" w:color="000000" w:sz="4"/>
-              <w:left w:val="single" w:color="000000" w:sz="4"/>
-              <w:bottom w:val="single" w:color="000000" w:sz="4"/>
-              <w:right w:val="single" w:color="000000" w:sz="4"/>
-            </w:tcBorders>
-            <w:tcMar>
-              <w:top w:type="dxa" w:w="40"/>
-              <w:left w:type="dxa" w:w="90"/>
-              <w:bottom w:type="dxa" w:w="40"/>
-              <w:right w:type="dxa" w:w="90"/>
-            </w:tcMar>
-          </w:tcPr>
-          <w:p>
-            <w:pPr>
-              <w:spacing w:after="0" w:before="0"/>
-            </w:pPr>
-            <w:r>
-              <w:rPr>
-                <w:rFonts w:ascii="TH Sarabun New" w:cs="TH Sarabun New" w:eastAsia="TH Sarabun New" w:hAnsi="TH Sarabun New"/>
-                <w:b w:val="false"/>
-                <w:sz w:val="28"/>
-                <w:szCs w:val="28"/>
-                <w:lang w:val="en-US" w:bidi="th-TH"/>
-              </w:rPr>
-              <w:t xml:space="preserve">43,186</w:t>
-            </w:r>
-          </w:p>
-        </w:tc>
-        <w:tc>
-          <w:tcPr>
-            <w:tcW w:type="dxa" w:w="1300"/>
-            <w:tcBorders>
-              <w:top w:val="single" w:color="000000" w:sz="4"/>
-              <w:left w:val="single" w:color="000000" w:sz="4"/>
-              <w:bottom w:val="single" w:color="000000" w:sz="4"/>
-              <w:right w:val="single" w:color="000000" w:sz="4"/>
-            </w:tcBorders>
-            <w:tcMar>
-              <w:top w:type="dxa" w:w="40"/>
-              <w:left w:type="dxa" w:w="90"/>
-              <w:bottom w:type="dxa" w:w="40"/>
-              <w:right w:type="dxa" w:w="90"/>
-            </w:tcMar>
-          </w:tcPr>
-          <w:p>
-            <w:pPr>
-              <w:spacing w:after="0" w:before="0"/>
-            </w:pPr>
-            <w:r>
-              <w:rPr>
-                <w:rFonts w:ascii="TH Sarabun New" w:cs="TH Sarabun New" w:eastAsia="TH Sarabun New" w:hAnsi="TH Sarabun New"/>
-                <w:b w:val="false"/>
-                <w:sz w:val="28"/>
-                <w:szCs w:val="28"/>
-                <w:lang w:val="en-US" w:bidi="th-TH"/>
-              </w:rPr>
-              <w:t xml:space="preserve">40,494</w:t>
-            </w:r>
-          </w:p>
-        </w:tc>
-        <w:tc>
-          <w:tcPr>
-            <w:tcW w:type="dxa" w:w="1126"/>
-            <w:tcBorders>
-              <w:top w:val="single" w:color="000000" w:sz="4"/>
-              <w:left w:val="single" w:color="000000" w:sz="4"/>
-              <w:bottom w:val="single" w:color="000000" w:sz="4"/>
-              <w:right w:val="single" w:color="000000" w:sz="4"/>
-            </w:tcBorders>
-            <w:tcMar>
-              <w:top w:type="dxa" w:w="40"/>
-              <w:left w:type="dxa" w:w="90"/>
-              <w:bottom w:type="dxa" w:w="40"/>
-              <w:right w:type="dxa" w:w="90"/>
-            </w:tcMar>
-          </w:tcPr>
-          <w:p>
-            <w:pPr>
-              <w:spacing w:after="0" w:before="0"/>
-            </w:pPr>
-            <w:r>
-              <w:rPr>
-                <w:rFonts w:ascii="TH Sarabun New" w:cs="TH Sarabun New" w:eastAsia="TH Sarabun New" w:hAnsi="TH Sarabun New"/>
-                <w:b w:val="false"/>
-                <w:sz w:val="28"/>
-                <w:szCs w:val="28"/>
-                <w:lang w:val="en-US" w:bidi="th-TH"/>
-              </w:rPr>
-              <w:t xml:space="preserve">0.086</w:t>
+            <w:tcW w:type="dxa" w:w="1200"/>
+            <w:tcBorders>
+              <w:top w:val="single" w:color="000000" w:sz="4"/>
+              <w:left w:val="single" w:color="000000" w:sz="4"/>
+              <w:bottom w:val="single" w:color="000000" w:sz="4"/>
+              <w:right w:val="single" w:color="000000" w:sz="4"/>
+            </w:tcBorders>
+            <w:tcMar>
+              <w:top w:type="dxa" w:w="40"/>
+              <w:left w:type="dxa" w:w="90"/>
+              <w:bottom w:type="dxa" w:w="40"/>
+              <w:right w:type="dxa" w:w="90"/>
+            </w:tcMar>
+          </w:tcPr>
+          <w:p>
+            <w:pPr>
+              <w:spacing w:after="0" w:before="0"/>
+            </w:pPr>
+            <w:r>
+              <w:rPr>
+                <w:rFonts w:ascii="TH Sarabun New" w:cs="TH Sarabun New" w:eastAsia="TH Sarabun New" w:hAnsi="TH Sarabun New"/>
+                <w:b w:val="false"/>
+                <w:sz w:val="28"/>
+                <w:szCs w:val="28"/>
+                <w:lang w:val="en-US" w:bidi="th-TH"/>
+              </w:rPr>
+              <w:t xml:space="preserve">53,110</w:t>
+            </w:r>
+          </w:p>
+        </w:tc>
+        <w:tc>
+          <w:tcPr>
+            <w:tcW w:type="dxa" w:w="1150"/>
+            <w:tcBorders>
+              <w:top w:val="single" w:color="000000" w:sz="4"/>
+              <w:left w:val="single" w:color="000000" w:sz="4"/>
+              <w:bottom w:val="single" w:color="000000" w:sz="4"/>
+              <w:right w:val="single" w:color="000000" w:sz="4"/>
+            </w:tcBorders>
+            <w:tcMar>
+              <w:top w:type="dxa" w:w="40"/>
+              <w:left w:type="dxa" w:w="90"/>
+              <w:bottom w:type="dxa" w:w="40"/>
+              <w:right w:type="dxa" w:w="90"/>
+            </w:tcMar>
+          </w:tcPr>
+          <w:p>
+            <w:pPr>
+              <w:spacing w:after="0" w:before="0"/>
+            </w:pPr>
+            <w:r>
+              <w:rPr>
+                <w:rFonts w:ascii="TH Sarabun New" w:cs="TH Sarabun New" w:eastAsia="TH Sarabun New" w:hAnsi="TH Sarabun New"/>
+                <w:b w:val="false"/>
+                <w:sz w:val="28"/>
+                <w:szCs w:val="28"/>
+                <w:lang w:val="en-US" w:bidi="th-TH"/>
+              </w:rPr>
+              <w:t xml:space="preserve">42,821</w:t>
+            </w:r>
+          </w:p>
+        </w:tc>
+        <w:tc>
+          <w:tcPr>
+            <w:tcW w:type="dxa" w:w="1026"/>
+            <w:tcBorders>
+              <w:top w:val="single" w:color="000000" w:sz="4"/>
+              <w:left w:val="single" w:color="000000" w:sz="4"/>
+              <w:bottom w:val="single" w:color="000000" w:sz="4"/>
+              <w:right w:val="single" w:color="000000" w:sz="4"/>
+            </w:tcBorders>
+            <w:tcMar>
+              <w:top w:type="dxa" w:w="40"/>
+              <w:left w:type="dxa" w:w="90"/>
+              <w:bottom w:type="dxa" w:w="40"/>
+              <w:right w:type="dxa" w:w="90"/>
+            </w:tcMar>
+          </w:tcPr>
+          <w:p>
+            <w:pPr>
+              <w:spacing w:after="0" w:before="0"/>
+            </w:pPr>
+            <w:r>
+              <w:rPr>
+                <w:rFonts w:ascii="TH Sarabun New" w:cs="TH Sarabun New" w:eastAsia="TH Sarabun New" w:hAnsi="TH Sarabun New"/>
+                <w:b w:val="false"/>
+                <w:sz w:val="28"/>
+                <w:szCs w:val="28"/>
+                <w:lang w:val="en-US" w:bidi="th-TH"/>
+              </w:rPr>
+              <w:t xml:space="preserve">0.106</w:t>
             </w:r>
           </w:p>
         </w:tc>
@@ -27975,7 +28191,39 @@
         </w:tc>
         <w:tc>
           <w:tcPr>
-            <w:tcW w:type="dxa" w:w="3300"/>
+            <w:tcW w:type="dxa" w:w="750"/>
+            <w:tcBorders>
+              <w:top w:val="single" w:color="000000" w:sz="4"/>
+              <w:left w:val="single" w:color="000000" w:sz="4"/>
+              <w:bottom w:val="single" w:color="000000" w:sz="4"/>
+              <w:right w:val="single" w:color="000000" w:sz="4"/>
+            </w:tcBorders>
+            <w:tcMar>
+              <w:top w:type="dxa" w:w="40"/>
+              <w:left w:type="dxa" w:w="90"/>
+              <w:bottom w:type="dxa" w:w="40"/>
+              <w:right w:type="dxa" w:w="90"/>
+            </w:tcMar>
+          </w:tcPr>
+          <w:p>
+            <w:pPr>
+              <w:spacing w:after="0" w:before="0"/>
+            </w:pPr>
+            <w:r>
+              <w:rPr>
+                <w:rFonts w:ascii="TH Sarabun New" w:cs="TH Sarabun New" w:eastAsia="TH Sarabun New" w:hAnsi="TH Sarabun New"/>
+                <w:b w:val="false"/>
+                <w:sz w:val="28"/>
+                <w:szCs w:val="28"/>
+                <w:lang w:val="en-US" w:bidi="th-TH"/>
+              </w:rPr>
+              <w:t xml:space="preserve">1</w:t>
+            </w:r>
+          </w:p>
+        </w:tc>
+        <w:tc>
+          <w:tcPr>
+            <w:tcW w:type="dxa" w:w="2950"/>
             <w:tcBorders>
               <w:top w:val="single" w:color="000000" w:sz="4"/>
               <w:left w:val="single" w:color="000000" w:sz="4"/>
@@ -28007,7 +28255,7 @@
         </w:tc>
         <w:tc>
           <w:tcPr>
-            <w:tcW w:type="dxa" w:w="1100"/>
+            <w:tcW w:type="dxa" w:w="1050"/>
             <w:tcBorders>
               <w:top w:val="single" w:color="000000" w:sz="4"/>
               <w:left w:val="single" w:color="000000" w:sz="4"/>
@@ -28039,97 +28287,97 @@
         </w:tc>
         <w:tc>
           <w:tcPr>
-            <w:tcW w:type="dxa" w:w="1300"/>
-            <w:tcBorders>
-              <w:top w:val="single" w:color="000000" w:sz="4"/>
-              <w:left w:val="single" w:color="000000" w:sz="4"/>
-              <w:bottom w:val="single" w:color="000000" w:sz="4"/>
-              <w:right w:val="single" w:color="000000" w:sz="4"/>
-            </w:tcBorders>
-            <w:tcMar>
-              <w:top w:type="dxa" w:w="40"/>
-              <w:left w:type="dxa" w:w="90"/>
-              <w:bottom w:type="dxa" w:w="40"/>
-              <w:right w:type="dxa" w:w="90"/>
-            </w:tcMar>
-          </w:tcPr>
-          <w:p>
-            <w:pPr>
-              <w:spacing w:after="0" w:before="0"/>
-            </w:pPr>
-            <w:r>
-              <w:rPr>
-                <w:rFonts w:ascii="TH Sarabun New" w:cs="TH Sarabun New" w:eastAsia="TH Sarabun New" w:hAnsi="TH Sarabun New"/>
-                <w:b w:val="false"/>
-                <w:sz w:val="28"/>
-                <w:szCs w:val="28"/>
-                <w:lang w:val="en-US" w:bidi="th-TH"/>
-              </w:rPr>
-              <w:t xml:space="preserve">16,394</w:t>
-            </w:r>
-          </w:p>
-        </w:tc>
-        <w:tc>
-          <w:tcPr>
-            <w:tcW w:type="dxa" w:w="1300"/>
-            <w:tcBorders>
-              <w:top w:val="single" w:color="000000" w:sz="4"/>
-              <w:left w:val="single" w:color="000000" w:sz="4"/>
-              <w:bottom w:val="single" w:color="000000" w:sz="4"/>
-              <w:right w:val="single" w:color="000000" w:sz="4"/>
-            </w:tcBorders>
-            <w:tcMar>
-              <w:top w:type="dxa" w:w="40"/>
-              <w:left w:type="dxa" w:w="90"/>
-              <w:bottom w:type="dxa" w:w="40"/>
-              <w:right w:type="dxa" w:w="90"/>
-            </w:tcMar>
-          </w:tcPr>
-          <w:p>
-            <w:pPr>
-              <w:spacing w:after="0" w:before="0"/>
-            </w:pPr>
-            <w:r>
-              <w:rPr>
-                <w:rFonts w:ascii="TH Sarabun New" w:cs="TH Sarabun New" w:eastAsia="TH Sarabun New" w:hAnsi="TH Sarabun New"/>
-                <w:b w:val="false"/>
-                <w:sz w:val="28"/>
-                <w:szCs w:val="28"/>
-                <w:lang w:val="en-US" w:bidi="th-TH"/>
-              </w:rPr>
-              <w:t xml:space="preserve">1,187</w:t>
-            </w:r>
-          </w:p>
-        </w:tc>
-        <w:tc>
-          <w:tcPr>
-            <w:tcW w:type="dxa" w:w="1126"/>
-            <w:tcBorders>
-              <w:top w:val="single" w:color="000000" w:sz="4"/>
-              <w:left w:val="single" w:color="000000" w:sz="4"/>
-              <w:bottom w:val="single" w:color="000000" w:sz="4"/>
-              <w:right w:val="single" w:color="000000" w:sz="4"/>
-            </w:tcBorders>
-            <w:tcMar>
-              <w:top w:type="dxa" w:w="40"/>
-              <w:left w:type="dxa" w:w="90"/>
-              <w:bottom w:type="dxa" w:w="40"/>
-              <w:right w:type="dxa" w:w="90"/>
-            </w:tcMar>
-          </w:tcPr>
-          <w:p>
-            <w:pPr>
-              <w:spacing w:after="0" w:before="0"/>
-            </w:pPr>
-            <w:r>
-              <w:rPr>
-                <w:rFonts w:ascii="TH Sarabun New" w:cs="TH Sarabun New" w:eastAsia="TH Sarabun New" w:hAnsi="TH Sarabun New"/>
-                <w:b w:val="false"/>
-                <w:sz w:val="28"/>
-                <w:szCs w:val="28"/>
-                <w:lang w:val="en-US" w:bidi="th-TH"/>
-              </w:rPr>
-              <w:t xml:space="preserve">0.016</w:t>
+            <w:tcW w:type="dxa" w:w="1200"/>
+            <w:tcBorders>
+              <w:top w:val="single" w:color="000000" w:sz="4"/>
+              <w:left w:val="single" w:color="000000" w:sz="4"/>
+              <w:bottom w:val="single" w:color="000000" w:sz="4"/>
+              <w:right w:val="single" w:color="000000" w:sz="4"/>
+            </w:tcBorders>
+            <w:tcMar>
+              <w:top w:type="dxa" w:w="40"/>
+              <w:left w:type="dxa" w:w="90"/>
+              <w:bottom w:type="dxa" w:w="40"/>
+              <w:right w:type="dxa" w:w="90"/>
+            </w:tcMar>
+          </w:tcPr>
+          <w:p>
+            <w:pPr>
+              <w:spacing w:after="0" w:before="0"/>
+            </w:pPr>
+            <w:r>
+              <w:rPr>
+                <w:rFonts w:ascii="TH Sarabun New" w:cs="TH Sarabun New" w:eastAsia="TH Sarabun New" w:hAnsi="TH Sarabun New"/>
+                <w:b w:val="false"/>
+                <w:sz w:val="28"/>
+                <w:szCs w:val="28"/>
+                <w:lang w:val="en-US" w:bidi="th-TH"/>
+              </w:rPr>
+              <w:t xml:space="preserve">14,394</w:t>
+            </w:r>
+          </w:p>
+        </w:tc>
+        <w:tc>
+          <w:tcPr>
+            <w:tcW w:type="dxa" w:w="1150"/>
+            <w:tcBorders>
+              <w:top w:val="single" w:color="000000" w:sz="4"/>
+              <w:left w:val="single" w:color="000000" w:sz="4"/>
+              <w:bottom w:val="single" w:color="000000" w:sz="4"/>
+              <w:right w:val="single" w:color="000000" w:sz="4"/>
+            </w:tcBorders>
+            <w:tcMar>
+              <w:top w:type="dxa" w:w="40"/>
+              <w:left w:type="dxa" w:w="90"/>
+              <w:bottom w:type="dxa" w:w="40"/>
+              <w:right w:type="dxa" w:w="90"/>
+            </w:tcMar>
+          </w:tcPr>
+          <w:p>
+            <w:pPr>
+              <w:spacing w:after="0" w:before="0"/>
+            </w:pPr>
+            <w:r>
+              <w:rPr>
+                <w:rFonts w:ascii="TH Sarabun New" w:cs="TH Sarabun New" w:eastAsia="TH Sarabun New" w:hAnsi="TH Sarabun New"/>
+                <w:b w:val="false"/>
+                <w:sz w:val="28"/>
+                <w:szCs w:val="28"/>
+                <w:lang w:val="en-US" w:bidi="th-TH"/>
+              </w:rPr>
+              <w:t xml:space="preserve">68</w:t>
+            </w:r>
+          </w:p>
+        </w:tc>
+        <w:tc>
+          <w:tcPr>
+            <w:tcW w:type="dxa" w:w="1026"/>
+            <w:tcBorders>
+              <w:top w:val="single" w:color="000000" w:sz="4"/>
+              <w:left w:val="single" w:color="000000" w:sz="4"/>
+              <w:bottom w:val="single" w:color="000000" w:sz="4"/>
+              <w:right w:val="single" w:color="000000" w:sz="4"/>
+            </w:tcBorders>
+            <w:tcMar>
+              <w:top w:type="dxa" w:w="40"/>
+              <w:left w:type="dxa" w:w="90"/>
+              <w:bottom w:type="dxa" w:w="40"/>
+              <w:right w:type="dxa" w:w="90"/>
+            </w:tcMar>
+          </w:tcPr>
+          <w:p>
+            <w:pPr>
+              <w:spacing w:after="0" w:before="0"/>
+            </w:pPr>
+            <w:r>
+              <w:rPr>
+                <w:rFonts w:ascii="TH Sarabun New" w:cs="TH Sarabun New" w:eastAsia="TH Sarabun New" w:hAnsi="TH Sarabun New"/>
+                <w:b w:val="false"/>
+                <w:sz w:val="28"/>
+                <w:szCs w:val="28"/>
+                <w:lang w:val="en-US" w:bidi="th-TH"/>
+              </w:rPr>
+              <w:t xml:space="preserve">0.014</w:t>
             </w:r>
           </w:p>
         </w:tc>
@@ -28172,161 +28420,193 @@
         </w:tc>
         <w:tc>
           <w:tcPr>
-            <w:tcW w:type="dxa" w:w="3300"/>
-            <w:tcBorders>
-              <w:top w:val="single" w:color="000000" w:sz="4"/>
-              <w:left w:val="single" w:color="000000" w:sz="4"/>
-              <w:bottom w:val="single" w:color="000000" w:sz="4"/>
-              <w:right w:val="single" w:color="000000" w:sz="4"/>
-            </w:tcBorders>
-            <w:tcMar>
-              <w:top w:type="dxa" w:w="40"/>
-              <w:left w:type="dxa" w:w="90"/>
-              <w:bottom w:type="dxa" w:w="40"/>
-              <w:right w:type="dxa" w:w="90"/>
-            </w:tcMar>
-          </w:tcPr>
-          <w:p>
-            <w:pPr>
-              <w:spacing w:after="0" w:before="0"/>
-            </w:pPr>
-            <w:r>
-              <w:rPr>
-                <w:rFonts w:ascii="TH Sarabun New" w:cs="TH Sarabun New" w:eastAsia="TH Sarabun New" w:hAnsi="TH Sarabun New"/>
-                <w:b w:val="false"/>
-                <w:sz w:val="28"/>
-                <w:szCs w:val="28"/>
-                <w:lang w:val="en-US" w:bidi="th-TH"/>
-              </w:rPr>
-              <w:t xml:space="preserve">desk_communication_task (รวม​ระบบ)</w:t>
-            </w:r>
-          </w:p>
-        </w:tc>
-        <w:tc>
-          <w:tcPr>
-            <w:tcW w:type="dxa" w:w="1100"/>
-            <w:tcBorders>
-              <w:top w:val="single" w:color="000000" w:sz="4"/>
-              <w:left w:val="single" w:color="000000" w:sz="4"/>
-              <w:bottom w:val="single" w:color="000000" w:sz="4"/>
-              <w:right w:val="single" w:color="000000" w:sz="4"/>
-            </w:tcBorders>
-            <w:tcMar>
-              <w:top w:type="dxa" w:w="40"/>
-              <w:left w:type="dxa" w:w="90"/>
-              <w:bottom w:type="dxa" w:w="40"/>
-              <w:right w:type="dxa" w:w="90"/>
-            </w:tcMar>
-          </w:tcPr>
-          <w:p>
-            <w:pPr>
-              <w:spacing w:after="0" w:before="0"/>
-            </w:pPr>
-            <w:r>
-              <w:rPr>
-                <w:rFonts w:ascii="TH Sarabun New" w:cs="TH Sarabun New" w:eastAsia="TH Sarabun New" w:hAnsi="TH Sarabun New"/>
-                <w:b w:val="false"/>
-                <w:sz w:val="28"/>
-                <w:szCs w:val="28"/>
-                <w:lang w:val="en-US" w:bidi="th-TH"/>
-              </w:rPr>
-              <w:t xml:space="preserve">1,000</w:t>
-            </w:r>
-          </w:p>
-        </w:tc>
-        <w:tc>
-          <w:tcPr>
-            <w:tcW w:type="dxa" w:w="1300"/>
-            <w:tcBorders>
-              <w:top w:val="single" w:color="000000" w:sz="4"/>
-              <w:left w:val="single" w:color="000000" w:sz="4"/>
-              <w:bottom w:val="single" w:color="000000" w:sz="4"/>
-              <w:right w:val="single" w:color="000000" w:sz="4"/>
-            </w:tcBorders>
-            <w:tcMar>
-              <w:top w:type="dxa" w:w="40"/>
-              <w:left w:type="dxa" w:w="90"/>
-              <w:bottom w:type="dxa" w:w="40"/>
-              <w:right w:type="dxa" w:w="90"/>
-            </w:tcMar>
-          </w:tcPr>
-          <w:p>
-            <w:pPr>
-              <w:spacing w:after="0" w:before="0"/>
-            </w:pPr>
-            <w:r>
-              <w:rPr>
-                <w:rFonts w:ascii="TH Sarabun New" w:cs="TH Sarabun New" w:eastAsia="TH Sarabun New" w:hAnsi="TH Sarabun New"/>
-                <w:b w:val="false"/>
-                <w:sz w:val="28"/>
-                <w:szCs w:val="28"/>
-                <w:lang w:val="en-US" w:bidi="th-TH"/>
-              </w:rPr>
-              <w:t xml:space="preserve">5,605</w:t>
-            </w:r>
-          </w:p>
-        </w:tc>
-        <w:tc>
-          <w:tcPr>
-            <w:tcW w:type="dxa" w:w="1300"/>
-            <w:tcBorders>
-              <w:top w:val="single" w:color="000000" w:sz="4"/>
-              <w:left w:val="single" w:color="000000" w:sz="4"/>
-              <w:bottom w:val="single" w:color="000000" w:sz="4"/>
-              <w:right w:val="single" w:color="000000" w:sz="4"/>
-            </w:tcBorders>
-            <w:tcMar>
-              <w:top w:type="dxa" w:w="40"/>
-              <w:left w:type="dxa" w:w="90"/>
-              <w:bottom w:type="dxa" w:w="40"/>
-              <w:right w:type="dxa" w:w="90"/>
-            </w:tcMar>
-          </w:tcPr>
-          <w:p>
-            <w:pPr>
-              <w:spacing w:after="0" w:before="0"/>
-            </w:pPr>
-            <w:r>
-              <w:rPr>
-                <w:rFonts w:ascii="TH Sarabun New" w:cs="TH Sarabun New" w:eastAsia="TH Sarabun New" w:hAnsi="TH Sarabun New"/>
-                <w:b w:val="false"/>
-                <w:sz w:val="28"/>
-                <w:szCs w:val="28"/>
-                <w:lang w:val="en-US" w:bidi="th-TH"/>
-              </w:rPr>
-              <w:t xml:space="preserve">5,000</w:t>
-            </w:r>
-          </w:p>
-        </w:tc>
-        <w:tc>
-          <w:tcPr>
-            <w:tcW w:type="dxa" w:w="1126"/>
-            <w:tcBorders>
-              <w:top w:val="single" w:color="000000" w:sz="4"/>
-              <w:left w:val="single" w:color="000000" w:sz="4"/>
-              <w:bottom w:val="single" w:color="000000" w:sz="4"/>
-              <w:right w:val="single" w:color="000000" w:sz="4"/>
-            </w:tcBorders>
-            <w:tcMar>
-              <w:top w:type="dxa" w:w="40"/>
-              <w:left w:type="dxa" w:w="90"/>
-              <w:bottom w:type="dxa" w:w="40"/>
-              <w:right w:type="dxa" w:w="90"/>
-            </w:tcMar>
-          </w:tcPr>
-          <w:p>
-            <w:pPr>
-              <w:spacing w:after="0" w:before="0"/>
-            </w:pPr>
-            <w:r>
-              <w:rPr>
-                <w:rFonts w:ascii="TH Sarabun New" w:cs="TH Sarabun New" w:eastAsia="TH Sarabun New" w:hAnsi="TH Sarabun New"/>
-                <w:b w:val="false"/>
-                <w:sz w:val="28"/>
-                <w:szCs w:val="28"/>
-                <w:lang w:val="en-US" w:bidi="th-TH"/>
-              </w:rPr>
-              <w:t xml:space="preserve">0.006</w:t>
+            <w:tcW w:type="dxa" w:w="750"/>
+            <w:tcBorders>
+              <w:top w:val="single" w:color="000000" w:sz="4"/>
+              <w:left w:val="single" w:color="000000" w:sz="4"/>
+              <w:bottom w:val="single" w:color="000000" w:sz="4"/>
+              <w:right w:val="single" w:color="000000" w:sz="4"/>
+            </w:tcBorders>
+            <w:tcMar>
+              <w:top w:type="dxa" w:w="40"/>
+              <w:left w:type="dxa" w:w="90"/>
+              <w:bottom w:type="dxa" w:w="40"/>
+              <w:right w:type="dxa" w:w="90"/>
+            </w:tcMar>
+          </w:tcPr>
+          <w:p>
+            <w:pPr>
+              <w:spacing w:after="0" w:before="0"/>
+            </w:pPr>
+            <w:r>
+              <w:rPr>
+                <w:rFonts w:ascii="TH Sarabun New" w:cs="TH Sarabun New" w:eastAsia="TH Sarabun New" w:hAnsi="TH Sarabun New"/>
+                <w:b w:val="false"/>
+                <w:sz w:val="28"/>
+                <w:szCs w:val="28"/>
+                <w:lang w:val="en-US" w:bidi="th-TH"/>
+              </w:rPr>
+              <w:t xml:space="preserve">1</w:t>
+            </w:r>
+          </w:p>
+        </w:tc>
+        <w:tc>
+          <w:tcPr>
+            <w:tcW w:type="dxa" w:w="2950"/>
+            <w:tcBorders>
+              <w:top w:val="single" w:color="000000" w:sz="4"/>
+              <w:left w:val="single" w:color="000000" w:sz="4"/>
+              <w:bottom w:val="single" w:color="000000" w:sz="4"/>
+              <w:right w:val="single" w:color="000000" w:sz="4"/>
+            </w:tcBorders>
+            <w:tcMar>
+              <w:top w:type="dxa" w:w="40"/>
+              <w:left w:type="dxa" w:w="90"/>
+              <w:bottom w:type="dxa" w:w="40"/>
+              <w:right w:type="dxa" w:w="90"/>
+            </w:tcMar>
+          </w:tcPr>
+          <w:p>
+            <w:pPr>
+              <w:spacing w:after="0" w:before="0"/>
+            </w:pPr>
+            <w:r>
+              <w:rPr>
+                <w:rFonts w:ascii="TH Sarabun New" w:cs="TH Sarabun New" w:eastAsia="TH Sarabun New" w:hAnsi="TH Sarabun New"/>
+                <w:b w:val="false"/>
+                <w:sz w:val="28"/>
+                <w:szCs w:val="28"/>
+                <w:lang w:val="en-US" w:bidi="th-TH"/>
+              </w:rPr>
+              <w:t xml:space="preserve">รวม​แกน 1 (ขอบเขต RMS สำหรับ 5 งาน = 0.743)</w:t>
+            </w:r>
+          </w:p>
+        </w:tc>
+        <w:tc>
+          <w:tcPr>
+            <w:tcW w:type="dxa" w:w="1050"/>
+            <w:tcBorders>
+              <w:top w:val="single" w:color="000000" w:sz="4"/>
+              <w:left w:val="single" w:color="000000" w:sz="4"/>
+              <w:bottom w:val="single" w:color="000000" w:sz="4"/>
+              <w:right w:val="single" w:color="000000" w:sz="4"/>
+            </w:tcBorders>
+            <w:tcMar>
+              <w:top w:type="dxa" w:w="40"/>
+              <w:left w:type="dxa" w:w="90"/>
+              <w:bottom w:type="dxa" w:w="40"/>
+              <w:right w:type="dxa" w:w="90"/>
+            </w:tcMar>
+          </w:tcPr>
+          <w:p>
+            <w:pPr>
+              <w:spacing w:after="0" w:before="0"/>
+            </w:pPr>
+            <w:r>
+              <w:rPr>
+                <w:rFonts w:ascii="TH Sarabun New" w:cs="TH Sarabun New" w:eastAsia="TH Sarabun New" w:hAnsi="TH Sarabun New"/>
+                <w:b w:val="false"/>
+                <w:sz w:val="28"/>
+                <w:szCs w:val="28"/>
+                <w:lang w:val="en-US" w:bidi="th-TH"/>
+              </w:rPr>
+              <w:t xml:space="preserve"/>
+            </w:r>
+          </w:p>
+        </w:tc>
+        <w:tc>
+          <w:tcPr>
+            <w:tcW w:type="dxa" w:w="1200"/>
+            <w:tcBorders>
+              <w:top w:val="single" w:color="000000" w:sz="4"/>
+              <w:left w:val="single" w:color="000000" w:sz="4"/>
+              <w:bottom w:val="single" w:color="000000" w:sz="4"/>
+              <w:right w:val="single" w:color="000000" w:sz="4"/>
+            </w:tcBorders>
+            <w:tcMar>
+              <w:top w:type="dxa" w:w="40"/>
+              <w:left w:type="dxa" w:w="90"/>
+              <w:bottom w:type="dxa" w:w="40"/>
+              <w:right w:type="dxa" w:w="90"/>
+            </w:tcMar>
+          </w:tcPr>
+          <w:p>
+            <w:pPr>
+              <w:spacing w:after="0" w:before="0"/>
+            </w:pPr>
+            <w:r>
+              <w:rPr>
+                <w:rFonts w:ascii="TH Sarabun New" w:cs="TH Sarabun New" w:eastAsia="TH Sarabun New" w:hAnsi="TH Sarabun New"/>
+                <w:b w:val="false"/>
+                <w:sz w:val="28"/>
+                <w:szCs w:val="28"/>
+                <w:lang w:val="en-US" w:bidi="th-TH"/>
+              </w:rPr>
+              <w:t xml:space="preserve"/>
+            </w:r>
+          </w:p>
+        </w:tc>
+        <w:tc>
+          <w:tcPr>
+            <w:tcW w:type="dxa" w:w="1150"/>
+            <w:tcBorders>
+              <w:top w:val="single" w:color="000000" w:sz="4"/>
+              <w:left w:val="single" w:color="000000" w:sz="4"/>
+              <w:bottom w:val="single" w:color="000000" w:sz="4"/>
+              <w:right w:val="single" w:color="000000" w:sz="4"/>
+            </w:tcBorders>
+            <w:tcMar>
+              <w:top w:type="dxa" w:w="40"/>
+              <w:left w:type="dxa" w:w="90"/>
+              <w:bottom w:type="dxa" w:w="40"/>
+              <w:right w:type="dxa" w:w="90"/>
+            </w:tcMar>
+          </w:tcPr>
+          <w:p>
+            <w:pPr>
+              <w:spacing w:after="0" w:before="0"/>
+            </w:pPr>
+            <w:r>
+              <w:rPr>
+                <w:rFonts w:ascii="TH Sarabun New" w:cs="TH Sarabun New" w:eastAsia="TH Sarabun New" w:hAnsi="TH Sarabun New"/>
+                <w:b w:val="false"/>
+                <w:sz w:val="28"/>
+                <w:szCs w:val="28"/>
+                <w:lang w:val="en-US" w:bidi="th-TH"/>
+              </w:rPr>
+              <w:t xml:space="preserve"/>
+            </w:r>
+          </w:p>
+        </w:tc>
+        <w:tc>
+          <w:tcPr>
+            <w:tcW w:type="dxa" w:w="1026"/>
+            <w:tcBorders>
+              <w:top w:val="single" w:color="000000" w:sz="4"/>
+              <w:left w:val="single" w:color="000000" w:sz="4"/>
+              <w:bottom w:val="single" w:color="000000" w:sz="4"/>
+              <w:right w:val="single" w:color="000000" w:sz="4"/>
+            </w:tcBorders>
+            <w:tcMar>
+              <w:top w:type="dxa" w:w="40"/>
+              <w:left w:type="dxa" w:w="90"/>
+              <w:bottom w:type="dxa" w:w="40"/>
+              <w:right w:type="dxa" w:w="90"/>
+            </w:tcMar>
+          </w:tcPr>
+          <w:p>
+            <w:pPr>
+              <w:spacing w:after="0" w:before="0"/>
+            </w:pPr>
+            <w:r>
+              <w:rPr>
+                <w:rFonts w:ascii="TH Sarabun New" w:cs="TH Sarabun New" w:eastAsia="TH Sarabun New" w:hAnsi="TH Sarabun New"/>
+                <w:b w:val="false"/>
+                <w:sz w:val="28"/>
+                <w:szCs w:val="28"/>
+                <w:lang w:val="en-US" w:bidi="th-TH"/>
+              </w:rPr>
+              <w:t xml:space="preserve">0.290</w:t>
             </w:r>
           </w:p>
         </w:tc>
@@ -28369,161 +28649,193 @@
         </w:tc>
         <w:tc>
           <w:tcPr>
-            <w:tcW w:type="dxa" w:w="3300"/>
-            <w:tcBorders>
-              <w:top w:val="single" w:color="000000" w:sz="4"/>
-              <w:left w:val="single" w:color="000000" w:sz="4"/>
-              <w:bottom w:val="single" w:color="000000" w:sz="4"/>
-              <w:right w:val="single" w:color="000000" w:sz="4"/>
-            </w:tcBorders>
-            <w:tcMar>
-              <w:top w:type="dxa" w:w="40"/>
-              <w:left w:type="dxa" w:w="90"/>
-              <w:bottom w:type="dxa" w:w="40"/>
-              <w:right w:type="dxa" w:w="90"/>
-            </w:tcMar>
-          </w:tcPr>
-          <w:p>
-            <w:pPr>
-              <w:spacing w:after="0" w:before="0"/>
-            </w:pPr>
-            <w:r>
-              <w:rPr>
-                <w:rFonts w:ascii="TH Sarabun New" w:cs="TH Sarabun New" w:eastAsia="TH Sarabun New" w:hAnsi="TH Sarabun New"/>
-                <w:b w:val="false"/>
-                <w:sz w:val="28"/>
-                <w:szCs w:val="28"/>
-                <w:lang w:val="en-US" w:bidi="th-TH"/>
-              </w:rPr>
-              <w:t xml:space="preserve">รวม (ขอบเขต RMS สำหรับ 6 งาน = 0.735)</w:t>
-            </w:r>
-          </w:p>
-        </w:tc>
-        <w:tc>
-          <w:tcPr>
-            <w:tcW w:type="dxa" w:w="1100"/>
-            <w:tcBorders>
-              <w:top w:val="single" w:color="000000" w:sz="4"/>
-              <w:left w:val="single" w:color="000000" w:sz="4"/>
-              <w:bottom w:val="single" w:color="000000" w:sz="4"/>
-              <w:right w:val="single" w:color="000000" w:sz="4"/>
-            </w:tcBorders>
-            <w:tcMar>
-              <w:top w:type="dxa" w:w="40"/>
-              <w:left w:type="dxa" w:w="90"/>
-              <w:bottom w:type="dxa" w:w="40"/>
-              <w:right w:type="dxa" w:w="90"/>
-            </w:tcMar>
-          </w:tcPr>
-          <w:p>
-            <w:pPr>
-              <w:spacing w:after="0" w:before="0"/>
-            </w:pPr>
-            <w:r>
-              <w:rPr>
-                <w:rFonts w:ascii="TH Sarabun New" w:cs="TH Sarabun New" w:eastAsia="TH Sarabun New" w:hAnsi="TH Sarabun New"/>
-                <w:b w:val="false"/>
-                <w:sz w:val="28"/>
-                <w:szCs w:val="28"/>
-                <w:lang w:val="en-US" w:bidi="th-TH"/>
-              </w:rPr>
-              <w:t xml:space="preserve"/>
-            </w:r>
-          </w:p>
-        </w:tc>
-        <w:tc>
-          <w:tcPr>
-            <w:tcW w:type="dxa" w:w="1300"/>
-            <w:tcBorders>
-              <w:top w:val="single" w:color="000000" w:sz="4"/>
-              <w:left w:val="single" w:color="000000" w:sz="4"/>
-              <w:bottom w:val="single" w:color="000000" w:sz="4"/>
-              <w:right w:val="single" w:color="000000" w:sz="4"/>
-            </w:tcBorders>
-            <w:tcMar>
-              <w:top w:type="dxa" w:w="40"/>
-              <w:left w:type="dxa" w:w="90"/>
-              <w:bottom w:type="dxa" w:w="40"/>
-              <w:right w:type="dxa" w:w="90"/>
-            </w:tcMar>
-          </w:tcPr>
-          <w:p>
-            <w:pPr>
-              <w:spacing w:after="0" w:before="0"/>
-            </w:pPr>
-            <w:r>
-              <w:rPr>
-                <w:rFonts w:ascii="TH Sarabun New" w:cs="TH Sarabun New" w:eastAsia="TH Sarabun New" w:hAnsi="TH Sarabun New"/>
-                <w:b w:val="false"/>
-                <w:sz w:val="28"/>
-                <w:szCs w:val="28"/>
-                <w:lang w:val="en-US" w:bidi="th-TH"/>
-              </w:rPr>
-              <w:t xml:space="preserve"/>
-            </w:r>
-          </w:p>
-        </w:tc>
-        <w:tc>
-          <w:tcPr>
-            <w:tcW w:type="dxa" w:w="1300"/>
-            <w:tcBorders>
-              <w:top w:val="single" w:color="000000" w:sz="4"/>
-              <w:left w:val="single" w:color="000000" w:sz="4"/>
-              <w:bottom w:val="single" w:color="000000" w:sz="4"/>
-              <w:right w:val="single" w:color="000000" w:sz="4"/>
-            </w:tcBorders>
-            <w:tcMar>
-              <w:top w:type="dxa" w:w="40"/>
-              <w:left w:type="dxa" w:w="90"/>
-              <w:bottom w:type="dxa" w:w="40"/>
-              <w:right w:type="dxa" w:w="90"/>
-            </w:tcMar>
-          </w:tcPr>
-          <w:p>
-            <w:pPr>
-              <w:spacing w:after="0" w:before="0"/>
-            </w:pPr>
-            <w:r>
-              <w:rPr>
-                <w:rFonts w:ascii="TH Sarabun New" w:cs="TH Sarabun New" w:eastAsia="TH Sarabun New" w:hAnsi="TH Sarabun New"/>
-                <w:b w:val="false"/>
-                <w:sz w:val="28"/>
-                <w:szCs w:val="28"/>
-                <w:lang w:val="en-US" w:bidi="th-TH"/>
-              </w:rPr>
-              <w:t xml:space="preserve"/>
-            </w:r>
-          </w:p>
-        </w:tc>
-        <w:tc>
-          <w:tcPr>
-            <w:tcW w:type="dxa" w:w="1126"/>
-            <w:tcBorders>
-              <w:top w:val="single" w:color="000000" w:sz="4"/>
-              <w:left w:val="single" w:color="000000" w:sz="4"/>
-              <w:bottom w:val="single" w:color="000000" w:sz="4"/>
-              <w:right w:val="single" w:color="000000" w:sz="4"/>
-            </w:tcBorders>
-            <w:tcMar>
-              <w:top w:type="dxa" w:w="40"/>
-              <w:left w:type="dxa" w:w="90"/>
-              <w:bottom w:type="dxa" w:w="40"/>
-              <w:right w:type="dxa" w:w="90"/>
-            </w:tcMar>
-          </w:tcPr>
-          <w:p>
-            <w:pPr>
-              <w:spacing w:after="0" w:before="0"/>
-            </w:pPr>
-            <w:r>
-              <w:rPr>
-                <w:rFonts w:ascii="TH Sarabun New" w:cs="TH Sarabun New" w:eastAsia="TH Sarabun New" w:hAnsi="TH Sarabun New"/>
-                <w:b w:val="false"/>
-                <w:sz w:val="28"/>
-                <w:szCs w:val="28"/>
-                <w:lang w:val="en-US" w:bidi="th-TH"/>
-              </w:rPr>
-              <w:t xml:space="preserve">0.274</w:t>
+            <w:tcW w:type="dxa" w:w="750"/>
+            <w:tcBorders>
+              <w:top w:val="single" w:color="000000" w:sz="4"/>
+              <w:left w:val="single" w:color="000000" w:sz="4"/>
+              <w:bottom w:val="single" w:color="000000" w:sz="4"/>
+              <w:right w:val="single" w:color="000000" w:sz="4"/>
+            </w:tcBorders>
+            <w:tcMar>
+              <w:top w:type="dxa" w:w="40"/>
+              <w:left w:type="dxa" w:w="90"/>
+              <w:bottom w:type="dxa" w:w="40"/>
+              <w:right w:type="dxa" w:w="90"/>
+            </w:tcMar>
+          </w:tcPr>
+          <w:p>
+            <w:pPr>
+              <w:spacing w:after="0" w:before="0"/>
+            </w:pPr>
+            <w:r>
+              <w:rPr>
+                <w:rFonts w:ascii="TH Sarabun New" w:cs="TH Sarabun New" w:eastAsia="TH Sarabun New" w:hAnsi="TH Sarabun New"/>
+                <w:b w:val="false"/>
+                <w:sz w:val="28"/>
+                <w:szCs w:val="28"/>
+                <w:lang w:val="en-US" w:bidi="th-TH"/>
+              </w:rPr>
+              <w:t xml:space="preserve">0</w:t>
+            </w:r>
+          </w:p>
+        </w:tc>
+        <w:tc>
+          <w:tcPr>
+            <w:tcW w:type="dxa" w:w="2950"/>
+            <w:tcBorders>
+              <w:top w:val="single" w:color="000000" w:sz="4"/>
+              <w:left w:val="single" w:color="000000" w:sz="4"/>
+              <w:bottom w:val="single" w:color="000000" w:sz="4"/>
+              <w:right w:val="single" w:color="000000" w:sz="4"/>
+            </w:tcBorders>
+            <w:tcMar>
+              <w:top w:type="dxa" w:w="40"/>
+              <w:left w:type="dxa" w:w="90"/>
+              <w:bottom w:type="dxa" w:w="40"/>
+              <w:right w:type="dxa" w:w="90"/>
+            </w:tcMar>
+          </w:tcPr>
+          <w:p>
+            <w:pPr>
+              <w:spacing w:after="0" w:before="0"/>
+            </w:pPr>
+            <w:r>
+              <w:rPr>
+                <w:rFonts w:ascii="TH Sarabun New" w:cs="TH Sarabun New" w:eastAsia="TH Sarabun New" w:hAnsi="TH Sarabun New"/>
+                <w:b w:val="false"/>
+                <w:sz w:val="28"/>
+                <w:szCs w:val="28"/>
+                <w:lang w:val="en-US" w:bidi="th-TH"/>
+              </w:rPr>
+              <w:t xml:space="preserve">desk_communication_task (รวม​ระบบ)</w:t>
+            </w:r>
+          </w:p>
+        </w:tc>
+        <w:tc>
+          <w:tcPr>
+            <w:tcW w:type="dxa" w:w="1050"/>
+            <w:tcBorders>
+              <w:top w:val="single" w:color="000000" w:sz="4"/>
+              <w:left w:val="single" w:color="000000" w:sz="4"/>
+              <w:bottom w:val="single" w:color="000000" w:sz="4"/>
+              <w:right w:val="single" w:color="000000" w:sz="4"/>
+            </w:tcBorders>
+            <w:tcMar>
+              <w:top w:type="dxa" w:w="40"/>
+              <w:left w:type="dxa" w:w="90"/>
+              <w:bottom w:type="dxa" w:w="40"/>
+              <w:right w:type="dxa" w:w="90"/>
+            </w:tcMar>
+          </w:tcPr>
+          <w:p>
+            <w:pPr>
+              <w:spacing w:after="0" w:before="0"/>
+            </w:pPr>
+            <w:r>
+              <w:rPr>
+                <w:rFonts w:ascii="TH Sarabun New" w:cs="TH Sarabun New" w:eastAsia="TH Sarabun New" w:hAnsi="TH Sarabun New"/>
+                <w:b w:val="false"/>
+                <w:sz w:val="28"/>
+                <w:szCs w:val="28"/>
+                <w:lang w:val="en-US" w:bidi="th-TH"/>
+              </w:rPr>
+              <w:t xml:space="preserve">1,000</w:t>
+            </w:r>
+          </w:p>
+        </w:tc>
+        <w:tc>
+          <w:tcPr>
+            <w:tcW w:type="dxa" w:w="1200"/>
+            <w:tcBorders>
+              <w:top w:val="single" w:color="000000" w:sz="4"/>
+              <w:left w:val="single" w:color="000000" w:sz="4"/>
+              <w:bottom w:val="single" w:color="000000" w:sz="4"/>
+              <w:right w:val="single" w:color="000000" w:sz="4"/>
+            </w:tcBorders>
+            <w:tcMar>
+              <w:top w:type="dxa" w:w="40"/>
+              <w:left w:type="dxa" w:w="90"/>
+              <w:bottom w:type="dxa" w:w="40"/>
+              <w:right w:type="dxa" w:w="90"/>
+            </w:tcMar>
+          </w:tcPr>
+          <w:p>
+            <w:pPr>
+              <w:spacing w:after="0" w:before="0"/>
+            </w:pPr>
+            <w:r>
+              <w:rPr>
+                <w:rFonts w:ascii="TH Sarabun New" w:cs="TH Sarabun New" w:eastAsia="TH Sarabun New" w:hAnsi="TH Sarabun New"/>
+                <w:b w:val="false"/>
+                <w:sz w:val="28"/>
+                <w:szCs w:val="28"/>
+                <w:lang w:val="en-US" w:bidi="th-TH"/>
+              </w:rPr>
+              <w:t xml:space="preserve">5,207</w:t>
+            </w:r>
+          </w:p>
+        </w:tc>
+        <w:tc>
+          <w:tcPr>
+            <w:tcW w:type="dxa" w:w="1150"/>
+            <w:tcBorders>
+              <w:top w:val="single" w:color="000000" w:sz="4"/>
+              <w:left w:val="single" w:color="000000" w:sz="4"/>
+              <w:bottom w:val="single" w:color="000000" w:sz="4"/>
+              <w:right w:val="single" w:color="000000" w:sz="4"/>
+            </w:tcBorders>
+            <w:tcMar>
+              <w:top w:type="dxa" w:w="40"/>
+              <w:left w:type="dxa" w:w="90"/>
+              <w:bottom w:type="dxa" w:w="40"/>
+              <w:right w:type="dxa" w:w="90"/>
+            </w:tcMar>
+          </w:tcPr>
+          <w:p>
+            <w:pPr>
+              <w:spacing w:after="0" w:before="0"/>
+            </w:pPr>
+            <w:r>
+              <w:rPr>
+                <w:rFonts w:ascii="TH Sarabun New" w:cs="TH Sarabun New" w:eastAsia="TH Sarabun New" w:hAnsi="TH Sarabun New"/>
+                <w:b w:val="false"/>
+                <w:sz w:val="28"/>
+                <w:szCs w:val="28"/>
+                <w:lang w:val="en-US" w:bidi="th-TH"/>
+              </w:rPr>
+              <w:t xml:space="preserve">4,111</w:t>
+            </w:r>
+          </w:p>
+        </w:tc>
+        <w:tc>
+          <w:tcPr>
+            <w:tcW w:type="dxa" w:w="1026"/>
+            <w:tcBorders>
+              <w:top w:val="single" w:color="000000" w:sz="4"/>
+              <w:left w:val="single" w:color="000000" w:sz="4"/>
+              <w:bottom w:val="single" w:color="000000" w:sz="4"/>
+              <w:right w:val="single" w:color="000000" w:sz="4"/>
+            </w:tcBorders>
+            <w:tcMar>
+              <w:top w:type="dxa" w:w="40"/>
+              <w:left w:type="dxa" w:w="90"/>
+              <w:bottom w:type="dxa" w:w="40"/>
+              <w:right w:type="dxa" w:w="90"/>
+            </w:tcMar>
+          </w:tcPr>
+          <w:p>
+            <w:pPr>
+              <w:spacing w:after="0" w:before="0"/>
+            </w:pPr>
+            <w:r>
+              <w:rPr>
+                <w:rFonts w:ascii="TH Sarabun New" w:cs="TH Sarabun New" w:eastAsia="TH Sarabun New" w:hAnsi="TH Sarabun New"/>
+                <w:b w:val="false"/>
+                <w:sz w:val="28"/>
+                <w:szCs w:val="28"/>
+                <w:lang w:val="en-US" w:bidi="th-TH"/>
+              </w:rPr>
+              <w:t xml:space="preserve">0.005</w:t>
             </w:r>
           </w:p>
         </w:tc>
@@ -28566,7 +28878,39 @@
         </w:tc>
         <w:tc>
           <w:tcPr>
-            <w:tcW w:type="dxa" w:w="3300"/>
+            <w:tcW w:type="dxa" w:w="750"/>
+            <w:tcBorders>
+              <w:top w:val="single" w:color="000000" w:sz="4"/>
+              <w:left w:val="single" w:color="000000" w:sz="4"/>
+              <w:bottom w:val="single" w:color="000000" w:sz="4"/>
+              <w:right w:val="single" w:color="000000" w:sz="4"/>
+            </w:tcBorders>
+            <w:tcMar>
+              <w:top w:type="dxa" w:w="40"/>
+              <w:left w:type="dxa" w:w="90"/>
+              <w:bottom w:type="dxa" w:w="40"/>
+              <w:right w:type="dxa" w:w="90"/>
+            </w:tcMar>
+          </w:tcPr>
+          <w:p>
+            <w:pPr>
+              <w:spacing w:after="0" w:before="0"/>
+            </w:pPr>
+            <w:r>
+              <w:rPr>
+                <w:rFonts w:ascii="TH Sarabun New" w:cs="TH Sarabun New" w:eastAsia="TH Sarabun New" w:hAnsi="TH Sarabun New"/>
+                <w:b w:val="false"/>
+                <w:sz w:val="28"/>
+                <w:szCs w:val="28"/>
+                <w:lang w:val="en-US" w:bidi="th-TH"/>
+              </w:rPr>
+              <w:t xml:space="preserve">1</w:t>
+            </w:r>
+          </w:p>
+        </w:tc>
+        <w:tc>
+          <w:tcPr>
+            <w:tcW w:type="dxa" w:w="2950"/>
             <w:tcBorders>
               <w:top w:val="single" w:color="000000" w:sz="4"/>
               <w:left w:val="single" w:color="000000" w:sz="4"/>
@@ -28598,7 +28942,7 @@
         </w:tc>
         <w:tc>
           <w:tcPr>
-            <w:tcW w:type="dxa" w:w="1100"/>
+            <w:tcW w:type="dxa" w:w="1050"/>
             <w:tcBorders>
               <w:top w:val="single" w:color="000000" w:sz="4"/>
               <w:left w:val="single" w:color="000000" w:sz="4"/>
@@ -28630,7 +28974,7 @@
         </w:tc>
         <w:tc>
           <w:tcPr>
-            <w:tcW w:type="dxa" w:w="1300"/>
+            <w:tcW w:type="dxa" w:w="1200"/>
             <w:tcBorders>
               <w:top w:val="single" w:color="000000" w:sz="4"/>
               <w:left w:val="single" w:color="000000" w:sz="4"/>
@@ -28662,7 +29006,7 @@
         </w:tc>
         <w:tc>
           <w:tcPr>
-            <w:tcW w:type="dxa" w:w="1300"/>
+            <w:tcW w:type="dxa" w:w="1150"/>
             <w:tcBorders>
               <w:top w:val="single" w:color="000000" w:sz="4"/>
               <w:left w:val="single" w:color="000000" w:sz="4"/>
@@ -28694,7 +29038,7 @@
         </w:tc>
         <w:tc>
           <w:tcPr>
-            <w:tcW w:type="dxa" w:w="1126"/>
+            <w:tcW w:type="dxa" w:w="1026"/>
             <w:tcBorders>
               <w:top w:val="single" w:color="000000" w:sz="4"/>
               <w:left w:val="single" w:color="000000" w:sz="4"/>
@@ -28763,7 +29107,39 @@
         </w:tc>
         <w:tc>
           <w:tcPr>
-            <w:tcW w:type="dxa" w:w="3300"/>
+            <w:tcW w:type="dxa" w:w="750"/>
+            <w:tcBorders>
+              <w:top w:val="single" w:color="000000" w:sz="4"/>
+              <w:left w:val="single" w:color="000000" w:sz="4"/>
+              <w:bottom w:val="single" w:color="000000" w:sz="4"/>
+              <w:right w:val="single" w:color="000000" w:sz="4"/>
+            </w:tcBorders>
+            <w:tcMar>
+              <w:top w:type="dxa" w:w="40"/>
+              <w:left w:type="dxa" w:w="90"/>
+              <w:bottom w:type="dxa" w:w="40"/>
+              <w:right w:type="dxa" w:w="90"/>
+            </w:tcMar>
+          </w:tcPr>
+          <w:p>
+            <w:pPr>
+              <w:spacing w:after="0" w:before="0"/>
+            </w:pPr>
+            <w:r>
+              <w:rPr>
+                <w:rFonts w:ascii="TH Sarabun New" w:cs="TH Sarabun New" w:eastAsia="TH Sarabun New" w:hAnsi="TH Sarabun New"/>
+                <w:b w:val="false"/>
+                <w:sz w:val="28"/>
+                <w:szCs w:val="28"/>
+                <w:lang w:val="en-US" w:bidi="th-TH"/>
+              </w:rPr>
+              <w:t xml:space="preserve">0</w:t>
+            </w:r>
+          </w:p>
+        </w:tc>
+        <w:tc>
+          <w:tcPr>
+            <w:tcW w:type="dxa" w:w="2950"/>
             <w:tcBorders>
               <w:top w:val="single" w:color="000000" w:sz="4"/>
               <w:left w:val="single" w:color="000000" w:sz="4"/>
@@ -28795,7 +29171,7 @@
         </w:tc>
         <w:tc>
           <w:tcPr>
-            <w:tcW w:type="dxa" w:w="1100"/>
+            <w:tcW w:type="dxa" w:w="1050"/>
             <w:tcBorders>
               <w:top w:val="single" w:color="000000" w:sz="4"/>
               <w:left w:val="single" w:color="000000" w:sz="4"/>
@@ -28827,97 +29203,97 @@
         </w:tc>
         <w:tc>
           <w:tcPr>
-            <w:tcW w:type="dxa" w:w="1300"/>
-            <w:tcBorders>
-              <w:top w:val="single" w:color="000000" w:sz="4"/>
-              <w:left w:val="single" w:color="000000" w:sz="4"/>
-              <w:bottom w:val="single" w:color="000000" w:sz="4"/>
-              <w:right w:val="single" w:color="000000" w:sz="4"/>
-            </w:tcBorders>
-            <w:tcMar>
-              <w:top w:type="dxa" w:w="40"/>
-              <w:left w:type="dxa" w:w="90"/>
-              <w:bottom w:type="dxa" w:w="40"/>
-              <w:right w:type="dxa" w:w="90"/>
-            </w:tcMar>
-          </w:tcPr>
-          <w:p>
-            <w:pPr>
-              <w:spacing w:after="0" w:before="0"/>
-            </w:pPr>
-            <w:r>
-              <w:rPr>
-                <w:rFonts w:ascii="TH Sarabun New" w:cs="TH Sarabun New" w:eastAsia="TH Sarabun New" w:hAnsi="TH Sarabun New"/>
-                <w:b w:val="false"/>
-                <w:sz w:val="28"/>
-                <w:szCs w:val="28"/>
-                <w:lang w:val="en-US" w:bidi="th-TH"/>
-              </w:rPr>
-              <w:t xml:space="preserve">5,538</w:t>
-            </w:r>
-          </w:p>
-        </w:tc>
-        <w:tc>
-          <w:tcPr>
-            <w:tcW w:type="dxa" w:w="1300"/>
-            <w:tcBorders>
-              <w:top w:val="single" w:color="000000" w:sz="4"/>
-              <w:left w:val="single" w:color="000000" w:sz="4"/>
-              <w:bottom w:val="single" w:color="000000" w:sz="4"/>
-              <w:right w:val="single" w:color="000000" w:sz="4"/>
-            </w:tcBorders>
-            <w:tcMar>
-              <w:top w:type="dxa" w:w="40"/>
-              <w:left w:type="dxa" w:w="90"/>
-              <w:bottom w:type="dxa" w:w="40"/>
-              <w:right w:type="dxa" w:w="90"/>
-            </w:tcMar>
-          </w:tcPr>
-          <w:p>
-            <w:pPr>
-              <w:spacing w:after="0" w:before="0"/>
-            </w:pPr>
-            <w:r>
-              <w:rPr>
-                <w:rFonts w:ascii="TH Sarabun New" w:cs="TH Sarabun New" w:eastAsia="TH Sarabun New" w:hAnsi="TH Sarabun New"/>
-                <w:b w:val="false"/>
-                <w:sz w:val="28"/>
-                <w:szCs w:val="28"/>
-                <w:lang w:val="en-US" w:bidi="th-TH"/>
-              </w:rPr>
-              <w:t xml:space="preserve">4,848</w:t>
-            </w:r>
-          </w:p>
-        </w:tc>
-        <w:tc>
-          <w:tcPr>
-            <w:tcW w:type="dxa" w:w="1126"/>
-            <w:tcBorders>
-              <w:top w:val="single" w:color="000000" w:sz="4"/>
-              <w:left w:val="single" w:color="000000" w:sz="4"/>
-              <w:bottom w:val="single" w:color="000000" w:sz="4"/>
-              <w:right w:val="single" w:color="000000" w:sz="4"/>
-            </w:tcBorders>
-            <w:tcMar>
-              <w:top w:type="dxa" w:w="40"/>
-              <w:left w:type="dxa" w:w="90"/>
-              <w:bottom w:type="dxa" w:w="40"/>
-              <w:right w:type="dxa" w:w="90"/>
-            </w:tcMar>
-          </w:tcPr>
-          <w:p>
-            <w:pPr>
-              <w:spacing w:after="0" w:before="0"/>
-            </w:pPr>
-            <w:r>
-              <w:rPr>
-                <w:rFonts w:ascii="TH Sarabun New" w:cs="TH Sarabun New" w:eastAsia="TH Sarabun New" w:hAnsi="TH Sarabun New"/>
-                <w:b w:val="false"/>
-                <w:sz w:val="28"/>
-                <w:szCs w:val="28"/>
-                <w:lang w:val="en-US" w:bidi="th-TH"/>
-              </w:rPr>
-              <w:t xml:space="preserve">0.001</w:t>
+            <w:tcW w:type="dxa" w:w="1200"/>
+            <w:tcBorders>
+              <w:top w:val="single" w:color="000000" w:sz="4"/>
+              <w:left w:val="single" w:color="000000" w:sz="4"/>
+              <w:bottom w:val="single" w:color="000000" w:sz="4"/>
+              <w:right w:val="single" w:color="000000" w:sz="4"/>
+            </w:tcBorders>
+            <w:tcMar>
+              <w:top w:type="dxa" w:w="40"/>
+              <w:left w:type="dxa" w:w="90"/>
+              <w:bottom w:type="dxa" w:w="40"/>
+              <w:right w:type="dxa" w:w="90"/>
+            </w:tcMar>
+          </w:tcPr>
+          <w:p>
+            <w:pPr>
+              <w:spacing w:after="0" w:before="0"/>
+            </w:pPr>
+            <w:r>
+              <w:rPr>
+                <w:rFonts w:ascii="TH Sarabun New" w:cs="TH Sarabun New" w:eastAsia="TH Sarabun New" w:hAnsi="TH Sarabun New"/>
+                <w:b w:val="false"/>
+                <w:sz w:val="28"/>
+                <w:szCs w:val="28"/>
+                <w:lang w:val="en-US" w:bidi="th-TH"/>
+              </w:rPr>
+              <w:t xml:space="preserve">8,216</w:t>
+            </w:r>
+          </w:p>
+        </w:tc>
+        <w:tc>
+          <w:tcPr>
+            <w:tcW w:type="dxa" w:w="1150"/>
+            <w:tcBorders>
+              <w:top w:val="single" w:color="000000" w:sz="4"/>
+              <w:left w:val="single" w:color="000000" w:sz="4"/>
+              <w:bottom w:val="single" w:color="000000" w:sz="4"/>
+              <w:right w:val="single" w:color="000000" w:sz="4"/>
+            </w:tcBorders>
+            <w:tcMar>
+              <w:top w:type="dxa" w:w="40"/>
+              <w:left w:type="dxa" w:w="90"/>
+              <w:bottom w:type="dxa" w:w="40"/>
+              <w:right w:type="dxa" w:w="90"/>
+            </w:tcMar>
+          </w:tcPr>
+          <w:p>
+            <w:pPr>
+              <w:spacing w:after="0" w:before="0"/>
+            </w:pPr>
+            <w:r>
+              <w:rPr>
+                <w:rFonts w:ascii="TH Sarabun New" w:cs="TH Sarabun New" w:eastAsia="TH Sarabun New" w:hAnsi="TH Sarabun New"/>
+                <w:b w:val="false"/>
+                <w:sz w:val="28"/>
+                <w:szCs w:val="28"/>
+                <w:lang w:val="en-US" w:bidi="th-TH"/>
+              </w:rPr>
+              <w:t xml:space="preserve">4,676</w:t>
+            </w:r>
+          </w:p>
+        </w:tc>
+        <w:tc>
+          <w:tcPr>
+            <w:tcW w:type="dxa" w:w="1026"/>
+            <w:tcBorders>
+              <w:top w:val="single" w:color="000000" w:sz="4"/>
+              <w:left w:val="single" w:color="000000" w:sz="4"/>
+              <w:bottom w:val="single" w:color="000000" w:sz="4"/>
+              <w:right w:val="single" w:color="000000" w:sz="4"/>
+            </w:tcBorders>
+            <w:tcMar>
+              <w:top w:type="dxa" w:w="40"/>
+              <w:left w:type="dxa" w:w="90"/>
+              <w:bottom w:type="dxa" w:w="40"/>
+              <w:right w:type="dxa" w:w="90"/>
+            </w:tcMar>
+          </w:tcPr>
+          <w:p>
+            <w:pPr>
+              <w:spacing w:after="0" w:before="0"/>
+            </w:pPr>
+            <w:r>
+              <w:rPr>
+                <w:rFonts w:ascii="TH Sarabun New" w:cs="TH Sarabun New" w:eastAsia="TH Sarabun New" w:hAnsi="TH Sarabun New"/>
+                <w:b w:val="false"/>
+                <w:sz w:val="28"/>
+                <w:szCs w:val="28"/>
+                <w:lang w:val="en-US" w:bidi="th-TH"/>
+              </w:rPr>
+              <w:t xml:space="preserve">0.002</w:t>
             </w:r>
           </w:p>
         </w:tc>
@@ -28949,7 +29325,22 @@
           <w:szCs w:val="32"/>
           <w:lang w:val="en-US" w:bidi="th-TH"/>
         </w:rPr>
-        <w:t xml:space="preserve">ผลรวม​ของ​โหนด​โต๊ะ​คือ 0.274 ต่ำกว่า​ขอบเขต 0.735 มาก และ​ตลอด​การ​ทดสอบ​ไม่​มี​งาน​ใด​พลาด​เส้นตาย เวลา​สูงสุด​ของ​งาน​คุม​แสง (28.5 ms) สู​งก​ว่าที่​ประมาณ​ไว้​ตอน​ออกแบบ (2 ms) เพราะ​เป็นช่วง​ที่​ต้อง​รอ i2c_lock ระหว่าง​ที่​จอ OLED วาด​ทั้ง​หน้าจอ​ประมาณ 40 ms ซึ่ง​ยังอยู่​ใน​กรอบ​รอ​ได้​ไม่​เกิน 50 ms และ​ต่ำกว่า​คาบ 200 ms ของ​งาน</w:t>
+        <w:t xml:space="preserve">ค่า​ของ​โหนด​โต๊ะ​มาจาก​การ​รัน​ต่อเนื่อง 22.8 นาที​ที่​สร้าง​เหตุการณ์​ครบ​ทุก​แบบ ส่วน​โหนด​ห้อง​ใช้​ค่า​ที่สูง​กว่า​ระหว่าง​การ​ทดสอบ​อัตโนมัติ​กับ​การ​รัน​ต่อเนื่อง เวลา​สูงสุด 218 ms ของ​งาน​อ่าน​อากาศ​เกิด​จาก​การ​อ่าน​เซนเซอร์​ครั้งแรก​หลัง​เปิด​เครื่อง​ที่​โปรแกรม​จำลอง​รอ​นาน ซึ่ง​ยัง​ต่ำกว่า​คาบ 5 วินาที​มาก</w:t>
+      </w:r>
+    </w:p>
+    <w:p>
+      <w:pPr>
+        <w:spacing w:after="0" w:before="0"/>
+        <w:ind w:firstLine="709"/>
+      </w:pPr>
+      <w:r>
+        <w:rPr>
+          <w:rFonts w:ascii="TH Sarabun New" w:cs="TH Sarabun New" w:eastAsia="TH Sarabun New" w:hAnsi="TH Sarabun New"/>
+          <w:sz w:val="32"/>
+          <w:szCs w:val="32"/>
+          <w:lang w:val="en-US" w:bidi="th-TH"/>
+        </w:rPr>
+        <w:t xml:space="preserve">งาน​ควบคุม​บน​แกน 1 ของ​โหนด​โต๊ะ​มี​ผลรวม 0.290 ต่ำกว่า​ขอบเขต 0.743 ของ 5 งาน​มาก จึง​ผ่าน​เงื่อนไข​ของ Rate Monotonic Scheduling ส่วน​แกน 0 มี​งาน Wi-Fi และ TCP/IP ของ​ระบบ​ที่​ไม่​ได้​วัด​รวม​อยู่​ด้วย จึง​ไม่​นำ​ค่า 0.005 ของ​งาน​สื่อสาร​ไป​เทียบ​กับ​ขอบเขต​เพียงลำพัง แต่​ตลอด​การ​รัน​ต่อเนื่อง​ไม่​มี​งาน​ใด​บน​ทั้งสอง​แกน​พลาด​เส้นตาย เวลา​สูงสุด​ของ​งาน​คุม​แสง (31.8 ms) สู​งก​ว่าที่​ประมาณ​ไว้​ตอน​ออกแบบ (2 ms) เพราะ​เป็นช่วง​ที่​ต้อง​รอ i2c_lock ระหว่าง​ที่​จอ OLED วาด​ทั้ง​หน้าจอ ซึ่ง​ยังอยู่​ใน​กรอบ​รอ​ได้​ไม่​เกิน 50 ms และ​ต่ำกว่า​คาบ 200 ms ของ​งาน</w:t>
       </w:r>
     </w:p>
     <w:p>
@@ -32637,7 +33028,7 @@
           <w:szCs w:val="32"/>
           <w:lang w:val="en-US" w:bidi="th-TH"/>
         </w:rPr>
-        <w:t xml:space="preserve">PWM ของ​ไฟ พัดลม และ buzzer ใช้​วงจร LEDC ของ ESP32 [33] จึง​ไม่ต้อง​มี task ความถี่​สูง​มา​สลับ​ขา ระบบ​จัด​เป็น​แบบ soft real-time เพราะ​การ​พลาด​รอบ​หนึ่ง​ครั้ง​ทำ​ให้การ​แสดงผล​หรือ​การควบคุม​ช้า​ลง​เล็กน้อย แต่​ไม่​เกิด​อันตราย​ทันที เช่น จอ​ที่​ข้าม​หนึ่ง​เฟรม​จะ​วาด​ใหม่​ใน​รอบ 500 ms ถัดไป ผล​วัด​จริง​ใน​หัวข้อ 5.3 แสดงว่า​โหนด​โต๊ะ​ใช้เวลา​ประมวล​ผลรวม 27.4% และ​ไม่​มี​งาน​ใด​พลาด​เส้นตาย ส่วน​ความหน่วง​ข้าม​โหนด​วัด​ได้​ไม่​เกิน 0.9 วินาที​จาก​ห้อง​ถึง​จอ​บน​โต๊ะ (หัวข้อ 7.2) ซึ่ง​ต่ำกว่า​เกณฑ์ 10 วินาที​มาก</w:t>
+        <w:t xml:space="preserve">PWM ของ​ไฟ พัดลม และ buzzer ใช้​วงจร LEDC ของ ESP32 [33] จึง​ไม่ต้อง​มี task ความถี่​สูง​มา​สลับ​ขา ระบบ​จัด​เป็น​แบบ soft real-time เพราะ​การ​พลาด​รอบ​หนึ่ง​ครั้ง​ทำ​ให้การ​แสดงผล​หรือ​การควบคุม​ช้า​ลง​เล็กน้อย แต่​ไม่​เกิด​อันตราย​ทันที เช่น จอ​ที่​ข้าม​หนึ่ง​เฟรม​จะ​วาด​ใหม่​ใน​รอบ 500 ms ถัดไป ผล​วัด​จริง​ใน​หัวข้อ 5.3 แสดงว่า​งาน​ควบคุม​บน​แกน 1 ของ​โหนด​โต๊ะ​ใช้เวลา​ประมวล​ผลรวม 29.0% ต่ำกว่า​ขอบเขต 74.3% และ​ตลอด​การ​รัน​ต่อเนื่อง 22.8 นาที​ไม่​มี​งาน​ใด​พลาด​เส้นตาย ส่วน​ความหน่วง​ข้าม​โหนด​วัด​ได้​ไม่​เกิน 0.9 วินาที​จาก​ห้อง​ถึง​จอ​บน​โต๊ะ (หัวข้อ 7.2) ซึ่ง​ต่ำกว่า​เกณฑ์ 10 วินาที​มาก</w:t>
       </w:r>
     </w:p>
     <w:p>
@@ -35830,7 +36221,7 @@
           <w:szCs w:val="32"/>
           <w:lang w:val="en-US" w:bidi="th-TH"/>
         </w:rPr>
-        <w:t xml:space="preserve">การ​ทดสอบ​ใช้ Wokwi CLI รุ่น 0.28.1 ร่วมกับ​สคริปต์​ที่​สั่งงาน​ผ่าน Serial ปุ่ม และ​ตัว​เลื่อน​ของ​เซนเซอร์​แบบ​อัตโนมัติ แล้ว​เก็บ log ภาพ​หน้าจอ OLED และ​ไฟล์​สัญญาณ​จาก logic analyzer เป็น​หลักฐาน [38] ชุด​ทดสอบ​โหนด​โต๊ะ​ใช้การ​เร่ง​เวลา 120 เท่า (1 วินาที​ใน​โปรแกรม​เท่ากับ 2 นาที​ของ​ระบบ) ส่วน​ชุด​ทดสอบ​ทั้ง​ระบบ​ใช้​เวลาจริง ผลรวม​คือ​ผ่าน 21 จาก 21 รายการ​ที่​รัน​ได้​อัตโนมัติ ระหว่าง​ทดสอบ​พบ​ข้อผิดพลาด 9 จุด แก้​แล้ว​ทั้งหมด​และ​รัน​ซ้ำ​บน​โค้ด​ที่​แก้​แล้ว</w:t>
+        <w:t xml:space="preserve">การ​ทดสอบ​ใช้ Wokwi CLI รุ่น 0.28.1 ร่วมกับ​สคริปต์​ที่​สั่งงาน​ผ่าน Serial ปุ่ม และ​ตัว​เลื่อน​ของ​เซนเซอร์​แบบ​อัตโนมัติ แล้ว​เก็บ log ภาพ​หน้าจอ OLED และ​ไฟล์​สัญญาณ​จาก logic analyzer เป็น​หลักฐาน [38] ชุด​ทดสอบ​โหนด​โต๊ะ​ใช้การ​เร่ง​เวลา 120 เท่า (1 วินาที​ใน​โปรแกรม​เท่ากับ 2 นาที​ของ​ระบบ) ส่วน​ชุด​ทดสอบ​ทั้ง​ระบบ​ใช้​เวลาจริง ผลรวม​คือ​ผ่าน 21 จาก 21 รายการ​ที่​รัน​ได้​อัตโนมัติ และ​ผ่าน 5 จาก 5 รายการ​ที่​ทดสอบ​ต่อเนื่อง​บน​โปรเจค Wokwi แบบ public (รัน​ต่อเนื่อง นั่ง​จริง 20 นาที วิดีโอ​สถานการณ์​ใช้งาน TC-A-05 และ TC-A-08) ระหว่าง​ทดสอบ​พบ​ข้อผิดพลาด 9 จุด แก้​แล้ว​ทั้งหมด​และ​รัน​ซ้ำ​บน​โค้ด​ที่​แก้​แล้ว</w:t>
       </w:r>
     </w:p>
     <w:p>
@@ -37191,7 +37582,7 @@
                 <w:szCs w:val="28"/>
                 <w:lang w:val="en-US" w:bidi="th-TH"/>
               </w:rPr>
-              <w:t xml:space="preserve">ให้​มี​คน</w:t>
+              <w:t xml:space="preserve">นั่ง​ต่อ​เนื่องใน​ชุด​ทดสอบ​อัตโนมัติ และ​นั่ง​แบบ​เวลาจริง​ไม่​เร่ง​เวลา</w:t>
             </w:r>
           </w:p>
         </w:tc>
@@ -37223,7 +37614,7 @@
                 <w:szCs w:val="28"/>
                 <w:lang w:val="en-US" w:bidi="th-TH"/>
               </w:rPr>
-              <w:t xml:space="preserve">เข้า WORKING หลัง 1.1 วินาที ไฟ​ค่อยๆ สว่าง​ใน 2 วินาที​ที่ 5 kHz</w:t>
+              <w:t xml:space="preserve">เตือน​พักสายตา​ที่ 20 นาที (แบบ​เวลาจริง​ได้ 20 นาที 0.2 วินาที) จอ​ขึ้น​เตือน​และ buzzer 4 kHz ดัง 150 ms</w:t>
             </w:r>
           </w:p>
         </w:tc>
@@ -37324,7 +37715,7 @@
                 <w:szCs w:val="28"/>
                 <w:lang w:val="en-US" w:bidi="th-TH"/>
               </w:rPr>
-              <w:t xml:space="preserve">นั่ง​ต่อเนื่อง</w:t>
+              <w:t xml:space="preserve">นั่ง​ต่อเนื่อง แล้ว​ลุก​ไป​เกิน 3 นาที</w:t>
             </w:r>
           </w:p>
         </w:tc>
@@ -37356,7 +37747,7 @@
                 <w:szCs w:val="28"/>
                 <w:lang w:val="en-US" w:bidi="th-TH"/>
               </w:rPr>
-              <w:t xml:space="preserve">เตือน​พักสายตา​ที่ 20 นาที เตือน​ลุก​ที่ 30 นาที buzzer 4 kHz นาน 150 ms</w:t>
+              <w:t xml:space="preserve">เตือน​ลุก​ที่ 30 นาที ลุก​ไป​ประมาณ 4 นาที​แล้ว​เข้า UNOCCUPIED และ​เวลา​นั่ง​กลับเป็น 0 นาที (เริ่ม​นับ​ใหม่)</w:t>
             </w:r>
           </w:p>
         </w:tc>
@@ -39077,6 +39468,272 @@
                 <w:szCs w:val="28"/>
                 <w:lang w:val="en-US" w:bidi="th-TH"/>
               </w:rPr>
+              <w:t xml:space="preserve">TC-A-05</w:t>
+            </w:r>
+          </w:p>
+        </w:tc>
+        <w:tc>
+          <w:tcPr>
+            <w:tcW w:type="dxa" w:w="2500"/>
+            <w:tcBorders>
+              <w:top w:val="single" w:color="000000" w:sz="4"/>
+              <w:left w:val="single" w:color="000000" w:sz="4"/>
+              <w:bottom w:val="single" w:color="000000" w:sz="4"/>
+              <w:right w:val="single" w:color="000000" w:sz="4"/>
+            </w:tcBorders>
+            <w:tcMar>
+              <w:top w:type="dxa" w:w="40"/>
+              <w:left w:type="dxa" w:w="90"/>
+              <w:bottom w:type="dxa" w:w="40"/>
+              <w:right w:type="dxa" w:w="90"/>
+            </w:tcMar>
+          </w:tcPr>
+          <w:p>
+            <w:pPr>
+              <w:spacing w:after="0" w:before="0"/>
+            </w:pPr>
+            <w:r>
+              <w:rPr>
+                <w:rFonts w:ascii="TH Sarabun New" w:cs="TH Sarabun New" w:eastAsia="TH Sarabun New" w:hAnsi="TH Sarabun New"/>
+                <w:b w:val="false"/>
+                <w:sz w:val="28"/>
+                <w:szCs w:val="28"/>
+                <w:lang w:val="en-US" w:bidi="th-TH"/>
+              </w:rPr>
+              <w:t xml:space="preserve">ตัด Wi-Fi ของ​โต๊ะ 11.2 นา​ทีหลัง​ซิงก์​เวลา​แล้ว</w:t>
+            </w:r>
+          </w:p>
+        </w:tc>
+        <w:tc>
+          <w:tcPr>
+            <w:tcW w:type="dxa" w:w="4050"/>
+            <w:tcBorders>
+              <w:top w:val="single" w:color="000000" w:sz="4"/>
+              <w:left w:val="single" w:color="000000" w:sz="4"/>
+              <w:bottom w:val="single" w:color="000000" w:sz="4"/>
+              <w:right w:val="single" w:color="000000" w:sz="4"/>
+            </w:tcBorders>
+            <w:tcMar>
+              <w:top w:type="dxa" w:w="40"/>
+              <w:left w:type="dxa" w:w="90"/>
+              <w:bottom w:type="dxa" w:w="40"/>
+              <w:right w:type="dxa" w:w="90"/>
+            </w:tcMar>
+          </w:tcPr>
+          <w:p>
+            <w:pPr>
+              <w:spacing w:after="0" w:before="0"/>
+            </w:pPr>
+            <w:r>
+              <w:rPr>
+                <w:rFonts w:ascii="TH Sarabun New" w:cs="TH Sarabun New" w:eastAsia="TH Sarabun New" w:hAnsi="TH Sarabun New"/>
+                <w:b w:val="false"/>
+                <w:sz w:val="28"/>
+                <w:szCs w:val="28"/>
+                <w:lang w:val="en-US" w:bidi="th-TH"/>
+              </w:rPr>
+              <w:t xml:space="preserve">นาฬิกา​ยัง​ถูกต้อง​ตลอด (01:10 ถึง 01:21 ตรง​กับ​เวลา​ที่​ผ่าน​ไป) ต่อ MQTT กลับ​ได้​ใน 3.6 วินาที</w:t>
+            </w:r>
+          </w:p>
+        </w:tc>
+        <w:tc>
+          <w:tcPr>
+            <w:tcW w:type="dxa" w:w="1026"/>
+            <w:tcBorders>
+              <w:top w:val="single" w:color="000000" w:sz="4"/>
+              <w:left w:val="single" w:color="000000" w:sz="4"/>
+              <w:bottom w:val="single" w:color="000000" w:sz="4"/>
+              <w:right w:val="single" w:color="000000" w:sz="4"/>
+            </w:tcBorders>
+            <w:tcMar>
+              <w:top w:type="dxa" w:w="40"/>
+              <w:left w:type="dxa" w:w="90"/>
+              <w:bottom w:type="dxa" w:w="40"/>
+              <w:right w:type="dxa" w:w="90"/>
+            </w:tcMar>
+          </w:tcPr>
+          <w:p>
+            <w:pPr>
+              <w:spacing w:after="0" w:before="0"/>
+            </w:pPr>
+            <w:r>
+              <w:rPr>
+                <w:rFonts w:ascii="TH Sarabun New" w:cs="TH Sarabun New" w:eastAsia="TH Sarabun New" w:hAnsi="TH Sarabun New"/>
+                <w:b w:val="false"/>
+                <w:sz w:val="28"/>
+                <w:szCs w:val="28"/>
+                <w:lang w:val="en-US" w:bidi="th-TH"/>
+              </w:rPr>
+              <w:t xml:space="preserve">ผ่าน</w:t>
+            </w:r>
+          </w:p>
+        </w:tc>
+      </w:tr>
+      <w:tr>
+        <w:trPr>
+          <w:cantSplit/>
+        </w:trPr>
+        <w:tc>
+          <w:tcPr>
+            <w:tcW w:type="dxa" w:w="1450"/>
+            <w:tcBorders>
+              <w:top w:val="single" w:color="000000" w:sz="4"/>
+              <w:left w:val="single" w:color="000000" w:sz="4"/>
+              <w:bottom w:val="single" w:color="000000" w:sz="4"/>
+              <w:right w:val="single" w:color="000000" w:sz="4"/>
+            </w:tcBorders>
+            <w:tcMar>
+              <w:top w:type="dxa" w:w="40"/>
+              <w:left w:type="dxa" w:w="90"/>
+              <w:bottom w:type="dxa" w:w="40"/>
+              <w:right w:type="dxa" w:w="90"/>
+            </w:tcMar>
+          </w:tcPr>
+          <w:p>
+            <w:pPr>
+              <w:spacing w:after="0" w:before="0"/>
+            </w:pPr>
+            <w:r>
+              <w:rPr>
+                <w:rFonts w:ascii="TH Sarabun New" w:cs="TH Sarabun New" w:eastAsia="TH Sarabun New" w:hAnsi="TH Sarabun New"/>
+                <w:b w:val="false"/>
+                <w:sz w:val="28"/>
+                <w:szCs w:val="28"/>
+                <w:lang w:val="en-US" w:bidi="th-TH"/>
+              </w:rPr>
+              <w:t xml:space="preserve">TC-A-08</w:t>
+            </w:r>
+          </w:p>
+        </w:tc>
+        <w:tc>
+          <w:tcPr>
+            <w:tcW w:type="dxa" w:w="2500"/>
+            <w:tcBorders>
+              <w:top w:val="single" w:color="000000" w:sz="4"/>
+              <w:left w:val="single" w:color="000000" w:sz="4"/>
+              <w:bottom w:val="single" w:color="000000" w:sz="4"/>
+              <w:right w:val="single" w:color="000000" w:sz="4"/>
+            </w:tcBorders>
+            <w:tcMar>
+              <w:top w:type="dxa" w:w="40"/>
+              <w:left w:type="dxa" w:w="90"/>
+              <w:bottom w:type="dxa" w:w="40"/>
+              <w:right w:type="dxa" w:w="90"/>
+            </w:tcMar>
+          </w:tcPr>
+          <w:p>
+            <w:pPr>
+              <w:spacing w:after="0" w:before="0"/>
+            </w:pPr>
+            <w:r>
+              <w:rPr>
+                <w:rFonts w:ascii="TH Sarabun New" w:cs="TH Sarabun New" w:eastAsia="TH Sarabun New" w:hAnsi="TH Sarabun New"/>
+                <w:b w:val="false"/>
+                <w:sz w:val="28"/>
+                <w:szCs w:val="28"/>
+                <w:lang w:val="en-US" w:bidi="th-TH"/>
+              </w:rPr>
+              <w:t xml:space="preserve">โต๊ะ​ไม่​มี​คนจน​ตั้ง away_timeout</w:t>
+            </w:r>
+          </w:p>
+        </w:tc>
+        <w:tc>
+          <w:tcPr>
+            <w:tcW w:type="dxa" w:w="4050"/>
+            <w:tcBorders>
+              <w:top w:val="single" w:color="000000" w:sz="4"/>
+              <w:left w:val="single" w:color="000000" w:sz="4"/>
+              <w:bottom w:val="single" w:color="000000" w:sz="4"/>
+              <w:right w:val="single" w:color="000000" w:sz="4"/>
+            </w:tcBorders>
+            <w:tcMar>
+              <w:top w:type="dxa" w:w="40"/>
+              <w:left w:type="dxa" w:w="90"/>
+              <w:bottom w:type="dxa" w:w="40"/>
+              <w:right w:type="dxa" w:w="90"/>
+            </w:tcMar>
+          </w:tcPr>
+          <w:p>
+            <w:pPr>
+              <w:spacing w:after="0" w:before="0"/>
+            </w:pPr>
+            <w:r>
+              <w:rPr>
+                <w:rFonts w:ascii="TH Sarabun New" w:cs="TH Sarabun New" w:eastAsia="TH Sarabun New" w:hAnsi="TH Sarabun New"/>
+                <w:b w:val="false"/>
+                <w:sz w:val="28"/>
+                <w:szCs w:val="28"/>
+                <w:lang w:val="en-US" w:bidi="th-TH"/>
+              </w:rPr>
+              <w:t xml:space="preserve">ไฟ​หรี่​แล้ว​ดับ​ใน 60 วินาที ห้อง​เห็น​รอบ​ส่ง 15 วินาที​และ​ยัง​นับ​โต๊ะ​นี้​ว่า​ออนไลน์</w:t>
+            </w:r>
+          </w:p>
+        </w:tc>
+        <w:tc>
+          <w:tcPr>
+            <w:tcW w:type="dxa" w:w="1026"/>
+            <w:tcBorders>
+              <w:top w:val="single" w:color="000000" w:sz="4"/>
+              <w:left w:val="single" w:color="000000" w:sz="4"/>
+              <w:bottom w:val="single" w:color="000000" w:sz="4"/>
+              <w:right w:val="single" w:color="000000" w:sz="4"/>
+            </w:tcBorders>
+            <w:tcMar>
+              <w:top w:type="dxa" w:w="40"/>
+              <w:left w:type="dxa" w:w="90"/>
+              <w:bottom w:type="dxa" w:w="40"/>
+              <w:right w:type="dxa" w:w="90"/>
+            </w:tcMar>
+          </w:tcPr>
+          <w:p>
+            <w:pPr>
+              <w:spacing w:after="0" w:before="0"/>
+            </w:pPr>
+            <w:r>
+              <w:rPr>
+                <w:rFonts w:ascii="TH Sarabun New" w:cs="TH Sarabun New" w:eastAsia="TH Sarabun New" w:hAnsi="TH Sarabun New"/>
+                <w:b w:val="false"/>
+                <w:sz w:val="28"/>
+                <w:szCs w:val="28"/>
+                <w:lang w:val="en-US" w:bidi="th-TH"/>
+              </w:rPr>
+              <w:t xml:space="preserve">ผ่าน</w:t>
+            </w:r>
+          </w:p>
+        </w:tc>
+      </w:tr>
+      <w:tr>
+        <w:trPr>
+          <w:cantSplit/>
+        </w:trPr>
+        <w:tc>
+          <w:tcPr>
+            <w:tcW w:type="dxa" w:w="1450"/>
+            <w:tcBorders>
+              <w:top w:val="single" w:color="000000" w:sz="4"/>
+              <w:left w:val="single" w:color="000000" w:sz="4"/>
+              <w:bottom w:val="single" w:color="000000" w:sz="4"/>
+              <w:right w:val="single" w:color="000000" w:sz="4"/>
+            </w:tcBorders>
+            <w:tcMar>
+              <w:top w:type="dxa" w:w="40"/>
+              <w:left w:type="dxa" w:w="90"/>
+              <w:bottom w:type="dxa" w:w="40"/>
+              <w:right w:type="dxa" w:w="90"/>
+            </w:tcMar>
+          </w:tcPr>
+          <w:p>
+            <w:pPr>
+              <w:spacing w:after="0" w:before="0"/>
+            </w:pPr>
+            <w:r>
+              <w:rPr>
+                <w:rFonts w:ascii="TH Sarabun New" w:cs="TH Sarabun New" w:eastAsia="TH Sarabun New" w:hAnsi="TH Sarabun New"/>
+                <w:b w:val="false"/>
+                <w:sz w:val="28"/>
+                <w:szCs w:val="28"/>
+                <w:lang w:val="en-US" w:bidi="th-TH"/>
+              </w:rPr>
               <w:t xml:space="preserve">TC-A-06</w:t>
             </w:r>
           </w:p>
@@ -39142,6 +39799,272 @@
                 <w:lang w:val="en-US" w:bidi="th-TH"/>
               </w:rPr>
               <w:t xml:space="preserve">ห้อง​นับ​โต๊ะ​ออนไลน์ 2 โต๊ะ​ที่​มี​คน 1 โดย​ไม่​แก้​โค้ด​โหนด​ห้อง</w:t>
+            </w:r>
+          </w:p>
+        </w:tc>
+        <w:tc>
+          <w:tcPr>
+            <w:tcW w:type="dxa" w:w="1026"/>
+            <w:tcBorders>
+              <w:top w:val="single" w:color="000000" w:sz="4"/>
+              <w:left w:val="single" w:color="000000" w:sz="4"/>
+              <w:bottom w:val="single" w:color="000000" w:sz="4"/>
+              <w:right w:val="single" w:color="000000" w:sz="4"/>
+            </w:tcBorders>
+            <w:tcMar>
+              <w:top w:type="dxa" w:w="40"/>
+              <w:left w:type="dxa" w:w="90"/>
+              <w:bottom w:type="dxa" w:w="40"/>
+              <w:right w:type="dxa" w:w="90"/>
+            </w:tcMar>
+          </w:tcPr>
+          <w:p>
+            <w:pPr>
+              <w:spacing w:after="0" w:before="0"/>
+            </w:pPr>
+            <w:r>
+              <w:rPr>
+                <w:rFonts w:ascii="TH Sarabun New" w:cs="TH Sarabun New" w:eastAsia="TH Sarabun New" w:hAnsi="TH Sarabun New"/>
+                <w:b w:val="false"/>
+                <w:sz w:val="28"/>
+                <w:szCs w:val="28"/>
+                <w:lang w:val="en-US" w:bidi="th-TH"/>
+              </w:rPr>
+              <w:t xml:space="preserve">ผ่าน</w:t>
+            </w:r>
+          </w:p>
+        </w:tc>
+      </w:tr>
+      <w:tr>
+        <w:trPr>
+          <w:cantSplit/>
+        </w:trPr>
+        <w:tc>
+          <w:tcPr>
+            <w:tcW w:type="dxa" w:w="1450"/>
+            <w:tcBorders>
+              <w:top w:val="single" w:color="000000" w:sz="4"/>
+              <w:left w:val="single" w:color="000000" w:sz="4"/>
+              <w:bottom w:val="single" w:color="000000" w:sz="4"/>
+              <w:right w:val="single" w:color="000000" w:sz="4"/>
+            </w:tcBorders>
+            <w:tcMar>
+              <w:top w:type="dxa" w:w="40"/>
+              <w:left w:type="dxa" w:w="90"/>
+              <w:bottom w:type="dxa" w:w="40"/>
+              <w:right w:type="dxa" w:w="90"/>
+            </w:tcMar>
+          </w:tcPr>
+          <w:p>
+            <w:pPr>
+              <w:spacing w:after="0" w:before="0"/>
+            </w:pPr>
+            <w:r>
+              <w:rPr>
+                <w:rFonts w:ascii="TH Sarabun New" w:cs="TH Sarabun New" w:eastAsia="TH Sarabun New" w:hAnsi="TH Sarabun New"/>
+                <w:b w:val="false"/>
+                <w:sz w:val="28"/>
+                <w:szCs w:val="28"/>
+                <w:lang w:val="en-US" w:bidi="th-TH"/>
+              </w:rPr>
+              <w:t xml:space="preserve">TC-A-07</w:t>
+            </w:r>
+          </w:p>
+        </w:tc>
+        <w:tc>
+          <w:tcPr>
+            <w:tcW w:type="dxa" w:w="2500"/>
+            <w:tcBorders>
+              <w:top w:val="single" w:color="000000" w:sz="4"/>
+              <w:left w:val="single" w:color="000000" w:sz="4"/>
+              <w:bottom w:val="single" w:color="000000" w:sz="4"/>
+              <w:right w:val="single" w:color="000000" w:sz="4"/>
+            </w:tcBorders>
+            <w:tcMar>
+              <w:top w:type="dxa" w:w="40"/>
+              <w:left w:type="dxa" w:w="90"/>
+              <w:bottom w:type="dxa" w:w="40"/>
+              <w:right w:type="dxa" w:w="90"/>
+            </w:tcMar>
+          </w:tcPr>
+          <w:p>
+            <w:pPr>
+              <w:spacing w:after="0" w:before="0"/>
+            </w:pPr>
+            <w:r>
+              <w:rPr>
+                <w:rFonts w:ascii="TH Sarabun New" w:cs="TH Sarabun New" w:eastAsia="TH Sarabun New" w:hAnsi="TH Sarabun New"/>
+                <w:b w:val="false"/>
+                <w:sz w:val="28"/>
+                <w:szCs w:val="28"/>
+                <w:lang w:val="en-US" w:bidi="th-TH"/>
+              </w:rPr>
+              <w:t xml:space="preserve">รัน​ต่อเนื่อง 22.8 นาที (โต๊ะ) และ 10.5 นาที (ห้อง) พร้อม​สร้าง​เหตุการณ์​ต่างๆ</w:t>
+            </w:r>
+          </w:p>
+        </w:tc>
+        <w:tc>
+          <w:tcPr>
+            <w:tcW w:type="dxa" w:w="4050"/>
+            <w:tcBorders>
+              <w:top w:val="single" w:color="000000" w:sz="4"/>
+              <w:left w:val="single" w:color="000000" w:sz="4"/>
+              <w:bottom w:val="single" w:color="000000" w:sz="4"/>
+              <w:right w:val="single" w:color="000000" w:sz="4"/>
+            </w:tcBorders>
+            <w:tcMar>
+              <w:top w:type="dxa" w:w="40"/>
+              <w:left w:type="dxa" w:w="90"/>
+              <w:bottom w:type="dxa" w:w="40"/>
+              <w:right w:type="dxa" w:w="90"/>
+            </w:tcMar>
+          </w:tcPr>
+          <w:p>
+            <w:pPr>
+              <w:spacing w:after="0" w:before="0"/>
+            </w:pPr>
+            <w:r>
+              <w:rPr>
+                <w:rFonts w:ascii="TH Sarabun New" w:cs="TH Sarabun New" w:eastAsia="TH Sarabun New" w:hAnsi="TH Sarabun New"/>
+                <w:b w:val="false"/>
+                <w:sz w:val="28"/>
+                <w:szCs w:val="28"/>
+                <w:lang w:val="en-US" w:bidi="th-TH"/>
+              </w:rPr>
+              <w:t xml:space="preserve">ไม่​มี reset ไม่​มี​งาน​ใด​พลาด​เส้นตาย หน่วยความจำ​ว่าง​ต่ำสุด 174 kB</w:t>
+            </w:r>
+          </w:p>
+        </w:tc>
+        <w:tc>
+          <w:tcPr>
+            <w:tcW w:type="dxa" w:w="1026"/>
+            <w:tcBorders>
+              <w:top w:val="single" w:color="000000" w:sz="4"/>
+              <w:left w:val="single" w:color="000000" w:sz="4"/>
+              <w:bottom w:val="single" w:color="000000" w:sz="4"/>
+              <w:right w:val="single" w:color="000000" w:sz="4"/>
+            </w:tcBorders>
+            <w:tcMar>
+              <w:top w:type="dxa" w:w="40"/>
+              <w:left w:type="dxa" w:w="90"/>
+              <w:bottom w:type="dxa" w:w="40"/>
+              <w:right w:type="dxa" w:w="90"/>
+            </w:tcMar>
+          </w:tcPr>
+          <w:p>
+            <w:pPr>
+              <w:spacing w:after="0" w:before="0"/>
+            </w:pPr>
+            <w:r>
+              <w:rPr>
+                <w:rFonts w:ascii="TH Sarabun New" w:cs="TH Sarabun New" w:eastAsia="TH Sarabun New" w:hAnsi="TH Sarabun New"/>
+                <w:b w:val="false"/>
+                <w:sz w:val="28"/>
+                <w:szCs w:val="28"/>
+                <w:lang w:val="en-US" w:bidi="th-TH"/>
+              </w:rPr>
+              <w:t xml:space="preserve">ผ่าน</w:t>
+            </w:r>
+          </w:p>
+        </w:tc>
+      </w:tr>
+      <w:tr>
+        <w:trPr>
+          <w:cantSplit/>
+        </w:trPr>
+        <w:tc>
+          <w:tcPr>
+            <w:tcW w:type="dxa" w:w="1450"/>
+            <w:tcBorders>
+              <w:top w:val="single" w:color="000000" w:sz="4"/>
+              <w:left w:val="single" w:color="000000" w:sz="4"/>
+              <w:bottom w:val="single" w:color="000000" w:sz="4"/>
+              <w:right w:val="single" w:color="000000" w:sz="4"/>
+            </w:tcBorders>
+            <w:tcMar>
+              <w:top w:type="dxa" w:w="40"/>
+              <w:left w:type="dxa" w:w="90"/>
+              <w:bottom w:type="dxa" w:w="40"/>
+              <w:right w:type="dxa" w:w="90"/>
+            </w:tcMar>
+          </w:tcPr>
+          <w:p>
+            <w:pPr>
+              <w:spacing w:after="0" w:before="0"/>
+            </w:pPr>
+            <w:r>
+              <w:rPr>
+                <w:rFonts w:ascii="TH Sarabun New" w:cs="TH Sarabun New" w:eastAsia="TH Sarabun New" w:hAnsi="TH Sarabun New"/>
+                <w:b w:val="false"/>
+                <w:sz w:val="28"/>
+                <w:szCs w:val="28"/>
+                <w:lang w:val="en-US" w:bidi="th-TH"/>
+              </w:rPr>
+              <w:t xml:space="preserve">สถานการณ์​ใช้งาน</w:t>
+            </w:r>
+          </w:p>
+        </w:tc>
+        <w:tc>
+          <w:tcPr>
+            <w:tcW w:type="dxa" w:w="2500"/>
+            <w:tcBorders>
+              <w:top w:val="single" w:color="000000" w:sz="4"/>
+              <w:left w:val="single" w:color="000000" w:sz="4"/>
+              <w:bottom w:val="single" w:color="000000" w:sz="4"/>
+              <w:right w:val="single" w:color="000000" w:sz="4"/>
+            </w:tcBorders>
+            <w:tcMar>
+              <w:top w:type="dxa" w:w="40"/>
+              <w:left w:type="dxa" w:w="90"/>
+              <w:bottom w:type="dxa" w:w="40"/>
+              <w:right w:type="dxa" w:w="90"/>
+            </w:tcMar>
+          </w:tcPr>
+          <w:p>
+            <w:pPr>
+              <w:spacing w:after="0" w:before="0"/>
+            </w:pPr>
+            <w:r>
+              <w:rPr>
+                <w:rFonts w:ascii="TH Sarabun New" w:cs="TH Sarabun New" w:eastAsia="TH Sarabun New" w:hAnsi="TH Sarabun New"/>
+                <w:b w:val="false"/>
+                <w:sz w:val="28"/>
+                <w:szCs w:val="28"/>
+                <w:lang w:val="en-US" w:bidi="th-TH"/>
+              </w:rPr>
+              <w:t xml:space="preserve">รัน​สอง​โหนด​พร้อมกัน​ตั้งแต่​นั่ง​จน​ลุก​ไป (วิดีโอ 1 นาที 42 วินาที)</w:t>
+            </w:r>
+          </w:p>
+        </w:tc>
+        <w:tc>
+          <w:tcPr>
+            <w:tcW w:type="dxa" w:w="4050"/>
+            <w:tcBorders>
+              <w:top w:val="single" w:color="000000" w:sz="4"/>
+              <w:left w:val="single" w:color="000000" w:sz="4"/>
+              <w:bottom w:val="single" w:color="000000" w:sz="4"/>
+              <w:right w:val="single" w:color="000000" w:sz="4"/>
+            </w:tcBorders>
+            <w:tcMar>
+              <w:top w:type="dxa" w:w="40"/>
+              <w:left w:type="dxa" w:w="90"/>
+              <w:bottom w:type="dxa" w:w="40"/>
+              <w:right w:type="dxa" w:w="90"/>
+            </w:tcMar>
+          </w:tcPr>
+          <w:p>
+            <w:pPr>
+              <w:spacing w:after="0" w:before="0"/>
+            </w:pPr>
+            <w:r>
+              <w:rPr>
+                <w:rFonts w:ascii="TH Sarabun New" w:cs="TH Sarabun New" w:eastAsia="TH Sarabun New" w:hAnsi="TH Sarabun New"/>
+                <w:b w:val="false"/>
+                <w:sz w:val="28"/>
+                <w:szCs w:val="28"/>
+                <w:lang w:val="en-US" w:bidi="th-TH"/>
+              </w:rPr>
+              <w:t xml:space="preserve">เตือน​พัก CO₂ สูง​แล้ว​พัดลม 100% เลื่อน​เตือน​ได้ ลุก​ไป​แล้ว​ไฟ​หรี่​และ​ห้อง​เข้า ROOM_EMPTY ตามลำดับ</w:t>
             </w:r>
           </w:p>
         </w:tc>
@@ -39252,7 +40175,7 @@
           <w:szCs w:val="32"/>
           <w:lang w:val="en-US" w:bidi="th-TH"/>
         </w:rPr>
-        <w:t xml:space="preserve">2) กรณี​ที่​ยัง​ไม่​ได้​ยืนยัน​ด้วย​การ​ทดสอบ​อัตโนมัติ ได้แก่ TC-C-07 (แสดง​ความชื้น), TC-D-05 (สี​แสง​ก่อน​รู้​เวลา), TC-A-05 (ซิงก์ NTP) และ TC-A-08 (กระแสไฟ ซึ่ง Wokwi วัด​ไม่​ได้) ส่วน TC-A-07 ยืนยัน​ทางอ้อม​จาก​สถิติ​ที่​ไม่​มี​งาน​ใด​พลาด​เส้นตาย</w:t>
+        <w:t xml:space="preserve">2) กรณี​ที่​ยัง​ไม่​มีผล​จาก​การ​ทดสอบ ได้แก่ TC-C-07 (แสดง​ความชื้น) และ TC-D-05 (สี​แสง​ก่อน​รู้​เวลา) ส่วน TC-A-08 ยืนยัน​ได้​เฉพาะ​พฤติกรรม เพราะ Wokwi วัด​กระแสไฟ​ไม่​ได้</w:t>
       </w:r>
     </w:p>
     <w:p>
@@ -39267,7 +40190,7 @@
           <w:szCs w:val="32"/>
           <w:lang w:val="en-US" w:bidi="th-TH"/>
         </w:rPr>
-        <w:t xml:space="preserve">3) งาน​ที่​ยัง​ต้อง​ทดสอบ​ด้วยมือ ได้แก่ วิดีโอ​สถานการณ์​ใช้งาน 2 ถึง 3 นาที การ​รัน​ต่อเนื่อง 10 นาที​เพื่อ​เก็บ​สถิติ​เวลา และ​การ​นั่ง​จริง 20 นาที​โดย​ไม่​เร่ง​เวลา</w:t>
+        <w:t xml:space="preserve">3) การ​รัน​ต่อเนื่อง​ทำ​บน​โปรเจค Wokwi แบบ public ใน​เบราว์เซอร์ ระหว่าง​รัน​ได้​สร้าง​เหตุการณ์​ทั้ง CO₂ ขึ้น​ลง​หลาย​ระดับ เซนเซอร์​อากาศ​และ​เซนเซอร์​แสง​เสียแล้ว​กลับมา อุณหภูมิ​สูง​และ​ต่ำ​เกิน Wi-Fi ของ​โต๊ะ​หลุด 39 วินาที​แล้ว​ต่อ​กลับ และ​ตั้งเวลา​ให้สี​แสง​เปลี่ยน เบราว์เซอร์​หยุด​แท็บ​ที่​ไม่​ได้​แสดง จึง​รัน​สอง​โหนด​สลับ​กัน​เป็นช่วง ช่วง​ที่​โหนด​ห้อง​หยุด โต๊ะ​แสดงว่า​ลิงก์​ขาด​ตามที่​ออกแบบ​ไว้</w:t>
       </w:r>
     </w:p>
     <w:p>
@@ -39282,7 +40205,22 @@
           <w:szCs w:val="32"/>
           <w:lang w:val="en-US" w:bidi="th-TH"/>
         </w:rPr>
-        <w:t xml:space="preserve">4) ข้อสังเกต​ที่​ส่ง​ให้​เจ้าของ​โมดูล​พิจารณา ได้แก่ หลัง​เรดาร์​กลับ​มาจาก​สถานะ​เสีย ระบบ​เริ่ม​นับ​เวลา​นั่ง​ใหม่ งาน​รับ​ปุ่ม​เหลือ stack น้อยที่สุด (876 ไบต์) และ​การ​อ่าน DHT22 ครั้งแรก​หลัง​เปิด​เครื่อง​ได้​ค่า​ว่าง 1 ครั้ง</w:t>
+        <w:t xml:space="preserve">4) ก่อน​เริ่ม​ชุด​ทดสอบ​โหนด​โต๊ะ ระบบ​เข้า WORKING หลัง​มี​คน 1.1 วินาที (ต้อง​พบ​คน​ต่อเนื่อง 1 วินาที) และ​ไฟ​ค่อยๆ สว่าง​ใน 2 วินาที​ที่ 5 kHz ตรง​ตาม FR-01</w:t>
+      </w:r>
+    </w:p>
+    <w:p>
+      <w:pPr>
+        <w:spacing w:after="0" w:before="0"/>
+        <w:ind w:left="709"/>
+      </w:pPr>
+      <w:r>
+        <w:rPr>
+          <w:rFonts w:ascii="TH Sarabun New" w:cs="TH Sarabun New" w:eastAsia="TH Sarabun New" w:hAnsi="TH Sarabun New"/>
+          <w:sz w:val="32"/>
+          <w:szCs w:val="32"/>
+          <w:lang w:val="en-US" w:bidi="th-TH"/>
+        </w:rPr>
+        <w:t xml:space="preserve">5) ข้อสังเกต​ที่​ส่ง​ให้​เจ้าของ​โมดูล​พิจารณา​ได้​ข้อสรุป​แล้ว ได้แก่ การ​เริ่ม​นับ​เวลา​นั่ง​ใหม่​หลัง​เรดาร์​กลับ​มาจาก​สถานะ​เสีย​เป็น​พฤติกรรม​ที่​ตั้งใจ และ​เพิ่ม stack ของ​งาน​รับ​ปุ่ม​เป็น 3,072 ไบต์ ซึ่ง​ใน​การ​รัน​ต่อเนื่อง​เหลือ​อย่าง​น้อย 2,196 ไบต์ ส่วน​การ​อ่าน DHT22 ครั้งแรก​หลัง​เปิด​เครื่อง​ได้​ค่า​ว่าง 1 ครั้ง​ยัง​คงอยู่ และ​มีผล​เฉพาะ​ใน​การจำลอง</w:t>
       </w:r>
     </w:p>
     <w:p>
@@ -42190,22 +43128,7 @@
           <w:szCs w:val="32"/>
           <w:lang w:val="en-US" w:bidi="th-TH"/>
         </w:rPr>
-        <w:t xml:space="preserve">3) กรณี​ทดสอบ TC-C-07, TC-D-05 และ TC-A-05 ยัง​ไม่​มีผล​จาก​การ​ทดสอบ​อัตโนมัติ</w:t>
-      </w:r>
-    </w:p>
-    <w:p>
-      <w:pPr>
-        <w:spacing w:after="0" w:before="0"/>
-        <w:ind w:left="709"/>
-      </w:pPr>
-      <w:r>
-        <w:rPr>
-          <w:rFonts w:ascii="TH Sarabun New" w:cs="TH Sarabun New" w:eastAsia="TH Sarabun New" w:hAnsi="TH Sarabun New"/>
-          <w:sz w:val="32"/>
-          <w:szCs w:val="32"/>
-          <w:lang w:val="en-US" w:bidi="th-TH"/>
-        </w:rPr>
-        <w:t xml:space="preserve">4) การ​ทดสอบ​ด้วยมือ 3 รายการ​ยัง​ไม่​เสร็จ ได้แก่ วิดีโอ​สถานการณ์​ใช้งาน การ​รัน​ต่อเนื่อง 10 นาที​เพื่อ​เก็บ​สถิติ​เวลา และ​การ​นั่ง​จริง 20 นาที​โดย​ไม่​เร่ง​เวลา</w:t>
+        <w:t xml:space="preserve">3) กรณี​ทดสอบ TC-C-07 (แสดง​ความชื้น) และ TC-D-05 (สี​แสง​ก่อน​รู้​เวลา) ยัง​ไม่​มีผล​จาก​การ​ทดสอบ</w:t>
       </w:r>
     </w:p>
     <w:p>
@@ -45005,6 +45928,34 @@
     </w:p>
     <w:p>
       <w:pPr>
+        <w:spacing w:after="0" w:before="0"/>
+      </w:pPr>
+      <w:r>
+        <w:rPr>
+          <w:rFonts w:ascii="TH Sarabun New" w:cs="TH Sarabun New" w:eastAsia="TH Sarabun New" w:hAnsi="TH Sarabun New"/>
+          <w:sz w:val="32"/>
+          <w:szCs w:val="32"/>
+          <w:lang w:val="en-US" w:bidi="th-TH"/>
+        </w:rPr>
+        <w:t xml:space="preserve">โปรเจค Wokwi โหนด​ห้อง: https://wokwi.com/projects/477874423842942977</w:t>
+      </w:r>
+    </w:p>
+    <w:p>
+      <w:pPr>
+        <w:spacing w:after="0" w:before="0"/>
+      </w:pPr>
+      <w:r>
+        <w:rPr>
+          <w:rFonts w:ascii="TH Sarabun New" w:cs="TH Sarabun New" w:eastAsia="TH Sarabun New" w:hAnsi="TH Sarabun New"/>
+          <w:sz w:val="32"/>
+          <w:szCs w:val="32"/>
+          <w:lang w:val="en-US" w:bidi="th-TH"/>
+        </w:rPr>
+        <w:t xml:space="preserve">โปรเจค Wokwi โหนด​โต๊ะ: https://wokwi.com/projects/477874597473570817</w:t>
+      </w:r>
+    </w:p>
+    <w:p>
+      <w:pPr>
         <w:keepNext/>
         <w:spacing w:after="40" w:before="120"/>
         <w:jc w:val="left"/>
@@ -45518,7 +46469,7 @@
                 <w:szCs w:val="28"/>
                 <w:lang w:val="en-US" w:bidi="th-TH"/>
               </w:rPr>
-              <w:t xml:space="preserve">หลักฐาน​การ​ทดสอบ ได้แก่ log ภาพ​หน้าจอ และ​สัญญาณ​จาก logic analyzer</w:t>
+              <w:t xml:space="preserve">หลักฐาน​การ​ทดสอบ ได้แก่ log ภาพ​หน้าจอ สัญญาณ​จาก logic analyzer และ​วิดีโอ​สถานการณ์​ใช้งาน</w:t>
             </w:r>
           </w:p>
         </w:tc>

</xml_diff>

<commit_message>
docs(D5): complete table 7.2 results and DHT22 start-up note in C-N
</commit_message>
<xml_diff>
--- a/10_final/D5_design_document.docx
+++ b/10_final/D5_design_document.docx
@@ -208,7 +208,7 @@
           <w:szCs w:val="26"/>
           <w:lang w:val="en-US" w:bidi="th-TH"/>
         </w:rPr>
-        <w:t xml:space="preserve">ฉบับร่างสำหรับตรวจ (อัปเดต 15 ต.ค. 2569)</w:t>
+        <w:t xml:space="preserve">15 ตุลาคม 2569</w:t>
       </w:r>
     </w:p>
     <w:p>
@@ -37329,6 +37329,139 @@
           </w:p>
         </w:tc>
       </w:tr>
+      <w:tr>
+        <w:trPr>
+          <w:cantSplit/>
+        </w:trPr>
+        <w:tc>
+          <w:tcPr>
+            <w:tcW w:type="dxa" w:w="1450"/>
+            <w:tcBorders>
+              <w:top w:val="single" w:color="000000" w:sz="4"/>
+              <w:left w:val="single" w:color="000000" w:sz="4"/>
+              <w:bottom w:val="single" w:color="000000" w:sz="4"/>
+              <w:right w:val="single" w:color="000000" w:sz="4"/>
+            </w:tcBorders>
+            <w:tcMar>
+              <w:top w:type="dxa" w:w="40"/>
+              <w:left w:type="dxa" w:w="90"/>
+              <w:bottom w:type="dxa" w:w="40"/>
+              <w:right w:type="dxa" w:w="90"/>
+            </w:tcMar>
+          </w:tcPr>
+          <w:p>
+            <w:pPr>
+              <w:spacing w:after="0" w:before="0"/>
+            </w:pPr>
+            <w:r>
+              <w:rPr>
+                <w:rFonts w:ascii="TH Sarabun New" w:cs="TH Sarabun New" w:eastAsia="TH Sarabun New" w:hAnsi="TH Sarabun New"/>
+                <w:b w:val="false"/>
+                <w:sz w:val="28"/>
+                <w:szCs w:val="28"/>
+                <w:lang w:val="en-US" w:bidi="th-TH"/>
+              </w:rPr>
+              <w:t xml:space="preserve">TC-C-07</w:t>
+            </w:r>
+          </w:p>
+        </w:tc>
+        <w:tc>
+          <w:tcPr>
+            <w:tcW w:type="dxa" w:w="2750"/>
+            <w:tcBorders>
+              <w:top w:val="single" w:color="000000" w:sz="4"/>
+              <w:left w:val="single" w:color="000000" w:sz="4"/>
+              <w:bottom w:val="single" w:color="000000" w:sz="4"/>
+              <w:right w:val="single" w:color="000000" w:sz="4"/>
+            </w:tcBorders>
+            <w:tcMar>
+              <w:top w:type="dxa" w:w="40"/>
+              <w:left w:type="dxa" w:w="90"/>
+              <w:bottom w:type="dxa" w:w="40"/>
+              <w:right w:type="dxa" w:w="90"/>
+            </w:tcMar>
+          </w:tcPr>
+          <w:p>
+            <w:pPr>
+              <w:spacing w:after="0" w:before="0"/>
+            </w:pPr>
+            <w:r>
+              <w:rPr>
+                <w:rFonts w:ascii="TH Sarabun New" w:cs="TH Sarabun New" w:eastAsia="TH Sarabun New" w:hAnsi="TH Sarabun New"/>
+                <w:b w:val="false"/>
+                <w:sz w:val="28"/>
+                <w:szCs w:val="28"/>
+                <w:lang w:val="en-US" w:bidi="th-TH"/>
+              </w:rPr>
+              <w:t xml:space="preserve">อ่านความชื้นจากเซนเซอร์</w:t>
+            </w:r>
+          </w:p>
+        </w:tc>
+        <w:tc>
+          <w:tcPr>
+            <w:tcW w:type="dxa" w:w="3800"/>
+            <w:tcBorders>
+              <w:top w:val="single" w:color="000000" w:sz="4"/>
+              <w:left w:val="single" w:color="000000" w:sz="4"/>
+              <w:bottom w:val="single" w:color="000000" w:sz="4"/>
+              <w:right w:val="single" w:color="000000" w:sz="4"/>
+            </w:tcBorders>
+            <w:tcMar>
+              <w:top w:type="dxa" w:w="40"/>
+              <w:left w:type="dxa" w:w="90"/>
+              <w:bottom w:type="dxa" w:w="40"/>
+              <w:right w:type="dxa" w:w="90"/>
+            </w:tcMar>
+          </w:tcPr>
+          <w:p>
+            <w:pPr>
+              <w:spacing w:after="0" w:before="0"/>
+            </w:pPr>
+            <w:r>
+              <w:rPr>
+                <w:rFonts w:ascii="TH Sarabun New" w:cs="TH Sarabun New" w:eastAsia="TH Sarabun New" w:hAnsi="TH Sarabun New"/>
+                <w:b w:val="false"/>
+                <w:sz w:val="28"/>
+                <w:szCs w:val="28"/>
+                <w:lang w:val="en-US" w:bidi="th-TH"/>
+              </w:rPr>
+              <w:t xml:space="preserve">ห้องได้ความชื้น 55 % ตรงกับเซนเซอร์ และโต๊ะได้ค่าเดียวกันผ่าน MQTT ไม่มีการเตือนจากความชื้น</w:t>
+            </w:r>
+          </w:p>
+        </w:tc>
+        <w:tc>
+          <w:tcPr>
+            <w:tcW w:type="dxa" w:w="1026"/>
+            <w:tcBorders>
+              <w:top w:val="single" w:color="000000" w:sz="4"/>
+              <w:left w:val="single" w:color="000000" w:sz="4"/>
+              <w:bottom w:val="single" w:color="000000" w:sz="4"/>
+              <w:right w:val="single" w:color="000000" w:sz="4"/>
+            </w:tcBorders>
+            <w:tcMar>
+              <w:top w:type="dxa" w:w="40"/>
+              <w:left w:type="dxa" w:w="90"/>
+              <w:bottom w:type="dxa" w:w="40"/>
+              <w:right w:type="dxa" w:w="90"/>
+            </w:tcMar>
+          </w:tcPr>
+          <w:p>
+            <w:pPr>
+              <w:spacing w:after="0" w:before="0"/>
+            </w:pPr>
+            <w:r>
+              <w:rPr>
+                <w:rFonts w:ascii="TH Sarabun New" w:cs="TH Sarabun New" w:eastAsia="TH Sarabun New" w:hAnsi="TH Sarabun New"/>
+                <w:b w:val="false"/>
+                <w:sz w:val="28"/>
+                <w:szCs w:val="28"/>
+                <w:lang w:val="en-US" w:bidi="th-TH"/>
+              </w:rPr>
+              <w:t xml:space="preserve">ผ่าน</w:t>
+            </w:r>
+          </w:p>
+        </w:tc>
+      </w:tr>
     </w:tbl>
     <w:p>
       <w:pPr>
@@ -38481,7 +38614,7 @@
                 <w:szCs w:val="28"/>
                 <w:lang w:val="en-US" w:bidi="th-TH"/>
               </w:rPr>
-              <w:t xml:space="preserve">TC-D-06</w:t>
+              <w:t xml:space="preserve">TC-D-05</w:t>
             </w:r>
           </w:p>
         </w:tc>
@@ -38513,7 +38646,7 @@
                 <w:szCs w:val="28"/>
                 <w:lang w:val="en-US" w:bidi="th-TH"/>
               </w:rPr>
-              <w:t xml:space="preserve">จำลอง​เซนเซอร์​แสง​เสีย</w:t>
+              <w:t xml:space="preserve">มีคนนั่งก่อนเครื่องรู้เวลาจริง แล้วได้เวลา</w:t>
             </w:r>
           </w:p>
         </w:tc>
@@ -38545,7 +38678,7 @@
                 <w:szCs w:val="28"/>
                 <w:lang w:val="en-US" w:bidi="th-TH"/>
               </w:rPr>
-              <w:t xml:space="preserve">ครบ 3 รอบ (0.49 วินาที) เข้า SENSOR_FAULT ไฟ 60% จอ​ขึ้น​เตือน กลับ​ปกติ​หลัง​อ่าน​ได้ 2 รอบ</w:t>
+              <w:t xml:space="preserve">ก่อนรู้เวลาใช้สีกลาง r = 0.50 และยังคุมความสว่างได้ หลังได้เวลา r ค่อยๆ เปลี่ยนตามตารางเวลา ไม่กระโดด</w:t>
             </w:r>
           </w:p>
         </w:tc>
@@ -38614,6 +38747,139 @@
                 <w:szCs w:val="28"/>
                 <w:lang w:val="en-US" w:bidi="th-TH"/>
               </w:rPr>
+              <w:t xml:space="preserve">TC-D-06</w:t>
+            </w:r>
+          </w:p>
+        </w:tc>
+        <w:tc>
+          <w:tcPr>
+            <w:tcW w:type="dxa" w:w="2500"/>
+            <w:tcBorders>
+              <w:top w:val="single" w:color="000000" w:sz="4"/>
+              <w:left w:val="single" w:color="000000" w:sz="4"/>
+              <w:bottom w:val="single" w:color="000000" w:sz="4"/>
+              <w:right w:val="single" w:color="000000" w:sz="4"/>
+            </w:tcBorders>
+            <w:tcMar>
+              <w:top w:type="dxa" w:w="40"/>
+              <w:left w:type="dxa" w:w="90"/>
+              <w:bottom w:type="dxa" w:w="40"/>
+              <w:right w:type="dxa" w:w="90"/>
+            </w:tcMar>
+          </w:tcPr>
+          <w:p>
+            <w:pPr>
+              <w:spacing w:after="0" w:before="0"/>
+            </w:pPr>
+            <w:r>
+              <w:rPr>
+                <w:rFonts w:ascii="TH Sarabun New" w:cs="TH Sarabun New" w:eastAsia="TH Sarabun New" w:hAnsi="TH Sarabun New"/>
+                <w:b w:val="false"/>
+                <w:sz w:val="28"/>
+                <w:szCs w:val="28"/>
+                <w:lang w:val="en-US" w:bidi="th-TH"/>
+              </w:rPr>
+              <w:t xml:space="preserve">จำลอง​เซนเซอร์​แสง​เสีย</w:t>
+            </w:r>
+          </w:p>
+        </w:tc>
+        <w:tc>
+          <w:tcPr>
+            <w:tcW w:type="dxa" w:w="4050"/>
+            <w:tcBorders>
+              <w:top w:val="single" w:color="000000" w:sz="4"/>
+              <w:left w:val="single" w:color="000000" w:sz="4"/>
+              <w:bottom w:val="single" w:color="000000" w:sz="4"/>
+              <w:right w:val="single" w:color="000000" w:sz="4"/>
+            </w:tcBorders>
+            <w:tcMar>
+              <w:top w:type="dxa" w:w="40"/>
+              <w:left w:type="dxa" w:w="90"/>
+              <w:bottom w:type="dxa" w:w="40"/>
+              <w:right w:type="dxa" w:w="90"/>
+            </w:tcMar>
+          </w:tcPr>
+          <w:p>
+            <w:pPr>
+              <w:spacing w:after="0" w:before="0"/>
+            </w:pPr>
+            <w:r>
+              <w:rPr>
+                <w:rFonts w:ascii="TH Sarabun New" w:cs="TH Sarabun New" w:eastAsia="TH Sarabun New" w:hAnsi="TH Sarabun New"/>
+                <w:b w:val="false"/>
+                <w:sz w:val="28"/>
+                <w:szCs w:val="28"/>
+                <w:lang w:val="en-US" w:bidi="th-TH"/>
+              </w:rPr>
+              <w:t xml:space="preserve">ครบ 3 รอบ (0.49 วินาที) เข้า SENSOR_FAULT ไฟ 60% จอ​ขึ้น​เตือน กลับ​ปกติ​หลัง​อ่าน​ได้ 2 รอบ</w:t>
+            </w:r>
+          </w:p>
+        </w:tc>
+        <w:tc>
+          <w:tcPr>
+            <w:tcW w:type="dxa" w:w="1026"/>
+            <w:tcBorders>
+              <w:top w:val="single" w:color="000000" w:sz="4"/>
+              <w:left w:val="single" w:color="000000" w:sz="4"/>
+              <w:bottom w:val="single" w:color="000000" w:sz="4"/>
+              <w:right w:val="single" w:color="000000" w:sz="4"/>
+            </w:tcBorders>
+            <w:tcMar>
+              <w:top w:type="dxa" w:w="40"/>
+              <w:left w:type="dxa" w:w="90"/>
+              <w:bottom w:type="dxa" w:w="40"/>
+              <w:right w:type="dxa" w:w="90"/>
+            </w:tcMar>
+          </w:tcPr>
+          <w:p>
+            <w:pPr>
+              <w:spacing w:after="0" w:before="0"/>
+            </w:pPr>
+            <w:r>
+              <w:rPr>
+                <w:rFonts w:ascii="TH Sarabun New" w:cs="TH Sarabun New" w:eastAsia="TH Sarabun New" w:hAnsi="TH Sarabun New"/>
+                <w:b w:val="false"/>
+                <w:sz w:val="28"/>
+                <w:szCs w:val="28"/>
+                <w:lang w:val="en-US" w:bidi="th-TH"/>
+              </w:rPr>
+              <w:t xml:space="preserve">ผ่าน</w:t>
+            </w:r>
+          </w:p>
+        </w:tc>
+      </w:tr>
+      <w:tr>
+        <w:trPr>
+          <w:cantSplit/>
+        </w:trPr>
+        <w:tc>
+          <w:tcPr>
+            <w:tcW w:type="dxa" w:w="1450"/>
+            <w:tcBorders>
+              <w:top w:val="single" w:color="000000" w:sz="4"/>
+              <w:left w:val="single" w:color="000000" w:sz="4"/>
+              <w:bottom w:val="single" w:color="000000" w:sz="4"/>
+              <w:right w:val="single" w:color="000000" w:sz="4"/>
+            </w:tcBorders>
+            <w:tcMar>
+              <w:top w:type="dxa" w:w="40"/>
+              <w:left w:type="dxa" w:w="90"/>
+              <w:bottom w:type="dxa" w:w="40"/>
+              <w:right w:type="dxa" w:w="90"/>
+            </w:tcMar>
+          </w:tcPr>
+          <w:p>
+            <w:pPr>
+              <w:spacing w:after="0" w:before="0"/>
+            </w:pPr>
+            <w:r>
+              <w:rPr>
+                <w:rFonts w:ascii="TH Sarabun New" w:cs="TH Sarabun New" w:eastAsia="TH Sarabun New" w:hAnsi="TH Sarabun New"/>
+                <w:b w:val="false"/>
+                <w:sz w:val="28"/>
+                <w:szCs w:val="28"/>
+                <w:lang w:val="en-US" w:bidi="th-TH"/>
+              </w:rPr>
               <w:t xml:space="preserve">TC-B-03</w:t>
             </w:r>
           </w:p>
@@ -38679,6 +38945,272 @@
                 <w:lang w:val="en-US" w:bidi="th-TH"/>
               </w:rPr>
               <w:t xml:space="preserve">0.53 วินาที​เข้า SENSOR_FAULT ระดับ​เตือน 2 แล้ว​กลับ WORKING</w:t>
+            </w:r>
+          </w:p>
+        </w:tc>
+        <w:tc>
+          <w:tcPr>
+            <w:tcW w:type="dxa" w:w="1026"/>
+            <w:tcBorders>
+              <w:top w:val="single" w:color="000000" w:sz="4"/>
+              <w:left w:val="single" w:color="000000" w:sz="4"/>
+              <w:bottom w:val="single" w:color="000000" w:sz="4"/>
+              <w:right w:val="single" w:color="000000" w:sz="4"/>
+            </w:tcBorders>
+            <w:tcMar>
+              <w:top w:type="dxa" w:w="40"/>
+              <w:left w:type="dxa" w:w="90"/>
+              <w:bottom w:type="dxa" w:w="40"/>
+              <w:right w:type="dxa" w:w="90"/>
+            </w:tcMar>
+          </w:tcPr>
+          <w:p>
+            <w:pPr>
+              <w:spacing w:after="0" w:before="0"/>
+            </w:pPr>
+            <w:r>
+              <w:rPr>
+                <w:rFonts w:ascii="TH Sarabun New" w:cs="TH Sarabun New" w:eastAsia="TH Sarabun New" w:hAnsi="TH Sarabun New"/>
+                <w:b w:val="false"/>
+                <w:sz w:val="28"/>
+                <w:szCs w:val="28"/>
+                <w:lang w:val="en-US" w:bidi="th-TH"/>
+              </w:rPr>
+              <w:t xml:space="preserve">ผ่าน</w:t>
+            </w:r>
+          </w:p>
+        </w:tc>
+      </w:tr>
+      <w:tr>
+        <w:trPr>
+          <w:cantSplit/>
+        </w:trPr>
+        <w:tc>
+          <w:tcPr>
+            <w:tcW w:type="dxa" w:w="1450"/>
+            <w:tcBorders>
+              <w:top w:val="single" w:color="000000" w:sz="4"/>
+              <w:left w:val="single" w:color="000000" w:sz="4"/>
+              <w:bottom w:val="single" w:color="000000" w:sz="4"/>
+              <w:right w:val="single" w:color="000000" w:sz="4"/>
+            </w:tcBorders>
+            <w:tcMar>
+              <w:top w:type="dxa" w:w="40"/>
+              <w:left w:type="dxa" w:w="90"/>
+              <w:bottom w:type="dxa" w:w="40"/>
+              <w:right w:type="dxa" w:w="90"/>
+            </w:tcMar>
+          </w:tcPr>
+          <w:p>
+            <w:pPr>
+              <w:spacing w:after="0" w:before="0"/>
+            </w:pPr>
+            <w:r>
+              <w:rPr>
+                <w:rFonts w:ascii="TH Sarabun New" w:cs="TH Sarabun New" w:eastAsia="TH Sarabun New" w:hAnsi="TH Sarabun New"/>
+                <w:b w:val="false"/>
+                <w:sz w:val="28"/>
+                <w:szCs w:val="28"/>
+                <w:lang w:val="en-US" w:bidi="th-TH"/>
+              </w:rPr>
+              <w:t xml:space="preserve">TC-B-07</w:t>
+            </w:r>
+          </w:p>
+        </w:tc>
+        <w:tc>
+          <w:tcPr>
+            <w:tcW w:type="dxa" w:w="2500"/>
+            <w:tcBorders>
+              <w:top w:val="single" w:color="000000" w:sz="4"/>
+              <w:left w:val="single" w:color="000000" w:sz="4"/>
+              <w:bottom w:val="single" w:color="000000" w:sz="4"/>
+              <w:right w:val="single" w:color="000000" w:sz="4"/>
+            </w:tcBorders>
+            <w:tcMar>
+              <w:top w:type="dxa" w:w="40"/>
+              <w:left w:type="dxa" w:w="90"/>
+              <w:bottom w:type="dxa" w:w="40"/>
+              <w:right w:type="dxa" w:w="90"/>
+            </w:tcMar>
+          </w:tcPr>
+          <w:p>
+            <w:pPr>
+              <w:spacing w:after="0" w:before="0"/>
+            </w:pPr>
+            <w:r>
+              <w:rPr>
+                <w:rFonts w:ascii="TH Sarabun New" w:cs="TH Sarabun New" w:eastAsia="TH Sarabun New" w:hAnsi="TH Sarabun New"/>
+                <w:b w:val="false"/>
+                <w:sz w:val="28"/>
+                <w:szCs w:val="28"/>
+                <w:lang w:val="en-US" w:bidi="th-TH"/>
+              </w:rPr>
+              <w:t xml:space="preserve">ห้องมี CO₂ สูง และเซนเซอร์ห้องเสีย</w:t>
+            </w:r>
+          </w:p>
+        </w:tc>
+        <w:tc>
+          <w:tcPr>
+            <w:tcW w:type="dxa" w:w="4050"/>
+            <w:tcBorders>
+              <w:top w:val="single" w:color="000000" w:sz="4"/>
+              <w:left w:val="single" w:color="000000" w:sz="4"/>
+              <w:bottom w:val="single" w:color="000000" w:sz="4"/>
+              <w:right w:val="single" w:color="000000" w:sz="4"/>
+            </w:tcBorders>
+            <w:tcMar>
+              <w:top w:type="dxa" w:w="40"/>
+              <w:left w:type="dxa" w:w="90"/>
+              <w:bottom w:type="dxa" w:w="40"/>
+              <w:right w:type="dxa" w:w="90"/>
+            </w:tcMar>
+          </w:tcPr>
+          <w:p>
+            <w:pPr>
+              <w:spacing w:after="0" w:before="0"/>
+            </w:pPr>
+            <w:r>
+              <w:rPr>
+                <w:rFonts w:ascii="TH Sarabun New" w:cs="TH Sarabun New" w:eastAsia="TH Sarabun New" w:hAnsi="TH Sarabun New"/>
+                <w:b w:val="false"/>
+                <w:sz w:val="28"/>
+                <w:szCs w:val="28"/>
+                <w:lang w:val="en-US" w:bidi="th-TH"/>
+              </w:rPr>
+              <w:t xml:space="preserve">จอโต๊ะเตือน CO₂ สูง (ระดับ 1) ภายใน 0.9 วินาที และเตือนเซนเซอร์ห้องเสีย (ระดับ 2) ภายใน 0.5 วินาที</w:t>
+            </w:r>
+          </w:p>
+        </w:tc>
+        <w:tc>
+          <w:tcPr>
+            <w:tcW w:type="dxa" w:w="1026"/>
+            <w:tcBorders>
+              <w:top w:val="single" w:color="000000" w:sz="4"/>
+              <w:left w:val="single" w:color="000000" w:sz="4"/>
+              <w:bottom w:val="single" w:color="000000" w:sz="4"/>
+              <w:right w:val="single" w:color="000000" w:sz="4"/>
+            </w:tcBorders>
+            <w:tcMar>
+              <w:top w:type="dxa" w:w="40"/>
+              <w:left w:type="dxa" w:w="90"/>
+              <w:bottom w:type="dxa" w:w="40"/>
+              <w:right w:type="dxa" w:w="90"/>
+            </w:tcMar>
+          </w:tcPr>
+          <w:p>
+            <w:pPr>
+              <w:spacing w:after="0" w:before="0"/>
+            </w:pPr>
+            <w:r>
+              <w:rPr>
+                <w:rFonts w:ascii="TH Sarabun New" w:cs="TH Sarabun New" w:eastAsia="TH Sarabun New" w:hAnsi="TH Sarabun New"/>
+                <w:b w:val="false"/>
+                <w:sz w:val="28"/>
+                <w:szCs w:val="28"/>
+                <w:lang w:val="en-US" w:bidi="th-TH"/>
+              </w:rPr>
+              <w:t xml:space="preserve">ผ่าน</w:t>
+            </w:r>
+          </w:p>
+        </w:tc>
+      </w:tr>
+      <w:tr>
+        <w:trPr>
+          <w:cantSplit/>
+        </w:trPr>
+        <w:tc>
+          <w:tcPr>
+            <w:tcW w:type="dxa" w:w="1450"/>
+            <w:tcBorders>
+              <w:top w:val="single" w:color="000000" w:sz="4"/>
+              <w:left w:val="single" w:color="000000" w:sz="4"/>
+              <w:bottom w:val="single" w:color="000000" w:sz="4"/>
+              <w:right w:val="single" w:color="000000" w:sz="4"/>
+            </w:tcBorders>
+            <w:tcMar>
+              <w:top w:type="dxa" w:w="40"/>
+              <w:left w:type="dxa" w:w="90"/>
+              <w:bottom w:type="dxa" w:w="40"/>
+              <w:right w:type="dxa" w:w="90"/>
+            </w:tcMar>
+          </w:tcPr>
+          <w:p>
+            <w:pPr>
+              <w:spacing w:after="0" w:before="0"/>
+            </w:pPr>
+            <w:r>
+              <w:rPr>
+                <w:rFonts w:ascii="TH Sarabun New" w:cs="TH Sarabun New" w:eastAsia="TH Sarabun New" w:hAnsi="TH Sarabun New"/>
+                <w:b w:val="false"/>
+                <w:sz w:val="28"/>
+                <w:szCs w:val="28"/>
+                <w:lang w:val="en-US" w:bidi="th-TH"/>
+              </w:rPr>
+              <w:t xml:space="preserve">TC-B-08</w:t>
+            </w:r>
+          </w:p>
+        </w:tc>
+        <w:tc>
+          <w:tcPr>
+            <w:tcW w:type="dxa" w:w="2500"/>
+            <w:tcBorders>
+              <w:top w:val="single" w:color="000000" w:sz="4"/>
+              <w:left w:val="single" w:color="000000" w:sz="4"/>
+              <w:bottom w:val="single" w:color="000000" w:sz="4"/>
+              <w:right w:val="single" w:color="000000" w:sz="4"/>
+            </w:tcBorders>
+            <w:tcMar>
+              <w:top w:type="dxa" w:w="40"/>
+              <w:left w:type="dxa" w:w="90"/>
+              <w:bottom w:type="dxa" w:w="40"/>
+              <w:right w:type="dxa" w:w="90"/>
+            </w:tcMar>
+          </w:tcPr>
+          <w:p>
+            <w:pPr>
+              <w:spacing w:after="0" w:before="0"/>
+            </w:pPr>
+            <w:r>
+              <w:rPr>
+                <w:rFonts w:ascii="TH Sarabun New" w:cs="TH Sarabun New" w:eastAsia="TH Sarabun New" w:hAnsi="TH Sarabun New"/>
+                <w:b w:val="false"/>
+                <w:sz w:val="28"/>
+                <w:szCs w:val="28"/>
+                <w:lang w:val="en-US" w:bidi="th-TH"/>
+              </w:rPr>
+              <w:t xml:space="preserve">มีเตือน CO₂ ค้างอยู่ แล้วห้องหยุดส่งข้อมูล</w:t>
+            </w:r>
+          </w:p>
+        </w:tc>
+        <w:tc>
+          <w:tcPr>
+            <w:tcW w:type="dxa" w:w="4050"/>
+            <w:tcBorders>
+              <w:top w:val="single" w:color="000000" w:sz="4"/>
+              <w:left w:val="single" w:color="000000" w:sz="4"/>
+              <w:bottom w:val="single" w:color="000000" w:sz="4"/>
+              <w:right w:val="single" w:color="000000" w:sz="4"/>
+            </w:tcBorders>
+            <w:tcMar>
+              <w:top w:type="dxa" w:w="40"/>
+              <w:left w:type="dxa" w:w="90"/>
+              <w:bottom w:type="dxa" w:w="40"/>
+              <w:right w:type="dxa" w:w="90"/>
+            </w:tcMar>
+          </w:tcPr>
+          <w:p>
+            <w:pPr>
+              <w:spacing w:after="0" w:before="0"/>
+            </w:pPr>
+            <w:r>
+              <w:rPr>
+                <w:rFonts w:ascii="TH Sarabun New" w:cs="TH Sarabun New" w:eastAsia="TH Sarabun New" w:hAnsi="TH Sarabun New"/>
+                <w:b w:val="false"/>
+                <w:sz w:val="28"/>
+                <w:szCs w:val="28"/>
+                <w:lang w:val="en-US" w:bidi="th-TH"/>
+              </w:rPr>
+              <w:t xml:space="preserve">ข้อมูลอากาศเก่าเกิน 15 วินาที โต๊ะยกเลิกเตือน CO₂ แสดงลิงก์ขาด และหน้าจอแสดงว่าไม่มีข้อมูลอากาศ</w:t>
             </w:r>
           </w:p>
         </w:tc>
@@ -40175,7 +40707,7 @@
           <w:szCs w:val="32"/>
           <w:lang w:val="en-US" w:bidi="th-TH"/>
         </w:rPr>
-        <w:t xml:space="preserve">2) กรณี​ที่​ยัง​ไม่​มีผล​จาก​การ​ทดสอบ ได้แก่ TC-C-07 (แสดง​ความชื้น) และ TC-D-05 (สี​แสง​ก่อน​รู้​เวลา) ส่วน TC-A-08 ยืนยัน​ได้​เฉพาะ​พฤติกรรม เพราะ Wokwi วัด​กระแสไฟ​ไม่​ได้</w:t>
+        <w:t xml:space="preserve">2) TC-A-08 ยืนยันได้เฉพาะพฤติกรรม เพราะ Wokwi วัดกระแสไฟไม่ได้</w:t>
       </w:r>
     </w:p>
     <w:p>
@@ -43114,21 +43646,6 @@
           <w:lang w:val="en-US" w:bidi="th-TH"/>
         </w:rPr>
         <w:t xml:space="preserve">2) ยัง​ไม่​ได้​วัด​กระแสไฟ​จริง ตาราง​ไฟ​ใน​หัวข้อ 4.3 ใช้​ค่า​จาก datasheet และ​ค่า​ประมาณ (จอ OLED, buzzer, แถบ LED, พัดลม) จึง​ยัง​ยืนยัน​การ​ประหยัด​พลังงาน​ด้วย​ตัวเลข​วัด​จริง​ไม่​ได้ (TC-A-08)</w:t>
-      </w:r>
-    </w:p>
-    <w:p>
-      <w:pPr>
-        <w:spacing w:after="0" w:before="0"/>
-        <w:ind w:left="709"/>
-      </w:pPr>
-      <w:r>
-        <w:rPr>
-          <w:rFonts w:ascii="TH Sarabun New" w:cs="TH Sarabun New" w:eastAsia="TH Sarabun New" w:hAnsi="TH Sarabun New"/>
-          <w:sz w:val="32"/>
-          <w:szCs w:val="32"/>
-          <w:lang w:val="en-US" w:bidi="th-TH"/>
-        </w:rPr>
-        <w:t xml:space="preserve">3) กรณี​ทดสอบ TC-C-07 (แสดง​ความชื้น) และ TC-D-05 (สี​แสง​ก่อน​รู้​เวลา) ยัง​ไม่​มีผล​จาก​การ​ทดสอบ</w:t>
       </w:r>
     </w:p>
     <w:p>

</xml_diff>

<commit_message>
docs(D5): round 6 - TC-B-08 result and test evidence figures
</commit_message>
<xml_diff>
--- a/10_final/D5_design_document.docx
+++ b/10_final/D5_design_document.docx
@@ -1084,7 +1084,7 @@
           <w:szCs w:val="32"/>
           <w:lang w:val="en-US" w:bidi="th-TH"/>
         </w:rPr>
-        <w:t xml:space="preserve">โครงงาน​นี้​ออกแบบ​ระบบ​ควบคุม​สภาพแวดล้อม​โต๊ะทำงาน เพื่อ​ลด​ความ​ล้า​ของ​คน​ที่ทำงาน​หน้า​คอมพิวเตอร์​เป็นเวลา​นาน ระบบ​แบ่ง​เป็น​โหนด​โต๊ะ​และ​โหนด​ห้อง ทั้งสอง​โหนด​ใช้ ESP32 ทำงาน​บน FreeRTOS และ​สื่อสาร​กัน​ผ่าน Wi-Fi ด้วย​โปรโตคอล MQTT โหนด​โต๊ะ​ตรวจการ​นั่ง​ด้วย​เรดาร์ mmWave เตือน​ให้​พักสายตา​ทุก 20 นาที​และ​ลุก​เดิน​ทุก 30 นาที รักษา​ความสว่าง​บน​โต๊ะ​ไว้​ที่ 500 lux ด้วย​วง​ควบคุม​แบบ​ป้อน​กลับ และ​ปรับ​สี​แสง​จาก​ขาว​เย็น​ใน​เวลากลางวัน​เป็น​ขาว​อุ่น​ใน​ช่วง​ค่ำ โหนด​ห้อง​วัด CO₂ อุณหภูมิ และ​ความชื้น แล้ว​คุม​พัดลมดูดอากาศ​ด้วย​ช่วง hysteresis 800 ถึง 1,000 ppm ค่า​เกณฑ์​ทุก​ตัว​อ้างอิง​จาก​งานวิจัย​หรือ​มาตรฐาน และ​ทุก​โมดูล​มี​โหมด​ปลอดภัย​เมื่อ​เซนเซอร์​เสีย รวมถึง​ทำงานต่อ​ได้​เมื่อ​เครือข่าย​ขัดข้อง ผล​การ​ทดสอบ​บน​โปรแกรม​จำลอง Wokwi ผ่าน​ครบ 21 จาก 21 รายการ​ที่​รัน​อัตโนมัติ และ 5 จาก 5 รายการ​ที่​ทดสอบ​ต่อเนื่อง งาน​ควบคุม​บน​แกน​ประมวลผล​ที่ 1 ของ​โหนด​โต๊ะ​ใช้เวลา​รวม 29.0% ต่ำกว่า​ขอบเขต​ของ Rate Monotonic Scheduling (74.3%) การ​รัน​ต่อเนื่อง 22.8 นาที​ไม่​มี​งาน​ใด​พลาด​เส้นตาย และ​การ​นั่ง​จริง​โดย​ไม่​เร่ง​เวลา​ได้การ​เตือน​พักสายตา​ที่ 20 นาที​ตรง​ตามที่​ออกแบบ</w:t>
+        <w:t xml:space="preserve">โครงงาน​นี้​ออกแบบ​ระบบ​ควบคุม​สภาพแวดล้อม​โต๊ะทำงาน เพื่อ​ลด​ความ​ล้า​ของ​คน​ที่ทำงาน​หน้า​คอมพิวเตอร์​เป็นเวลา​นาน ระบบ​แบ่ง​เป็น​โหนด​โต๊ะ​และ​โหนด​ห้อง ทั้งสอง​โหนด​ใช้ ESP32 ทำงาน​บน FreeRTOS และ​สื่อสาร​กัน​ผ่าน Wi-Fi ด้วย​โปรโตคอล MQTT โหนด​โต๊ะ​ตรวจการ​นั่ง​ด้วย​เรดาร์ mmWave เตือน​ให้​พักสายตา​ทุก 20 นาที​และ​ลุก​เดิน​ทุก 30 นาที รักษา​ความสว่าง​บน​โต๊ะ​ไว้​ที่ 500 lux ด้วย​วง​ควบคุม​แบบ​ป้อน​กลับ และ​ปรับ​สี​แสง​จาก​ขาว​เย็น​ใน​เวลากลางวัน​เป็น​ขาว​อุ่น​ใน​ช่วง​ค่ำ โหนด​ห้อง​วัด CO₂ อุณหภูมิ และ​ความชื้น แล้ว​คุม​พัดลมดูดอากาศ​ด้วย​ช่วง hysteresis 800 ถึง 1,000 ppm ค่า​เกณฑ์​ทุก​ตัว​อ้างอิง​จาก​งานวิจัย​หรือ​มาตรฐาน และ​ทุก​โมดูล​มี​โหมด​ปลอดภัย​เมื่อ​เซนเซอร์​เสีย รวมถึง​ทำงานต่อ​ได้​เมื่อ​เครือข่าย​ขัดข้อง ผล​การ​ทดสอบ​บน​โปรแกรม​จำลอง Wokwi ผ่าน​ครบ 21 จาก 21 รายการ​ที่​รัน​อัตโนมัติ และ 8 จาก 8 รายการ​ที่​ทดสอบ​เพิ่มเติม งาน​ควบคุม​บน​แกน​ประมวลผล​ที่ 1 ของ​โหนด​โต๊ะ​ใช้เวลา​รวม 29.0% ต่ำกว่า​ขอบเขต​ของ Rate Monotonic Scheduling (74.3%) การ​รัน​ต่อเนื่อง 22.8 นาที​ไม่​มี​งาน​ใด​พลาด​เส้นตาย และ​การ​นั่ง​จริง​โดย​ไม่​เร่ง​เวลา​ได้การ​เตือน​พักสายตา​ที่ 20 นาที​ตรง​ตามที่​ออกแบบ</w:t>
       </w:r>
     </w:p>
     <w:p>
@@ -36221,7 +36221,7 @@
           <w:szCs w:val="32"/>
           <w:lang w:val="en-US" w:bidi="th-TH"/>
         </w:rPr>
-        <w:t xml:space="preserve">การ​ทดสอบ​ใช้ Wokwi CLI รุ่น 0.28.1 ร่วมกับ​สคริปต์​ที่​สั่งงาน​ผ่าน Serial ปุ่ม และ​ตัว​เลื่อน​ของ​เซนเซอร์​แบบ​อัตโนมัติ แล้ว​เก็บ log ภาพ​หน้าจอ OLED และ​ไฟล์​สัญญาณ​จาก logic analyzer เป็น​หลักฐาน [38] ชุด​ทดสอบ​โหนด​โต๊ะ​ใช้การ​เร่ง​เวลา 120 เท่า (1 วินาที​ใน​โปรแกรม​เท่ากับ 2 นาที​ของ​ระบบ) ส่วน​ชุด​ทดสอบ​ทั้ง​ระบบ​ใช้​เวลาจริง ผลรวม​คือ​ผ่าน 21 จาก 21 รายการ​ที่​รัน​ได้​อัตโนมัติ และ​ผ่าน 5 จาก 5 รายการ​ที่​ทดสอบ​ต่อเนื่อง​บน​โปรเจค Wokwi แบบ public (รัน​ต่อเนื่อง นั่ง​จริง 20 นาที วิดีโอ​สถานการณ์​ใช้งาน TC-A-05 และ TC-A-08) ระหว่าง​ทดสอบ​พบ​ข้อผิดพลาด 9 จุด แก้​แล้ว​ทั้งหมด​และ​รัน​ซ้ำ​บน​โค้ด​ที่​แก้​แล้ว</w:t>
+        <w:t xml:space="preserve">การ​ทดสอบ​ใช้ Wokwi CLI รุ่น 0.28.1 ร่วมกับ​สคริปต์​ที่​สั่งงาน​ผ่าน Serial ปุ่ม และ​ตัว​เลื่อน​ของ​เซนเซอร์​แบบ​อัตโนมัติ แล้ว​เก็บ log ภาพ​หน้าจอ OLED และ​ไฟล์​สัญญาณ​จาก logic analyzer เป็น​หลักฐาน [38] ชุด​ทดสอบ​โหนด​โต๊ะ​ใช้การ​เร่ง​เวลา 120 เท่า (1 วินาที​ใน​โปรแกรม​เท่ากับ 2 นาที​ของ​ระบบ) ส่วน​ชุด​ทดสอบ​ทั้ง​ระบบ​ใช้​เวลาจริง ผลรวม​คือ​ผ่าน 21 จาก 21 รายการ​ที่​รัน​ได้​อัตโนมัติ และ​ผ่าน 8 จาก 8 รายการ​ที่​ทดสอบ​เพิ่มเติม (รัน​ต่อเนื่อง นั่ง​จริง 20 นาที วิดีโอ​สถานการณ์​ใช้งาน TC-A-05, TC-A-08, TC-B-08, TC-C-07 และ TC-D-05) ระหว่าง​ทดสอบ​พบ​ข้อผิดพลาด 9 จุด แก้​แล้ว​ทั้งหมด​และ​รัน​ซ้ำ​บน​โค้ด​ที่​แก้​แล้ว</w:t>
       </w:r>
     </w:p>
     <w:p>
@@ -37329,6 +37329,139 @@
           </w:p>
         </w:tc>
       </w:tr>
+      <w:tr>
+        <w:trPr>
+          <w:cantSplit/>
+        </w:trPr>
+        <w:tc>
+          <w:tcPr>
+            <w:tcW w:type="dxa" w:w="1450"/>
+            <w:tcBorders>
+              <w:top w:val="single" w:color="000000" w:sz="4"/>
+              <w:left w:val="single" w:color="000000" w:sz="4"/>
+              <w:bottom w:val="single" w:color="000000" w:sz="4"/>
+              <w:right w:val="single" w:color="000000" w:sz="4"/>
+            </w:tcBorders>
+            <w:tcMar>
+              <w:top w:type="dxa" w:w="40"/>
+              <w:left w:type="dxa" w:w="90"/>
+              <w:bottom w:type="dxa" w:w="40"/>
+              <w:right w:type="dxa" w:w="90"/>
+            </w:tcMar>
+          </w:tcPr>
+          <w:p>
+            <w:pPr>
+              <w:spacing w:after="0" w:before="0"/>
+            </w:pPr>
+            <w:r>
+              <w:rPr>
+                <w:rFonts w:ascii="TH Sarabun New" w:cs="TH Sarabun New" w:eastAsia="TH Sarabun New" w:hAnsi="TH Sarabun New"/>
+                <w:b w:val="false"/>
+                <w:sz w:val="28"/>
+                <w:szCs w:val="28"/>
+                <w:lang w:val="en-US" w:bidi="th-TH"/>
+              </w:rPr>
+              <w:t xml:space="preserve">TC-C-07</w:t>
+            </w:r>
+          </w:p>
+        </w:tc>
+        <w:tc>
+          <w:tcPr>
+            <w:tcW w:type="dxa" w:w="2750"/>
+            <w:tcBorders>
+              <w:top w:val="single" w:color="000000" w:sz="4"/>
+              <w:left w:val="single" w:color="000000" w:sz="4"/>
+              <w:bottom w:val="single" w:color="000000" w:sz="4"/>
+              <w:right w:val="single" w:color="000000" w:sz="4"/>
+            </w:tcBorders>
+            <w:tcMar>
+              <w:top w:type="dxa" w:w="40"/>
+              <w:left w:type="dxa" w:w="90"/>
+              <w:bottom w:type="dxa" w:w="40"/>
+              <w:right w:type="dxa" w:w="90"/>
+            </w:tcMar>
+          </w:tcPr>
+          <w:p>
+            <w:pPr>
+              <w:spacing w:after="0" w:before="0"/>
+            </w:pPr>
+            <w:r>
+              <w:rPr>
+                <w:rFonts w:ascii="TH Sarabun New" w:cs="TH Sarabun New" w:eastAsia="TH Sarabun New" w:hAnsi="TH Sarabun New"/>
+                <w:b w:val="false"/>
+                <w:sz w:val="28"/>
+                <w:szCs w:val="28"/>
+                <w:lang w:val="en-US" w:bidi="th-TH"/>
+              </w:rPr>
+              <w:t xml:space="preserve">ตรวจ​ค่า​ความชื้น​ใน log ของ​ห้อง​และ​โต๊ะ</w:t>
+            </w:r>
+          </w:p>
+        </w:tc>
+        <w:tc>
+          <w:tcPr>
+            <w:tcW w:type="dxa" w:w="3800"/>
+            <w:tcBorders>
+              <w:top w:val="single" w:color="000000" w:sz="4"/>
+              <w:left w:val="single" w:color="000000" w:sz="4"/>
+              <w:bottom w:val="single" w:color="000000" w:sz="4"/>
+              <w:right w:val="single" w:color="000000" w:sz="4"/>
+            </w:tcBorders>
+            <w:tcMar>
+              <w:top w:type="dxa" w:w="40"/>
+              <w:left w:type="dxa" w:w="90"/>
+              <w:bottom w:type="dxa" w:w="40"/>
+              <w:right w:type="dxa" w:w="90"/>
+            </w:tcMar>
+          </w:tcPr>
+          <w:p>
+            <w:pPr>
+              <w:spacing w:after="0" w:before="0"/>
+            </w:pPr>
+            <w:r>
+              <w:rPr>
+                <w:rFonts w:ascii="TH Sarabun New" w:cs="TH Sarabun New" w:eastAsia="TH Sarabun New" w:hAnsi="TH Sarabun New"/>
+                <w:b w:val="false"/>
+                <w:sz w:val="28"/>
+                <w:szCs w:val="28"/>
+                <w:lang w:val="en-US" w:bidi="th-TH"/>
+              </w:rPr>
+              <w:t xml:space="preserve">ห้อง​อ่าน​ความชื้น​ได้ 55% ตรง​กับ​เซนเซอร์ และ​โต๊ะ​ได้รับ​ค่า​เดียวกัน​ผ่าน MQTT ไม่​มี​การ​เตือน​จาก​ความชื้น</w:t>
+            </w:r>
+          </w:p>
+        </w:tc>
+        <w:tc>
+          <w:tcPr>
+            <w:tcW w:type="dxa" w:w="1026"/>
+            <w:tcBorders>
+              <w:top w:val="single" w:color="000000" w:sz="4"/>
+              <w:left w:val="single" w:color="000000" w:sz="4"/>
+              <w:bottom w:val="single" w:color="000000" w:sz="4"/>
+              <w:right w:val="single" w:color="000000" w:sz="4"/>
+            </w:tcBorders>
+            <w:tcMar>
+              <w:top w:type="dxa" w:w="40"/>
+              <w:left w:type="dxa" w:w="90"/>
+              <w:bottom w:type="dxa" w:w="40"/>
+              <w:right w:type="dxa" w:w="90"/>
+            </w:tcMar>
+          </w:tcPr>
+          <w:p>
+            <w:pPr>
+              <w:spacing w:after="0" w:before="0"/>
+            </w:pPr>
+            <w:r>
+              <w:rPr>
+                <w:rFonts w:ascii="TH Sarabun New" w:cs="TH Sarabun New" w:eastAsia="TH Sarabun New" w:hAnsi="TH Sarabun New"/>
+                <w:b w:val="false"/>
+                <w:sz w:val="28"/>
+                <w:szCs w:val="28"/>
+                <w:lang w:val="en-US" w:bidi="th-TH"/>
+              </w:rPr>
+              <w:t xml:space="preserve">ผ่าน</w:t>
+            </w:r>
+          </w:p>
+        </w:tc>
+      </w:tr>
     </w:tbl>
     <w:p>
       <w:pPr>
@@ -37342,6 +37475,86 @@
           <w:lang w:val="en-US" w:bidi="th-TH"/>
         </w:rPr>
         <w:t xml:space="preserve"/>
+      </w:r>
+    </w:p>
+    <w:p>
+      <w:pPr>
+        <w:spacing w:after="0" w:before="0"/>
+        <w:ind w:firstLine="709"/>
+      </w:pPr>
+      <w:r>
+        <w:rPr>
+          <w:rFonts w:ascii="TH Sarabun New" w:cs="TH Sarabun New" w:eastAsia="TH Sarabun New" w:hAnsi="TH Sarabun New"/>
+          <w:sz w:val="32"/>
+          <w:szCs w:val="32"/>
+          <w:lang w:val="en-US" w:bidi="th-TH"/>
+        </w:rPr>
+        <w:t xml:space="preserve">ภาพ​ที่ 7.1 แสดง​ลำดับ​การ​ทดสอบ​โหนด​ห้อง​ใน​ชุด​เดียวกัน ด้านบน​คือ​ค่า CO₂ ที่​ป้อน​ทุก 5 วินาที ด้านล่าง​คือ duty ของ​พัดลม​ที่ logic analyzer วัด​ได้​จริง​จาก​ขา GPIO 25 เห็น​ได้​ว่าที่ 970 ppm พัดลม​ยัง​เปิด 100% ต่อ เพราะ​ยัง​ไม่​ต่ำกว่า 950 ppm และ​ที่ 900 ppm ขา​ขึ้น​พัดลม​ยัง​ไม่​เปิด ซึ่ง​เป็นผล​ของ​ช่วง hysteresis ตามที่​ออกแบบ ช่วง​ท้าย​เมื่อ​ทุก​โต๊ะ​ไม่​มี​คน​พัดลม​หยุด แต่​เมื่อ​ติดต่อ​โต๊ะ​ไม่​ได้​เลย​ระบบ​กลับ​ไป​เปิด​พัดลม​เต็มที่ เพราะ​ไม่​รู้​ว่า​มี​คน​หรือไม่</w:t>
+      </w:r>
+    </w:p>
+    <w:p>
+      <w:pPr>
+        <w:keepNext/>
+        <w:spacing w:after="0" w:before="120"/>
+        <w:jc w:val="center"/>
+      </w:pPr>
+      <w:r>
+        <w:drawing>
+          <wp:inline distT="0" distB="0" distL="0" distR="0">
+            <wp:extent cx="5715000" cy="3714750"/>
+            <wp:effectExtent t="0" r="0" b="0" l="0"/>
+            <wp:docPr id="1" name="figure" descr="figure" title="figure"/>
+            <wp:cNvGraphicFramePr>
+              <a:graphicFrameLocks xmlns:a="http://schemas.openxmlformats.org/drawingml/2006/main" noChangeAspect="1"/>
+            </wp:cNvGraphicFramePr>
+            <a:graphic xmlns:a="http://schemas.openxmlformats.org/drawingml/2006/main">
+              <a:graphicData uri="http://schemas.openxmlformats.org/drawingml/2006/picture">
+                <pic:pic xmlns:pic="http://schemas.openxmlformats.org/drawingml/2006/picture">
+                  <pic:nvPicPr>
+                    <pic:cNvPr id="0" name="" descr=""/>
+                    <pic:cNvPicPr>
+                      <a:picLocks noChangeAspect="1" noChangeArrowheads="1"/>
+                    </pic:cNvPicPr>
+                  </pic:nvPicPr>
+                  <pic:blipFill>
+                    <a:blip r:embed="rId16" cstate="none"/>
+                    <a:srcRect/>
+                    <a:stretch>
+                      <a:fillRect/>
+                    </a:stretch>
+                  </pic:blipFill>
+                  <pic:spPr bwMode="auto">
+                    <a:xfrm>
+                      <a:off x="0" y="0"/>
+                      <a:ext cx="5715000" cy="3714750"/>
+                    </a:xfrm>
+                    <a:prstGeom prst="rect">
+                      <a:avLst/>
+                    </a:prstGeom>
+                  </pic:spPr>
+                </pic:pic>
+              </a:graphicData>
+            </a:graphic>
+          </wp:inline>
+        </w:drawing>
+      </w:r>
+    </w:p>
+    <w:p>
+      <w:pPr>
+        <w:keepNext w:val="false"/>
+        <w:spacing w:after="120" w:before="60"/>
+        <w:jc w:val="center"/>
+      </w:pPr>
+      <w:r>
+        <w:rPr>
+          <w:rFonts w:ascii="TH Sarabun New" w:cs="TH Sarabun New" w:eastAsia="TH Sarabun New" w:hAnsi="TH Sarabun New"/>
+          <w:b/>
+          <w:bCs/>
+          <w:sz w:val="32"/>
+          <w:szCs w:val="32"/>
+          <w:lang w:val="en-US" w:bidi="th-TH"/>
+        </w:rPr>
+        <w:t xml:space="preserve">ภาพที่ 7.1 ค่า CO₂ ที่​ป้อน​และ duty ของ​พัดลม​ที่วัด​จาก logic analyzer ใน​การ​ทดสอบ​โหนด​ห้อง</w:t>
       </w:r>
     </w:p>
     <w:p>
@@ -38481,7 +38694,7 @@
                 <w:szCs w:val="28"/>
                 <w:lang w:val="en-US" w:bidi="th-TH"/>
               </w:rPr>
-              <w:t xml:space="preserve">TC-D-06</w:t>
+              <w:t xml:space="preserve">TC-D-05</w:t>
             </w:r>
           </w:p>
         </w:tc>
@@ -38513,7 +38726,7 @@
                 <w:szCs w:val="28"/>
                 <w:lang w:val="en-US" w:bidi="th-TH"/>
               </w:rPr>
-              <w:t xml:space="preserve">จำลอง​เซนเซอร์​แสง​เสีย</w:t>
+              <w:t xml:space="preserve">เปิด​เครื่อง​ก่อน​ได้เวลา​จาก NTP</w:t>
             </w:r>
           </w:p>
         </w:tc>
@@ -38545,7 +38758,7 @@
                 <w:szCs w:val="28"/>
                 <w:lang w:val="en-US" w:bidi="th-TH"/>
               </w:rPr>
-              <w:t xml:space="preserve">ครบ 3 รอบ (0.49 วินาที) เข้า SENSOR_FAULT ไฟ 60% จอ​ขึ้น​เตือน กลับ​ปกติ​หลัง​อ่าน​ได้ 2 รอบ</w:t>
+              <w:t xml:space="preserve">ระหว่าง​ยัง​ไม่​รู้​เวลา r คงที่ 0.50 และ​วง​คุม​แสง​ยัง​ทำงาน หลัง​ได้เวลา r ค่อยๆ เปลี่ยน​ตาม​ตาราง ไม่​กระโดด</w:t>
             </w:r>
           </w:p>
         </w:tc>
@@ -38614,6 +38827,139 @@
                 <w:szCs w:val="28"/>
                 <w:lang w:val="en-US" w:bidi="th-TH"/>
               </w:rPr>
+              <w:t xml:space="preserve">TC-D-06</w:t>
+            </w:r>
+          </w:p>
+        </w:tc>
+        <w:tc>
+          <w:tcPr>
+            <w:tcW w:type="dxa" w:w="2500"/>
+            <w:tcBorders>
+              <w:top w:val="single" w:color="000000" w:sz="4"/>
+              <w:left w:val="single" w:color="000000" w:sz="4"/>
+              <w:bottom w:val="single" w:color="000000" w:sz="4"/>
+              <w:right w:val="single" w:color="000000" w:sz="4"/>
+            </w:tcBorders>
+            <w:tcMar>
+              <w:top w:type="dxa" w:w="40"/>
+              <w:left w:type="dxa" w:w="90"/>
+              <w:bottom w:type="dxa" w:w="40"/>
+              <w:right w:type="dxa" w:w="90"/>
+            </w:tcMar>
+          </w:tcPr>
+          <w:p>
+            <w:pPr>
+              <w:spacing w:after="0" w:before="0"/>
+            </w:pPr>
+            <w:r>
+              <w:rPr>
+                <w:rFonts w:ascii="TH Sarabun New" w:cs="TH Sarabun New" w:eastAsia="TH Sarabun New" w:hAnsi="TH Sarabun New"/>
+                <w:b w:val="false"/>
+                <w:sz w:val="28"/>
+                <w:szCs w:val="28"/>
+                <w:lang w:val="en-US" w:bidi="th-TH"/>
+              </w:rPr>
+              <w:t xml:space="preserve">จำลอง​เซนเซอร์​แสง​เสีย</w:t>
+            </w:r>
+          </w:p>
+        </w:tc>
+        <w:tc>
+          <w:tcPr>
+            <w:tcW w:type="dxa" w:w="4050"/>
+            <w:tcBorders>
+              <w:top w:val="single" w:color="000000" w:sz="4"/>
+              <w:left w:val="single" w:color="000000" w:sz="4"/>
+              <w:bottom w:val="single" w:color="000000" w:sz="4"/>
+              <w:right w:val="single" w:color="000000" w:sz="4"/>
+            </w:tcBorders>
+            <w:tcMar>
+              <w:top w:type="dxa" w:w="40"/>
+              <w:left w:type="dxa" w:w="90"/>
+              <w:bottom w:type="dxa" w:w="40"/>
+              <w:right w:type="dxa" w:w="90"/>
+            </w:tcMar>
+          </w:tcPr>
+          <w:p>
+            <w:pPr>
+              <w:spacing w:after="0" w:before="0"/>
+            </w:pPr>
+            <w:r>
+              <w:rPr>
+                <w:rFonts w:ascii="TH Sarabun New" w:cs="TH Sarabun New" w:eastAsia="TH Sarabun New" w:hAnsi="TH Sarabun New"/>
+                <w:b w:val="false"/>
+                <w:sz w:val="28"/>
+                <w:szCs w:val="28"/>
+                <w:lang w:val="en-US" w:bidi="th-TH"/>
+              </w:rPr>
+              <w:t xml:space="preserve">ครบ 3 รอบ (0.49 วินาที) เข้า SENSOR_FAULT ไฟ 60% จอ​ขึ้น​เตือน กลับ​ปกติ​หลัง​อ่าน​ได้ 2 รอบ</w:t>
+            </w:r>
+          </w:p>
+        </w:tc>
+        <w:tc>
+          <w:tcPr>
+            <w:tcW w:type="dxa" w:w="1026"/>
+            <w:tcBorders>
+              <w:top w:val="single" w:color="000000" w:sz="4"/>
+              <w:left w:val="single" w:color="000000" w:sz="4"/>
+              <w:bottom w:val="single" w:color="000000" w:sz="4"/>
+              <w:right w:val="single" w:color="000000" w:sz="4"/>
+            </w:tcBorders>
+            <w:tcMar>
+              <w:top w:type="dxa" w:w="40"/>
+              <w:left w:type="dxa" w:w="90"/>
+              <w:bottom w:type="dxa" w:w="40"/>
+              <w:right w:type="dxa" w:w="90"/>
+            </w:tcMar>
+          </w:tcPr>
+          <w:p>
+            <w:pPr>
+              <w:spacing w:after="0" w:before="0"/>
+            </w:pPr>
+            <w:r>
+              <w:rPr>
+                <w:rFonts w:ascii="TH Sarabun New" w:cs="TH Sarabun New" w:eastAsia="TH Sarabun New" w:hAnsi="TH Sarabun New"/>
+                <w:b w:val="false"/>
+                <w:sz w:val="28"/>
+                <w:szCs w:val="28"/>
+                <w:lang w:val="en-US" w:bidi="th-TH"/>
+              </w:rPr>
+              <w:t xml:space="preserve">ผ่าน</w:t>
+            </w:r>
+          </w:p>
+        </w:tc>
+      </w:tr>
+      <w:tr>
+        <w:trPr>
+          <w:cantSplit/>
+        </w:trPr>
+        <w:tc>
+          <w:tcPr>
+            <w:tcW w:type="dxa" w:w="1450"/>
+            <w:tcBorders>
+              <w:top w:val="single" w:color="000000" w:sz="4"/>
+              <w:left w:val="single" w:color="000000" w:sz="4"/>
+              <w:bottom w:val="single" w:color="000000" w:sz="4"/>
+              <w:right w:val="single" w:color="000000" w:sz="4"/>
+            </w:tcBorders>
+            <w:tcMar>
+              <w:top w:type="dxa" w:w="40"/>
+              <w:left w:type="dxa" w:w="90"/>
+              <w:bottom w:type="dxa" w:w="40"/>
+              <w:right w:type="dxa" w:w="90"/>
+            </w:tcMar>
+          </w:tcPr>
+          <w:p>
+            <w:pPr>
+              <w:spacing w:after="0" w:before="0"/>
+            </w:pPr>
+            <w:r>
+              <w:rPr>
+                <w:rFonts w:ascii="TH Sarabun New" w:cs="TH Sarabun New" w:eastAsia="TH Sarabun New" w:hAnsi="TH Sarabun New"/>
+                <w:b w:val="false"/>
+                <w:sz w:val="28"/>
+                <w:szCs w:val="28"/>
+                <w:lang w:val="en-US" w:bidi="th-TH"/>
+              </w:rPr>
               <w:t xml:space="preserve">TC-B-03</w:t>
             </w:r>
           </w:p>
@@ -38679,6 +39025,139 @@
                 <w:lang w:val="en-US" w:bidi="th-TH"/>
               </w:rPr>
               <w:t xml:space="preserve">0.53 วินาที​เข้า SENSOR_FAULT ระดับ​เตือน 2 แล้ว​กลับ WORKING</w:t>
+            </w:r>
+          </w:p>
+        </w:tc>
+        <w:tc>
+          <w:tcPr>
+            <w:tcW w:type="dxa" w:w="1026"/>
+            <w:tcBorders>
+              <w:top w:val="single" w:color="000000" w:sz="4"/>
+              <w:left w:val="single" w:color="000000" w:sz="4"/>
+              <w:bottom w:val="single" w:color="000000" w:sz="4"/>
+              <w:right w:val="single" w:color="000000" w:sz="4"/>
+            </w:tcBorders>
+            <w:tcMar>
+              <w:top w:type="dxa" w:w="40"/>
+              <w:left w:type="dxa" w:w="90"/>
+              <w:bottom w:type="dxa" w:w="40"/>
+              <w:right w:type="dxa" w:w="90"/>
+            </w:tcMar>
+          </w:tcPr>
+          <w:p>
+            <w:pPr>
+              <w:spacing w:after="0" w:before="0"/>
+            </w:pPr>
+            <w:r>
+              <w:rPr>
+                <w:rFonts w:ascii="TH Sarabun New" w:cs="TH Sarabun New" w:eastAsia="TH Sarabun New" w:hAnsi="TH Sarabun New"/>
+                <w:b w:val="false"/>
+                <w:sz w:val="28"/>
+                <w:szCs w:val="28"/>
+                <w:lang w:val="en-US" w:bidi="th-TH"/>
+              </w:rPr>
+              <w:t xml:space="preserve">ผ่าน</w:t>
+            </w:r>
+          </w:p>
+        </w:tc>
+      </w:tr>
+      <w:tr>
+        <w:trPr>
+          <w:cantSplit/>
+        </w:trPr>
+        <w:tc>
+          <w:tcPr>
+            <w:tcW w:type="dxa" w:w="1450"/>
+            <w:tcBorders>
+              <w:top w:val="single" w:color="000000" w:sz="4"/>
+              <w:left w:val="single" w:color="000000" w:sz="4"/>
+              <w:bottom w:val="single" w:color="000000" w:sz="4"/>
+              <w:right w:val="single" w:color="000000" w:sz="4"/>
+            </w:tcBorders>
+            <w:tcMar>
+              <w:top w:type="dxa" w:w="40"/>
+              <w:left w:type="dxa" w:w="90"/>
+              <w:bottom w:type="dxa" w:w="40"/>
+              <w:right w:type="dxa" w:w="90"/>
+            </w:tcMar>
+          </w:tcPr>
+          <w:p>
+            <w:pPr>
+              <w:spacing w:after="0" w:before="0"/>
+            </w:pPr>
+            <w:r>
+              <w:rPr>
+                <w:rFonts w:ascii="TH Sarabun New" w:cs="TH Sarabun New" w:eastAsia="TH Sarabun New" w:hAnsi="TH Sarabun New"/>
+                <w:b w:val="false"/>
+                <w:sz w:val="28"/>
+                <w:szCs w:val="28"/>
+                <w:lang w:val="en-US" w:bidi="th-TH"/>
+              </w:rPr>
+              <w:t xml:space="preserve">TC-B-08</w:t>
+            </w:r>
+          </w:p>
+        </w:tc>
+        <w:tc>
+          <w:tcPr>
+            <w:tcW w:type="dxa" w:w="2500"/>
+            <w:tcBorders>
+              <w:top w:val="single" w:color="000000" w:sz="4"/>
+              <w:left w:val="single" w:color="000000" w:sz="4"/>
+              <w:bottom w:val="single" w:color="000000" w:sz="4"/>
+              <w:right w:val="single" w:color="000000" w:sz="4"/>
+            </w:tcBorders>
+            <w:tcMar>
+              <w:top w:type="dxa" w:w="40"/>
+              <w:left w:type="dxa" w:w="90"/>
+              <w:bottom w:type="dxa" w:w="40"/>
+              <w:right w:type="dxa" w:w="90"/>
+            </w:tcMar>
+          </w:tcPr>
+          <w:p>
+            <w:pPr>
+              <w:spacing w:after="0" w:before="0"/>
+            </w:pPr>
+            <w:r>
+              <w:rPr>
+                <w:rFonts w:ascii="TH Sarabun New" w:cs="TH Sarabun New" w:eastAsia="TH Sarabun New" w:hAnsi="TH Sarabun New"/>
+                <w:b w:val="false"/>
+                <w:sz w:val="28"/>
+                <w:szCs w:val="28"/>
+                <w:lang w:val="en-US" w:bidi="th-TH"/>
+              </w:rPr>
+              <w:t xml:space="preserve">ห้อง​หยุด​ส่ง​ข้อมูล​ขณะ​จอ​กำลัง​เตือน CO₂ สูง</w:t>
+            </w:r>
+          </w:p>
+        </w:tc>
+        <w:tc>
+          <w:tcPr>
+            <w:tcW w:type="dxa" w:w="4050"/>
+            <w:tcBorders>
+              <w:top w:val="single" w:color="000000" w:sz="4"/>
+              <w:left w:val="single" w:color="000000" w:sz="4"/>
+              <w:bottom w:val="single" w:color="000000" w:sz="4"/>
+              <w:right w:val="single" w:color="000000" w:sz="4"/>
+            </w:tcBorders>
+            <w:tcMar>
+              <w:top w:type="dxa" w:w="40"/>
+              <w:left w:type="dxa" w:w="90"/>
+              <w:bottom w:type="dxa" w:w="40"/>
+              <w:right w:type="dxa" w:w="90"/>
+            </w:tcMar>
+          </w:tcPr>
+          <w:p>
+            <w:pPr>
+              <w:spacing w:after="0" w:before="0"/>
+            </w:pPr>
+            <w:r>
+              <w:rPr>
+                <w:rFonts w:ascii="TH Sarabun New" w:cs="TH Sarabun New" w:eastAsia="TH Sarabun New" w:hAnsi="TH Sarabun New"/>
+                <w:b w:val="false"/>
+                <w:sz w:val="28"/>
+                <w:szCs w:val="28"/>
+                <w:lang w:val="en-US" w:bidi="th-TH"/>
+              </w:rPr>
+              <w:t xml:space="preserve">ข้อมูล​อากาศ​เก่า​เกิน 15 วินาที ระบบ​ยกเลิก​การ​เตือน CO₂ จอ​เปลี่ยนเป็น​ลิงก์​ขาด และ​หน้า​ปกติ​แสดงว่า​ไม่​มี​ข้อมูล​อากาศ</w:t>
             </w:r>
           </w:p>
         </w:tc>
@@ -38728,6 +39207,151 @@
           <w:lang w:val="en-US" w:bidi="th-TH"/>
         </w:rPr>
         <w:t xml:space="preserve"/>
+      </w:r>
+    </w:p>
+    <w:p>
+      <w:pPr>
+        <w:spacing w:after="0" w:before="0"/>
+        <w:ind w:firstLine="709"/>
+      </w:pPr>
+      <w:r>
+        <w:rPr>
+          <w:rFonts w:ascii="TH Sarabun New" w:cs="TH Sarabun New" w:eastAsia="TH Sarabun New" w:hAnsi="TH Sarabun New"/>
+          <w:sz w:val="32"/>
+          <w:szCs w:val="32"/>
+          <w:lang w:val="en-US" w:bidi="th-TH"/>
+        </w:rPr>
+        <w:t xml:space="preserve">ภาพ​หน้าจอ OLED ใน​ภาพ​ที่ 7.2 และ 7.3 ถ่าย​อัตโนมัติ​ระหว่าง​การ​ทดสอบ ภาพ​ที่ 7.2 เป็น​หน้าจอ​ปกติ​ที่​แสดง​เวลา​นั่ง ค่า​อากาศ​จาก​โหนด​ห้อง แสง​บน​โต๊ะ และ​เมนู​ตั้ง​ค่าที่​ใช้​ปุ่ม​เดียว ภาพ​ที่ 7.3 เป็น​หน้าจอ​เตือน​แต่ละ​แบบ ทุก​แบบ​มี​หัวข้อ​ตัว​ใหญ่​ให้​อ่าน​ได้​จาก​ระยะ​นั่ง และ​บอก​วิธี​ตอบสนอง​หรือ​สถานะ​โหมด​ปลอดภัย​ไว้​ใต้​หัวข้อ</w:t>
+      </w:r>
+    </w:p>
+    <w:p>
+      <w:pPr>
+        <w:keepNext/>
+        <w:spacing w:after="0" w:before="120"/>
+        <w:jc w:val="center"/>
+      </w:pPr>
+      <w:r>
+        <w:drawing>
+          <wp:inline distT="0" distB="0" distL="0" distR="0">
+            <wp:extent cx="5715000" cy="3419475"/>
+            <wp:effectExtent t="0" r="0" b="0" l="0"/>
+            <wp:docPr id="1" name="figure" descr="figure" title="figure"/>
+            <wp:cNvGraphicFramePr>
+              <a:graphicFrameLocks xmlns:a="http://schemas.openxmlformats.org/drawingml/2006/main" noChangeAspect="1"/>
+            </wp:cNvGraphicFramePr>
+            <a:graphic xmlns:a="http://schemas.openxmlformats.org/drawingml/2006/main">
+              <a:graphicData uri="http://schemas.openxmlformats.org/drawingml/2006/picture">
+                <pic:pic xmlns:pic="http://schemas.openxmlformats.org/drawingml/2006/picture">
+                  <pic:nvPicPr>
+                    <pic:cNvPr id="0" name="" descr=""/>
+                    <pic:cNvPicPr>
+                      <a:picLocks noChangeAspect="1" noChangeArrowheads="1"/>
+                    </pic:cNvPicPr>
+                  </pic:nvPicPr>
+                  <pic:blipFill>
+                    <a:blip r:embed="rId17" cstate="none"/>
+                    <a:srcRect/>
+                    <a:stretch>
+                      <a:fillRect/>
+                    </a:stretch>
+                  </pic:blipFill>
+                  <pic:spPr bwMode="auto">
+                    <a:xfrm>
+                      <a:off x="0" y="0"/>
+                      <a:ext cx="5715000" cy="3419475"/>
+                    </a:xfrm>
+                    <a:prstGeom prst="rect">
+                      <a:avLst/>
+                    </a:prstGeom>
+                  </pic:spPr>
+                </pic:pic>
+              </a:graphicData>
+            </a:graphic>
+          </wp:inline>
+        </w:drawing>
+      </w:r>
+    </w:p>
+    <w:p>
+      <w:pPr>
+        <w:keepNext w:val="false"/>
+        <w:spacing w:after="120" w:before="60"/>
+        <w:jc w:val="center"/>
+      </w:pPr>
+      <w:r>
+        <w:rPr>
+          <w:rFonts w:ascii="TH Sarabun New" w:cs="TH Sarabun New" w:eastAsia="TH Sarabun New" w:hAnsi="TH Sarabun New"/>
+          <w:b/>
+          <w:bCs/>
+          <w:sz w:val="32"/>
+          <w:szCs w:val="32"/>
+          <w:lang w:val="en-US" w:bidi="th-TH"/>
+        </w:rPr>
+        <w:t xml:space="preserve">ภาพที่ 7.2 หน้าจอ OLED ของ​โหนด​โต๊ะ​ขณะ​ทำงาน​ปกติ​และ​ใน​เมนู​ตั้งค่า</w:t>
+      </w:r>
+    </w:p>
+    <w:p>
+      <w:pPr>
+        <w:keepNext/>
+        <w:spacing w:after="0" w:before="120"/>
+        <w:jc w:val="center"/>
+      </w:pPr>
+      <w:r>
+        <w:drawing>
+          <wp:inline distT="0" distB="0" distL="0" distR="0">
+            <wp:extent cx="5715000" cy="7277100"/>
+            <wp:effectExtent t="0" r="0" b="0" l="0"/>
+            <wp:docPr id="1" name="figure" descr="figure" title="figure"/>
+            <wp:cNvGraphicFramePr>
+              <a:graphicFrameLocks xmlns:a="http://schemas.openxmlformats.org/drawingml/2006/main" noChangeAspect="1"/>
+            </wp:cNvGraphicFramePr>
+            <a:graphic xmlns:a="http://schemas.openxmlformats.org/drawingml/2006/main">
+              <a:graphicData uri="http://schemas.openxmlformats.org/drawingml/2006/picture">
+                <pic:pic xmlns:pic="http://schemas.openxmlformats.org/drawingml/2006/picture">
+                  <pic:nvPicPr>
+                    <pic:cNvPr id="0" name="" descr=""/>
+                    <pic:cNvPicPr>
+                      <a:picLocks noChangeAspect="1" noChangeArrowheads="1"/>
+                    </pic:cNvPicPr>
+                  </pic:nvPicPr>
+                  <pic:blipFill>
+                    <a:blip r:embed="rId18" cstate="none"/>
+                    <a:srcRect/>
+                    <a:stretch>
+                      <a:fillRect/>
+                    </a:stretch>
+                  </pic:blipFill>
+                  <pic:spPr bwMode="auto">
+                    <a:xfrm>
+                      <a:off x="0" y="0"/>
+                      <a:ext cx="5715000" cy="7277100"/>
+                    </a:xfrm>
+                    <a:prstGeom prst="rect">
+                      <a:avLst/>
+                    </a:prstGeom>
+                  </pic:spPr>
+                </pic:pic>
+              </a:graphicData>
+            </a:graphic>
+          </wp:inline>
+        </w:drawing>
+      </w:r>
+    </w:p>
+    <w:p>
+      <w:pPr>
+        <w:keepNext w:val="false"/>
+        <w:spacing w:after="120" w:before="60"/>
+        <w:jc w:val="center"/>
+      </w:pPr>
+      <w:r>
+        <w:rPr>
+          <w:rFonts w:ascii="TH Sarabun New" w:cs="TH Sarabun New" w:eastAsia="TH Sarabun New" w:hAnsi="TH Sarabun New"/>
+          <w:b/>
+          <w:bCs/>
+          <w:sz w:val="32"/>
+          <w:szCs w:val="32"/>
+          <w:lang w:val="en-US" w:bidi="th-TH"/>
+        </w:rPr>
+        <w:t xml:space="preserve">ภาพที่ 7.3 หน้าจอ OLED ของ​โหนด​โต๊ะ​เมื่อ​มี​การ​เตือน​แต่ละ​แบบ</w:t>
       </w:r>
     </w:p>
     <w:p>
@@ -40128,7 +40752,167 @@
           <w:szCs w:val="32"/>
           <w:lang w:val="en-US" w:bidi="th-TH"/>
         </w:rPr>
+        <w:t xml:space="preserve">ภาพ​ที่ 7.4 เป็น​ภาพ​จาก​วิดีโอ​สถานการณ์​ใช้งาน​ที่​รัน​สอง​โหนด​พร้อมกัน ช่วง​ที่ CO₂ ใน​ห้อง​ขึ้น​ถึง 1,964 ppm ด้าน​ซ้าย​คือ​โหนด​ห้อง​ที่​เข้า​สถานะ AIR_POOR เปิด​พัดลม 100% และ​ไฟ​สถานะ​เป็น​สีแดง ด้าน​ขวา​คือ​โหนด​โต๊ะ​ที่​ได้รับ​ข้อมูล​ผ่าน MQTT แล้ว​จอ​ขึ้น​เตือน CO₂ สูง​พร้อม​เสียงเตือน</w:t>
+      </w:r>
+    </w:p>
+    <w:p>
+      <w:pPr>
+        <w:keepNext/>
+        <w:spacing w:after="0" w:before="120"/>
+        <w:jc w:val="center"/>
+      </w:pPr>
+      <w:r>
+        <w:drawing>
+          <wp:inline distT="0" distB="0" distL="0" distR="0">
+            <wp:extent cx="5715000" cy="2628900"/>
+            <wp:effectExtent t="0" r="0" b="0" l="0"/>
+            <wp:docPr id="1" name="figure" descr="figure" title="figure"/>
+            <wp:cNvGraphicFramePr>
+              <a:graphicFrameLocks xmlns:a="http://schemas.openxmlformats.org/drawingml/2006/main" noChangeAspect="1"/>
+            </wp:cNvGraphicFramePr>
+            <a:graphic xmlns:a="http://schemas.openxmlformats.org/drawingml/2006/main">
+              <a:graphicData uri="http://schemas.openxmlformats.org/drawingml/2006/picture">
+                <pic:pic xmlns:pic="http://schemas.openxmlformats.org/drawingml/2006/picture">
+                  <pic:nvPicPr>
+                    <pic:cNvPr id="0" name="" descr=""/>
+                    <pic:cNvPicPr>
+                      <a:picLocks noChangeAspect="1" noChangeArrowheads="1"/>
+                    </pic:cNvPicPr>
+                  </pic:nvPicPr>
+                  <pic:blipFill>
+                    <a:blip r:embed="rId19" cstate="none"/>
+                    <a:srcRect/>
+                    <a:stretch>
+                      <a:fillRect/>
+                    </a:stretch>
+                  </pic:blipFill>
+                  <pic:spPr bwMode="auto">
+                    <a:xfrm>
+                      <a:off x="0" y="0"/>
+                      <a:ext cx="5715000" cy="2628900"/>
+                    </a:xfrm>
+                    <a:prstGeom prst="rect">
+                      <a:avLst/>
+                    </a:prstGeom>
+                  </pic:spPr>
+                </pic:pic>
+              </a:graphicData>
+            </a:graphic>
+          </wp:inline>
+        </w:drawing>
+      </w:r>
+    </w:p>
+    <w:p>
+      <w:pPr>
+        <w:keepNext w:val="false"/>
+        <w:spacing w:after="120" w:before="60"/>
+        <w:jc w:val="center"/>
+      </w:pPr>
+      <w:r>
+        <w:rPr>
+          <w:rFonts w:ascii="TH Sarabun New" w:cs="TH Sarabun New" w:eastAsia="TH Sarabun New" w:hAnsi="TH Sarabun New"/>
+          <w:b/>
+          <w:bCs/>
+          <w:sz w:val="32"/>
+          <w:szCs w:val="32"/>
+          <w:lang w:val="en-US" w:bidi="th-TH"/>
+        </w:rPr>
+        <w:t xml:space="preserve">ภาพที่ 7.4 ภาพ​จาก​วิดีโอ​สถานการณ์​ใช้งาน ซ้าย​คือ​โหนด​ห้อง ขวา​คือ​โหนด​โต๊ะ</w:t>
+      </w:r>
+    </w:p>
+    <w:p>
+      <w:pPr>
+        <w:spacing w:after="0" w:before="0"/>
+        <w:ind w:firstLine="709"/>
+      </w:pPr>
+      <w:r>
+        <w:rPr>
+          <w:rFonts w:ascii="TH Sarabun New" w:cs="TH Sarabun New" w:eastAsia="TH Sarabun New" w:hAnsi="TH Sarabun New"/>
+          <w:sz w:val="32"/>
+          <w:szCs w:val="32"/>
+          <w:lang w:val="en-US" w:bidi="th-TH"/>
+        </w:rPr>
         <w:t xml:space="preserve">ข้อมูล​จาก logic analyzer ยืนยัน​ว่า PWM ของ​ไฟ​ทั้งสอง​ช่อง​อยู่​ที่ 5,000 Hz buzzer 4.00 kHz และ​พัดลม 50 Hz ที่ 60%, 80% และ 100% ตรง​ตามที่​ออกแบบ และ​ทุก​ขา​ที่​ขับ​อุปกรณ์​อยู่​ที่​ระดับ​ต่ำ​ตั้งแต่​จ่ายไฟ ไม่​มี​ไฟ​หรือ​พัดลม​กระพริบ​ตอน​เปิด​เครื่อง</w:t>
+      </w:r>
+    </w:p>
+    <w:p>
+      <w:pPr>
+        <w:spacing w:after="0" w:before="0"/>
+        <w:ind w:firstLine="709"/>
+      </w:pPr>
+      <w:r>
+        <w:rPr>
+          <w:rFonts w:ascii="TH Sarabun New" w:cs="TH Sarabun New" w:eastAsia="TH Sarabun New" w:hAnsi="TH Sarabun New"/>
+          <w:sz w:val="32"/>
+          <w:szCs w:val="32"/>
+          <w:lang w:val="en-US" w:bidi="th-TH"/>
+        </w:rPr>
+        <w:t xml:space="preserve">ภาพ​ที่ 7.5 แสดง​รูป​คลื่น​จริง​จาก logic analyzer ที่​ขา​ของ ESP32 ช่วง​สั้นๆ ของ​แต่ละ​สัญญาณ พัดลม​ที่ 60% มี​ช่วง​สูง 12 ms จาก​คาบ 20 ms และ​ที่ 80% มี​ช่วง​สูง 16 ms ไฟ​ขาว​เย็น​มี​คาบ 0.2 ms (5 kHz) ส่วน buzzer มี​คาบ 0.25 ms (4 kHz)</w:t>
+      </w:r>
+    </w:p>
+    <w:p>
+      <w:pPr>
+        <w:keepNext/>
+        <w:spacing w:after="0" w:before="120"/>
+        <w:jc w:val="center"/>
+      </w:pPr>
+      <w:r>
+        <w:drawing>
+          <wp:inline distT="0" distB="0" distL="0" distR="0">
+            <wp:extent cx="5715000" cy="4429125"/>
+            <wp:effectExtent t="0" r="0" b="0" l="0"/>
+            <wp:docPr id="1" name="figure" descr="figure" title="figure"/>
+            <wp:cNvGraphicFramePr>
+              <a:graphicFrameLocks xmlns:a="http://schemas.openxmlformats.org/drawingml/2006/main" noChangeAspect="1"/>
+            </wp:cNvGraphicFramePr>
+            <a:graphic xmlns:a="http://schemas.openxmlformats.org/drawingml/2006/main">
+              <a:graphicData uri="http://schemas.openxmlformats.org/drawingml/2006/picture">
+                <pic:pic xmlns:pic="http://schemas.openxmlformats.org/drawingml/2006/picture">
+                  <pic:nvPicPr>
+                    <pic:cNvPr id="0" name="" descr=""/>
+                    <pic:cNvPicPr>
+                      <a:picLocks noChangeAspect="1" noChangeArrowheads="1"/>
+                    </pic:cNvPicPr>
+                  </pic:nvPicPr>
+                  <pic:blipFill>
+                    <a:blip r:embed="rId20" cstate="none"/>
+                    <a:srcRect/>
+                    <a:stretch>
+                      <a:fillRect/>
+                    </a:stretch>
+                  </pic:blipFill>
+                  <pic:spPr bwMode="auto">
+                    <a:xfrm>
+                      <a:off x="0" y="0"/>
+                      <a:ext cx="5715000" cy="4429125"/>
+                    </a:xfrm>
+                    <a:prstGeom prst="rect">
+                      <a:avLst/>
+                    </a:prstGeom>
+                  </pic:spPr>
+                </pic:pic>
+              </a:graphicData>
+            </a:graphic>
+          </wp:inline>
+        </w:drawing>
+      </w:r>
+    </w:p>
+    <w:p>
+      <w:pPr>
+        <w:keepNext w:val="false"/>
+        <w:spacing w:after="120" w:before="60"/>
+        <w:jc w:val="center"/>
+      </w:pPr>
+      <w:r>
+        <w:rPr>
+          <w:rFonts w:ascii="TH Sarabun New" w:cs="TH Sarabun New" w:eastAsia="TH Sarabun New" w:hAnsi="TH Sarabun New"/>
+          <w:b/>
+          <w:bCs/>
+          <w:sz w:val="32"/>
+          <w:szCs w:val="32"/>
+          <w:lang w:val="en-US" w:bidi="th-TH"/>
+        </w:rPr>
+        <w:t xml:space="preserve">ภาพที่ 7.5 รูป​คลื่น PWM ที่วัด​จาก logic analyzer ของ​พัดลม ไฟ LED และ buzzer</w:t>
       </w:r>
     </w:p>
     <w:p>
@@ -40175,7 +40959,7 @@
           <w:szCs w:val="32"/>
           <w:lang w:val="en-US" w:bidi="th-TH"/>
         </w:rPr>
-        <w:t xml:space="preserve">2) กรณี​ที่​ยัง​ไม่​มีผล​จาก​การ​ทดสอบ ได้แก่ TC-C-07 (แสดง​ความชื้น) และ TC-D-05 (สี​แสง​ก่อน​รู้​เวลา) ส่วน TC-A-08 ยืนยัน​ได้​เฉพาะ​พฤติกรรม เพราะ Wokwi วัด​กระแสไฟ​ไม่​ได้</w:t>
+        <w:t xml:space="preserve">2) TC-C-07, TC-D-05 และ TC-B-08 ยืนยัน​จาก log ของ​การ​ทดสอบ​ชุด​เดิม TC-B-07 ยืนยัน​ผ่าน​แถว TC-A-01 ที่​จอ​โต๊ะ​ขึ้น​เตือน CO₂ สูง​และ​เตือน​เซนเซอร์​ห้อง​เสีย ส่วน TC-A-08 ยืนยัน​ได้​เฉพาะ​พฤติกรรม เพราะ Wokwi วัด​กระแสไฟ​ไม่​ได้</w:t>
       </w:r>
     </w:p>
     <w:p>
@@ -43114,21 +43898,6 @@
           <w:lang w:val="en-US" w:bidi="th-TH"/>
         </w:rPr>
         <w:t xml:space="preserve">2) ยัง​ไม่​ได้​วัด​กระแสไฟ​จริง ตาราง​ไฟ​ใน​หัวข้อ 4.3 ใช้​ค่า​จาก datasheet และ​ค่า​ประมาณ (จอ OLED, buzzer, แถบ LED, พัดลม) จึง​ยัง​ยืนยัน​การ​ประหยัด​พลังงาน​ด้วย​ตัวเลข​วัด​จริง​ไม่​ได้ (TC-A-08)</w:t>
-      </w:r>
-    </w:p>
-    <w:p>
-      <w:pPr>
-        <w:spacing w:after="0" w:before="0"/>
-        <w:ind w:left="709"/>
-      </w:pPr>
-      <w:r>
-        <w:rPr>
-          <w:rFonts w:ascii="TH Sarabun New" w:cs="TH Sarabun New" w:eastAsia="TH Sarabun New" w:hAnsi="TH Sarabun New"/>
-          <w:sz w:val="32"/>
-          <w:szCs w:val="32"/>
-          <w:lang w:val="en-US" w:bidi="th-TH"/>
-        </w:rPr>
-        <w:t xml:space="preserve">3) กรณี​ทดสอบ TC-C-07 (แสดง​ความชื้น) และ TC-D-05 (สี​แสง​ก่อน​รู้​เวลา) ยัง​ไม่​มีผล​จาก​การ​ทดสอบ</w:t>
       </w:r>
     </w:p>
     <w:p>

</xml_diff>

<commit_message>
docs(D5): round 7 - final version, merge PR #35 changes, add TC-D-04 row
</commit_message>
<xml_diff>
--- a/10_final/D5_design_document.docx
+++ b/10_final/D5_design_document.docx
@@ -180,7 +180,7 @@
     </w:p>
     <w:p>
       <w:pPr>
-        <w:spacing w:after="1400" w:before="0"/>
+        <w:spacing w:after="0" w:before="0"/>
         <w:jc w:val="center"/>
       </w:pPr>
       <w:r>
@@ -201,14 +201,11 @@
       <w:r>
         <w:rPr>
           <w:rFonts w:ascii="TH Sarabun New" w:cs="TH Sarabun New" w:eastAsia="TH Sarabun New" w:hAnsi="TH Sarabun New"/>
-          <w:i/>
-          <w:iCs/>
-          <w:color w:val="808080"/>
-          <w:sz w:val="26"/>
-          <w:szCs w:val="26"/>
+          <w:sz w:val="32"/>
+          <w:szCs w:val="32"/>
           <w:lang w:val="en-US" w:bidi="th-TH"/>
         </w:rPr>
-        <w:t xml:space="preserve">ฉบับร่างสำหรับตรวจ (อัปเดต 15 ต.ค. 2569)</w:t>
+        <w:t xml:space="preserve">15 ตุลาคม 2569</w:t>
       </w:r>
     </w:p>
     <w:p>
@@ -38694,7 +38691,7 @@
                 <w:szCs w:val="28"/>
                 <w:lang w:val="en-US" w:bidi="th-TH"/>
               </w:rPr>
-              <w:t xml:space="preserve">TC-D-05</w:t>
+              <w:t xml:space="preserve">TC-D-04</w:t>
             </w:r>
           </w:p>
         </w:tc>
@@ -38726,7 +38723,7 @@
                 <w:szCs w:val="28"/>
                 <w:lang w:val="en-US" w:bidi="th-TH"/>
               </w:rPr>
-              <w:t xml:space="preserve">เปิด​เครื่อง​ก่อน​ได้เวลา​จาก NTP</w:t>
+              <w:t xml:space="preserve">ตั้งเป้า 800 lux และ​เปิด​โหมด​ดึก​จาก​เมนู แล้ว​ลุก​ไป</w:t>
             </w:r>
           </w:p>
         </w:tc>
@@ -38758,7 +38755,7 @@
                 <w:szCs w:val="28"/>
                 <w:lang w:val="en-US" w:bidi="th-TH"/>
               </w:rPr>
-              <w:t xml:space="preserve">ระหว่าง​ยัง​ไม่​รู้​เวลา r คงที่ 0.50 และ​วง​คุม​แสง​ยัง​ทำงาน หลัง​ได้เวลา r ค่อยๆ เปลี่ยน​ตาม​ตาราง ไม่​กระโดด</w:t>
+              <w:t xml:space="preserve">วง​คุม​แสง​เข้าเป้า​ที่ 776 lux (อยู่​ใน​ช่วง 800 ± 25) โหมด​ดึก​เปลี่ยนสี​แสง​เป็น​ขาว​เย็น (r = 0.80) และ​หลัง​ไม่​มี​คน​ครบ 5 นาที​ค่า​กลับเป็น 500 lux และ​ปิด​โหมด​ดึก</w:t>
             </w:r>
           </w:p>
         </w:tc>
@@ -38827,7 +38824,7 @@
                 <w:szCs w:val="28"/>
                 <w:lang w:val="en-US" w:bidi="th-TH"/>
               </w:rPr>
-              <w:t xml:space="preserve">TC-D-06</w:t>
+              <w:t xml:space="preserve">TC-D-05</w:t>
             </w:r>
           </w:p>
         </w:tc>
@@ -38859,7 +38856,7 @@
                 <w:szCs w:val="28"/>
                 <w:lang w:val="en-US" w:bidi="th-TH"/>
               </w:rPr>
-              <w:t xml:space="preserve">จำลอง​เซนเซอร์​แสง​เสีย</w:t>
+              <w:t xml:space="preserve">เปิด​เครื่อง​ก่อน​ได้เวลา​จาก NTP</w:t>
             </w:r>
           </w:p>
         </w:tc>
@@ -38891,7 +38888,7 @@
                 <w:szCs w:val="28"/>
                 <w:lang w:val="en-US" w:bidi="th-TH"/>
               </w:rPr>
-              <w:t xml:space="preserve">ครบ 3 รอบ (0.49 วินาที) เข้า SENSOR_FAULT ไฟ 60% จอ​ขึ้น​เตือน กลับ​ปกติ​หลัง​อ่าน​ได้ 2 รอบ</w:t>
+              <w:t xml:space="preserve">ระหว่าง​ยัง​ไม่​รู้​เวลา r คงที่ 0.50 และ​วง​คุม​แสง​ยัง​ทำงาน หลัง​ได้เวลา r ค่อยๆ เปลี่ยน​ตาม​ตาราง ไม่​กระโดด</w:t>
             </w:r>
           </w:p>
         </w:tc>
@@ -38960,6 +38957,139 @@
                 <w:szCs w:val="28"/>
                 <w:lang w:val="en-US" w:bidi="th-TH"/>
               </w:rPr>
+              <w:t xml:space="preserve">TC-D-06</w:t>
+            </w:r>
+          </w:p>
+        </w:tc>
+        <w:tc>
+          <w:tcPr>
+            <w:tcW w:type="dxa" w:w="2500"/>
+            <w:tcBorders>
+              <w:top w:val="single" w:color="000000" w:sz="4"/>
+              <w:left w:val="single" w:color="000000" w:sz="4"/>
+              <w:bottom w:val="single" w:color="000000" w:sz="4"/>
+              <w:right w:val="single" w:color="000000" w:sz="4"/>
+            </w:tcBorders>
+            <w:tcMar>
+              <w:top w:type="dxa" w:w="40"/>
+              <w:left w:type="dxa" w:w="90"/>
+              <w:bottom w:type="dxa" w:w="40"/>
+              <w:right w:type="dxa" w:w="90"/>
+            </w:tcMar>
+          </w:tcPr>
+          <w:p>
+            <w:pPr>
+              <w:spacing w:after="0" w:before="0"/>
+            </w:pPr>
+            <w:r>
+              <w:rPr>
+                <w:rFonts w:ascii="TH Sarabun New" w:cs="TH Sarabun New" w:eastAsia="TH Sarabun New" w:hAnsi="TH Sarabun New"/>
+                <w:b w:val="false"/>
+                <w:sz w:val="28"/>
+                <w:szCs w:val="28"/>
+                <w:lang w:val="en-US" w:bidi="th-TH"/>
+              </w:rPr>
+              <w:t xml:space="preserve">จำลอง​เซนเซอร์​แสง​เสีย</w:t>
+            </w:r>
+          </w:p>
+        </w:tc>
+        <w:tc>
+          <w:tcPr>
+            <w:tcW w:type="dxa" w:w="4050"/>
+            <w:tcBorders>
+              <w:top w:val="single" w:color="000000" w:sz="4"/>
+              <w:left w:val="single" w:color="000000" w:sz="4"/>
+              <w:bottom w:val="single" w:color="000000" w:sz="4"/>
+              <w:right w:val="single" w:color="000000" w:sz="4"/>
+            </w:tcBorders>
+            <w:tcMar>
+              <w:top w:type="dxa" w:w="40"/>
+              <w:left w:type="dxa" w:w="90"/>
+              <w:bottom w:type="dxa" w:w="40"/>
+              <w:right w:type="dxa" w:w="90"/>
+            </w:tcMar>
+          </w:tcPr>
+          <w:p>
+            <w:pPr>
+              <w:spacing w:after="0" w:before="0"/>
+            </w:pPr>
+            <w:r>
+              <w:rPr>
+                <w:rFonts w:ascii="TH Sarabun New" w:cs="TH Sarabun New" w:eastAsia="TH Sarabun New" w:hAnsi="TH Sarabun New"/>
+                <w:b w:val="false"/>
+                <w:sz w:val="28"/>
+                <w:szCs w:val="28"/>
+                <w:lang w:val="en-US" w:bidi="th-TH"/>
+              </w:rPr>
+              <w:t xml:space="preserve">ครบ 3 รอบ (0.49 วินาที) เข้า SENSOR_FAULT ไฟ 60% จอ​ขึ้น​เตือน กลับ​ปกติ​หลัง​อ่าน​ได้ 2 รอบ</w:t>
+            </w:r>
+          </w:p>
+        </w:tc>
+        <w:tc>
+          <w:tcPr>
+            <w:tcW w:type="dxa" w:w="1026"/>
+            <w:tcBorders>
+              <w:top w:val="single" w:color="000000" w:sz="4"/>
+              <w:left w:val="single" w:color="000000" w:sz="4"/>
+              <w:bottom w:val="single" w:color="000000" w:sz="4"/>
+              <w:right w:val="single" w:color="000000" w:sz="4"/>
+            </w:tcBorders>
+            <w:tcMar>
+              <w:top w:type="dxa" w:w="40"/>
+              <w:left w:type="dxa" w:w="90"/>
+              <w:bottom w:type="dxa" w:w="40"/>
+              <w:right w:type="dxa" w:w="90"/>
+            </w:tcMar>
+          </w:tcPr>
+          <w:p>
+            <w:pPr>
+              <w:spacing w:after="0" w:before="0"/>
+            </w:pPr>
+            <w:r>
+              <w:rPr>
+                <w:rFonts w:ascii="TH Sarabun New" w:cs="TH Sarabun New" w:eastAsia="TH Sarabun New" w:hAnsi="TH Sarabun New"/>
+                <w:b w:val="false"/>
+                <w:sz w:val="28"/>
+                <w:szCs w:val="28"/>
+                <w:lang w:val="en-US" w:bidi="th-TH"/>
+              </w:rPr>
+              <w:t xml:space="preserve">ผ่าน</w:t>
+            </w:r>
+          </w:p>
+        </w:tc>
+      </w:tr>
+      <w:tr>
+        <w:trPr>
+          <w:cantSplit/>
+        </w:trPr>
+        <w:tc>
+          <w:tcPr>
+            <w:tcW w:type="dxa" w:w="1450"/>
+            <w:tcBorders>
+              <w:top w:val="single" w:color="000000" w:sz="4"/>
+              <w:left w:val="single" w:color="000000" w:sz="4"/>
+              <w:bottom w:val="single" w:color="000000" w:sz="4"/>
+              <w:right w:val="single" w:color="000000" w:sz="4"/>
+            </w:tcBorders>
+            <w:tcMar>
+              <w:top w:type="dxa" w:w="40"/>
+              <w:left w:type="dxa" w:w="90"/>
+              <w:bottom w:type="dxa" w:w="40"/>
+              <w:right w:type="dxa" w:w="90"/>
+            </w:tcMar>
+          </w:tcPr>
+          <w:p>
+            <w:pPr>
+              <w:spacing w:after="0" w:before="0"/>
+            </w:pPr>
+            <w:r>
+              <w:rPr>
+                <w:rFonts w:ascii="TH Sarabun New" w:cs="TH Sarabun New" w:eastAsia="TH Sarabun New" w:hAnsi="TH Sarabun New"/>
+                <w:b w:val="false"/>
+                <w:sz w:val="28"/>
+                <w:szCs w:val="28"/>
+                <w:lang w:val="en-US" w:bidi="th-TH"/>
+              </w:rPr>
               <w:t xml:space="preserve">TC-B-03</w:t>
             </w:r>
           </w:p>
@@ -39025,6 +39155,139 @@
                 <w:lang w:val="en-US" w:bidi="th-TH"/>
               </w:rPr>
               <w:t xml:space="preserve">0.53 วินาที​เข้า SENSOR_FAULT ระดับ​เตือน 2 แล้ว​กลับ WORKING</w:t>
+            </w:r>
+          </w:p>
+        </w:tc>
+        <w:tc>
+          <w:tcPr>
+            <w:tcW w:type="dxa" w:w="1026"/>
+            <w:tcBorders>
+              <w:top w:val="single" w:color="000000" w:sz="4"/>
+              <w:left w:val="single" w:color="000000" w:sz="4"/>
+              <w:bottom w:val="single" w:color="000000" w:sz="4"/>
+              <w:right w:val="single" w:color="000000" w:sz="4"/>
+            </w:tcBorders>
+            <w:tcMar>
+              <w:top w:type="dxa" w:w="40"/>
+              <w:left w:type="dxa" w:w="90"/>
+              <w:bottom w:type="dxa" w:w="40"/>
+              <w:right w:type="dxa" w:w="90"/>
+            </w:tcMar>
+          </w:tcPr>
+          <w:p>
+            <w:pPr>
+              <w:spacing w:after="0" w:before="0"/>
+            </w:pPr>
+            <w:r>
+              <w:rPr>
+                <w:rFonts w:ascii="TH Sarabun New" w:cs="TH Sarabun New" w:eastAsia="TH Sarabun New" w:hAnsi="TH Sarabun New"/>
+                <w:b w:val="false"/>
+                <w:sz w:val="28"/>
+                <w:szCs w:val="28"/>
+                <w:lang w:val="en-US" w:bidi="th-TH"/>
+              </w:rPr>
+              <w:t xml:space="preserve">ผ่าน</w:t>
+            </w:r>
+          </w:p>
+        </w:tc>
+      </w:tr>
+      <w:tr>
+        <w:trPr>
+          <w:cantSplit/>
+        </w:trPr>
+        <w:tc>
+          <w:tcPr>
+            <w:tcW w:type="dxa" w:w="1450"/>
+            <w:tcBorders>
+              <w:top w:val="single" w:color="000000" w:sz="4"/>
+              <w:left w:val="single" w:color="000000" w:sz="4"/>
+              <w:bottom w:val="single" w:color="000000" w:sz="4"/>
+              <w:right w:val="single" w:color="000000" w:sz="4"/>
+            </w:tcBorders>
+            <w:tcMar>
+              <w:top w:type="dxa" w:w="40"/>
+              <w:left w:type="dxa" w:w="90"/>
+              <w:bottom w:type="dxa" w:w="40"/>
+              <w:right w:type="dxa" w:w="90"/>
+            </w:tcMar>
+          </w:tcPr>
+          <w:p>
+            <w:pPr>
+              <w:spacing w:after="0" w:before="0"/>
+            </w:pPr>
+            <w:r>
+              <w:rPr>
+                <w:rFonts w:ascii="TH Sarabun New" w:cs="TH Sarabun New" w:eastAsia="TH Sarabun New" w:hAnsi="TH Sarabun New"/>
+                <w:b w:val="false"/>
+                <w:sz w:val="28"/>
+                <w:szCs w:val="28"/>
+                <w:lang w:val="en-US" w:bidi="th-TH"/>
+              </w:rPr>
+              <w:t xml:space="preserve">TC-B-07</w:t>
+            </w:r>
+          </w:p>
+        </w:tc>
+        <w:tc>
+          <w:tcPr>
+            <w:tcW w:type="dxa" w:w="2500"/>
+            <w:tcBorders>
+              <w:top w:val="single" w:color="000000" w:sz="4"/>
+              <w:left w:val="single" w:color="000000" w:sz="4"/>
+              <w:bottom w:val="single" w:color="000000" w:sz="4"/>
+              <w:right w:val="single" w:color="000000" w:sz="4"/>
+            </w:tcBorders>
+            <w:tcMar>
+              <w:top w:type="dxa" w:w="40"/>
+              <w:left w:type="dxa" w:w="90"/>
+              <w:bottom w:type="dxa" w:w="40"/>
+              <w:right w:type="dxa" w:w="90"/>
+            </w:tcMar>
+          </w:tcPr>
+          <w:p>
+            <w:pPr>
+              <w:spacing w:after="0" w:before="0"/>
+            </w:pPr>
+            <w:r>
+              <w:rPr>
+                <w:rFonts w:ascii="TH Sarabun New" w:cs="TH Sarabun New" w:eastAsia="TH Sarabun New" w:hAnsi="TH Sarabun New"/>
+                <w:b w:val="false"/>
+                <w:sz w:val="28"/>
+                <w:szCs w:val="28"/>
+                <w:lang w:val="en-US" w:bidi="th-TH"/>
+              </w:rPr>
+              <w:t xml:space="preserve">ห้อง​มี CO₂ สูง และ​เซนเซอร์​ห้อง​เสีย</w:t>
+            </w:r>
+          </w:p>
+        </w:tc>
+        <w:tc>
+          <w:tcPr>
+            <w:tcW w:type="dxa" w:w="4050"/>
+            <w:tcBorders>
+              <w:top w:val="single" w:color="000000" w:sz="4"/>
+              <w:left w:val="single" w:color="000000" w:sz="4"/>
+              <w:bottom w:val="single" w:color="000000" w:sz="4"/>
+              <w:right w:val="single" w:color="000000" w:sz="4"/>
+            </w:tcBorders>
+            <w:tcMar>
+              <w:top w:type="dxa" w:w="40"/>
+              <w:left w:type="dxa" w:w="90"/>
+              <w:bottom w:type="dxa" w:w="40"/>
+              <w:right w:type="dxa" w:w="90"/>
+            </w:tcMar>
+          </w:tcPr>
+          <w:p>
+            <w:pPr>
+              <w:spacing w:after="0" w:before="0"/>
+            </w:pPr>
+            <w:r>
+              <w:rPr>
+                <w:rFonts w:ascii="TH Sarabun New" w:cs="TH Sarabun New" w:eastAsia="TH Sarabun New" w:hAnsi="TH Sarabun New"/>
+                <w:b w:val="false"/>
+                <w:sz w:val="28"/>
+                <w:szCs w:val="28"/>
+                <w:lang w:val="en-US" w:bidi="th-TH"/>
+              </w:rPr>
+              <w:t xml:space="preserve">จอ​โต๊ะ​เตือน CO₂ สูง (ระดับ 1) ภายใน 0.9 วินาที และ​เตือน​เซนเซอร์​ห้อง​เสีย (ระดับ 2) ภายใน 0.5 วินาที</w:t>
             </w:r>
           </w:p>
         </w:tc>
@@ -40959,7 +41222,7 @@
           <w:szCs w:val="32"/>
           <w:lang w:val="en-US" w:bidi="th-TH"/>
         </w:rPr>
-        <w:t xml:space="preserve">2) TC-C-07, TC-D-05 และ TC-B-08 ยืนยัน​จาก log ของ​การ​ทดสอบ​ชุด​เดิม TC-B-07 ยืนยัน​ผ่าน​แถว TC-A-01 ที่​จอ​โต๊ะ​ขึ้น​เตือน CO₂ สูง​และ​เตือน​เซนเซอร์​ห้อง​เสีย ส่วน TC-A-08 ยืนยัน​ได้​เฉพาะ​พฤติกรรม เพราะ Wokwi วัด​กระแสไฟ​ไม่​ได้</w:t>
+        <w:t xml:space="preserve">2) TC-C-07, TC-D-05 และ TC-B-08 ยืนยัน​จาก log ของ​การ​ทดสอบ​ชุด​เดิม ส่วน TC-A-08 ยืนยัน​ได้​เฉพาะ​พฤติกรรม เพราะ Wokwi วัด​กระแสไฟ​ไม่​ได้</w:t>
       </w:r>
     </w:p>
     <w:p>
@@ -41004,7 +41267,7 @@
           <w:szCs w:val="32"/>
           <w:lang w:val="en-US" w:bidi="th-TH"/>
         </w:rPr>
-        <w:t xml:space="preserve">5) ข้อสังเกต​ที่​ส่ง​ให้​เจ้าของ​โมดูล​พิจารณา​ได้​ข้อสรุป​แล้ว ได้แก่ การ​เริ่ม​นับ​เวลา​นั่ง​ใหม่​หลัง​เรดาร์​กลับ​มาจาก​สถานะ​เสีย​เป็น​พฤติกรรม​ที่​ตั้งใจ และ​เพิ่ม stack ของ​งาน​รับ​ปุ่ม​เป็น 3,072 ไบต์ ซึ่ง​ใน​การ​รัน​ต่อเนื่อง​เหลือ​อย่าง​น้อย 2,196 ไบต์ ส่วน​การ​อ่าน DHT22 ครั้งแรก​หลัง​เปิด​เครื่อง​ได้​ค่า​ว่าง 1 ครั้ง​ยัง​คงอยู่ และ​มีผล​เฉพาะ​ใน​การจำลอง</w:t>
+        <w:t xml:space="preserve">5) ข้อสังเกต​ที่​ส่ง​ให้​เจ้าของ​โมดูล​พิจารณา​ได้​ข้อสรุป​แล้ว ได้แก่ การ​เริ่ม​นับ​เวลา​นั่ง​ใหม่​หลัง​เรดาร์​กลับ​มาจาก​สถานะ​เสีย​เป็น​พฤติกรรม​ที่​ตั้งใจ และ​เพิ่ม stack ของ​งาน​รับ​ปุ่ม​เป็น 3,072 ไบต์ ซึ่ง​ใน​การ​รัน​ต่อเนื่อง​เหลือ​อย่าง​น้อย 2,196 ไบต์ และ​การ​อ่าน DHT22 ครั้งแรก​หลัง​เปิด​เครื่อง​ได้​ค่า​ว่าง 1 ครั้ง ทำให้​ถ้า​เซนเซอร์​เสีย​ตั้งแต่​เปิด​เครื่อง​ระบบ​จะ​เข้า​โหมด​ปลอดภัย​เร็ว​ขึ้น 1 รอบ ซึ่ง​เป็น​ทาง​ที่​ปลอดภัย​จึง​คงไว้ และ​มีผล​เฉพาะ​ใน​การจำลอง</w:t>
       </w:r>
     </w:p>
     <w:p>

</xml_diff>